<commit_message>
feats/data validation & beatiful desgin with taiwind and headless UI and the doc generation & download & preview
</commit_message>
<xml_diff>
--- a/templates/model_1.docx
+++ b/templates/model_1.docx
@@ -19,14 +19,14 @@
       <w:pPr>
         <w:spacing w:after="280" w:line="240" w:lineRule="auto"/>
         <w:rPr>
-          <w:rFonts w:ascii="Times New Roman" w:eastAsia="Times New Roman" w:hAnsi="Times New Roman" w:cs="Times New Roman"/>
-          <w:sz w:val="24"/>
-          <w:szCs w:val="24"/>
-        </w:rPr>
-      </w:pPr>
-      <w:r>
-        <w:rPr>
-          <w:rFonts w:ascii="Times New Roman" w:eastAsia="Times New Roman" w:hAnsi="Times New Roman" w:cs="Times New Roman"/>
+          <w:rFonts w:ascii="Times New Roman" w:hAnsi="Times New Roman" w:eastAsia="Times New Roman" w:cs="Times New Roman"/>
+          <w:sz w:val="24"/>
+          <w:szCs w:val="24"/>
+        </w:rPr>
+      </w:pPr>
+      <w:r>
+        <w:rPr>
+          <w:rFonts w:ascii="Times New Roman" w:hAnsi="Times New Roman" w:eastAsia="Times New Roman" w:cs="Times New Roman"/>
           <w:b/>
           <w:sz w:val="24"/>
           <w:szCs w:val="24"/>
@@ -35,7 +35,7 @@
       </w:r>
       <w:r>
         <w:rPr>
-          <w:rFonts w:ascii="Times New Roman" w:eastAsia="Times New Roman" w:hAnsi="Times New Roman" w:cs="Times New Roman"/>
+          <w:rFonts w:ascii="Times New Roman" w:hAnsi="Times New Roman" w:eastAsia="Times New Roman" w:cs="Times New Roman"/>
           <w:sz w:val="24"/>
           <w:szCs w:val="24"/>
         </w:rPr>
@@ -43,7 +43,7 @@
       </w:r>
       <w:r>
         <w:rPr>
-          <w:rFonts w:ascii="Times New Roman" w:eastAsia="Times New Roman" w:hAnsi="Times New Roman" w:cs="Times New Roman"/>
+          <w:rFonts w:ascii="Times New Roman" w:hAnsi="Times New Roman" w:eastAsia="Times New Roman" w:cs="Times New Roman"/>
           <w:sz w:val="24"/>
           <w:szCs w:val="24"/>
         </w:rPr>
@@ -51,7 +51,7 @@
       </w:r>
       <w:r>
         <w:rPr>
-          <w:rFonts w:ascii="Times New Roman" w:eastAsia="Times New Roman" w:hAnsi="Times New Roman" w:cs="Times New Roman"/>
+          <w:rFonts w:ascii="Times New Roman" w:hAnsi="Times New Roman" w:eastAsia="Times New Roman" w:cs="Times New Roman"/>
           <w:b/>
           <w:bCs/>
           <w:sz w:val="24"/>
@@ -62,7 +62,7 @@
       <w:proofErr w:type="spellStart"/>
       <w:r>
         <w:rPr>
-          <w:rFonts w:ascii="Times New Roman" w:eastAsia="Times New Roman" w:hAnsi="Times New Roman" w:cs="Times New Roman"/>
+          <w:rFonts w:ascii="Times New Roman" w:hAnsi="Times New Roman" w:eastAsia="Times New Roman" w:cs="Times New Roman"/>
           <w:b/>
           <w:bCs/>
           <w:sz w:val="24"/>
@@ -73,7 +73,7 @@
       <w:proofErr w:type="spellEnd"/>
       <w:r>
         <w:rPr>
-          <w:rFonts w:ascii="Times New Roman" w:eastAsia="Times New Roman" w:hAnsi="Times New Roman" w:cs="Times New Roman"/>
+          <w:rFonts w:ascii="Times New Roman" w:hAnsi="Times New Roman" w:eastAsia="Times New Roman" w:cs="Times New Roman"/>
           <w:b/>
           <w:bCs/>
           <w:sz w:val="24"/>
@@ -83,7 +83,7 @@
       </w:r>
       <w:r>
         <w:rPr>
-          <w:rFonts w:ascii="Times New Roman" w:eastAsia="Times New Roman" w:hAnsi="Times New Roman" w:cs="Times New Roman"/>
+          <w:rFonts w:ascii="Times New Roman" w:hAnsi="Times New Roman" w:eastAsia="Times New Roman" w:cs="Times New Roman"/>
           <w:sz w:val="24"/>
           <w:szCs w:val="24"/>
         </w:rPr>
@@ -94,14 +94,14 @@
       <w:pPr>
         <w:spacing w:before="280" w:after="280" w:line="240" w:lineRule="auto"/>
         <w:rPr>
-          <w:rFonts w:ascii="Times New Roman" w:eastAsia="Times New Roman" w:hAnsi="Times New Roman" w:cs="Times New Roman"/>
-          <w:sz w:val="24"/>
-          <w:szCs w:val="24"/>
-        </w:rPr>
-      </w:pPr>
-      <w:r>
-        <w:rPr>
-          <w:rFonts w:ascii="Times New Roman" w:eastAsia="Times New Roman" w:hAnsi="Times New Roman" w:cs="Times New Roman"/>
+          <w:rFonts w:ascii="Times New Roman" w:hAnsi="Times New Roman" w:eastAsia="Times New Roman" w:cs="Times New Roman"/>
+          <w:sz w:val="24"/>
+          <w:szCs w:val="24"/>
+        </w:rPr>
+      </w:pPr>
+      <w:r>
+        <w:rPr>
+          <w:rFonts w:ascii="Times New Roman" w:hAnsi="Times New Roman" w:eastAsia="Times New Roman" w:cs="Times New Roman"/>
           <w:b/>
           <w:sz w:val="24"/>
           <w:szCs w:val="24"/>
@@ -110,7 +110,7 @@
       </w:r>
       <w:r>
         <w:rPr>
-          <w:rFonts w:ascii="Times New Roman" w:eastAsia="Times New Roman" w:hAnsi="Times New Roman" w:cs="Times New Roman"/>
+          <w:rFonts w:ascii="Times New Roman" w:hAnsi="Times New Roman" w:eastAsia="Times New Roman" w:cs="Times New Roman"/>
           <w:sz w:val="24"/>
           <w:szCs w:val="24"/>
         </w:rPr>
@@ -121,7 +121,7 @@
       <w:pPr>
         <w:spacing w:before="280" w:after="280" w:line="240" w:lineRule="auto"/>
         <w:rPr>
-          <w:rFonts w:ascii="Times New Roman" w:eastAsia="Times New Roman" w:hAnsi="Times New Roman" w:cs="Times New Roman"/>
+          <w:rFonts w:ascii="Times New Roman" w:hAnsi="Times New Roman" w:eastAsia="Times New Roman" w:cs="Times New Roman"/>
           <w:b/>
           <w:sz w:val="27"/>
           <w:szCs w:val="27"/>
@@ -129,7 +129,7 @@
       </w:pPr>
       <w:r>
         <w:rPr>
-          <w:rFonts w:ascii="Times New Roman" w:eastAsia="Times New Roman" w:hAnsi="Times New Roman" w:cs="Times New Roman"/>
+          <w:rFonts w:ascii="Times New Roman" w:hAnsi="Times New Roman" w:eastAsia="Times New Roman" w:cs="Times New Roman"/>
           <w:b/>
           <w:sz w:val="27"/>
           <w:szCs w:val="27"/>
@@ -141,14 +141,14 @@
       <w:pPr>
         <w:spacing w:before="280" w:after="280" w:line="240" w:lineRule="auto"/>
         <w:rPr>
-          <w:rFonts w:ascii="Times New Roman" w:eastAsia="Times New Roman" w:hAnsi="Times New Roman" w:cs="Times New Roman"/>
-          <w:sz w:val="24"/>
-          <w:szCs w:val="24"/>
-        </w:rPr>
-      </w:pPr>
-      <w:r>
-        <w:rPr>
-          <w:rFonts w:ascii="Times New Roman" w:eastAsia="Times New Roman" w:hAnsi="Times New Roman" w:cs="Times New Roman"/>
+          <w:rFonts w:ascii="Times New Roman" w:hAnsi="Times New Roman" w:eastAsia="Times New Roman" w:cs="Times New Roman"/>
+          <w:sz w:val="24"/>
+          <w:szCs w:val="24"/>
+        </w:rPr>
+      </w:pPr>
+      <w:r>
+        <w:rPr>
+          <w:rFonts w:ascii="Times New Roman" w:hAnsi="Times New Roman" w:eastAsia="Times New Roman" w:cs="Times New Roman"/>
           <w:b/>
           <w:sz w:val="24"/>
           <w:szCs w:val="24"/>
@@ -157,7 +157,7 @@
       </w:r>
       <w:r>
         <w:rPr>
-          <w:rFonts w:ascii="Times New Roman" w:eastAsia="Times New Roman" w:hAnsi="Times New Roman" w:cs="Times New Roman"/>
+          <w:rFonts w:ascii="Times New Roman" w:hAnsi="Times New Roman" w:eastAsia="Times New Roman" w:cs="Times New Roman"/>
           <w:sz w:val="24"/>
           <w:szCs w:val="24"/>
         </w:rPr>
@@ -172,14 +172,14 @@
         </w:numPr>
         <w:spacing w:before="280" w:after="0" w:line="240" w:lineRule="auto"/>
         <w:rPr>
-          <w:rFonts w:ascii="Times New Roman" w:eastAsia="Times New Roman" w:hAnsi="Times New Roman" w:cs="Times New Roman"/>
-          <w:sz w:val="24"/>
-          <w:szCs w:val="24"/>
-        </w:rPr>
-      </w:pPr>
-      <w:r>
-        <w:rPr>
-          <w:rFonts w:ascii="Times New Roman" w:eastAsia="Times New Roman" w:hAnsi="Times New Roman" w:cs="Times New Roman"/>
+          <w:rFonts w:ascii="Times New Roman" w:hAnsi="Times New Roman" w:eastAsia="Times New Roman" w:cs="Times New Roman"/>
+          <w:sz w:val="24"/>
+          <w:szCs w:val="24"/>
+        </w:rPr>
+      </w:pPr>
+      <w:r>
+        <w:rPr>
+          <w:rFonts w:ascii="Times New Roman" w:hAnsi="Times New Roman" w:eastAsia="Times New Roman" w:cs="Times New Roman"/>
           <w:b/>
           <w:sz w:val="24"/>
           <w:szCs w:val="24"/>
@@ -188,7 +188,7 @@
       </w:r>
       <w:r>
         <w:rPr>
-          <w:rFonts w:ascii="Times New Roman" w:eastAsia="Times New Roman" w:hAnsi="Times New Roman" w:cs="Times New Roman"/>
+          <w:rFonts w:ascii="Times New Roman" w:hAnsi="Times New Roman" w:eastAsia="Times New Roman" w:cs="Times New Roman"/>
           <w:sz w:val="24"/>
           <w:szCs w:val="24"/>
         </w:rPr>
@@ -203,14 +203,14 @@
         </w:numPr>
         <w:spacing w:after="280" w:line="240" w:lineRule="auto"/>
         <w:rPr>
-          <w:rFonts w:ascii="Times New Roman" w:eastAsia="Times New Roman" w:hAnsi="Times New Roman" w:cs="Times New Roman"/>
-          <w:sz w:val="24"/>
-          <w:szCs w:val="24"/>
-        </w:rPr>
-      </w:pPr>
-      <w:r>
-        <w:rPr>
-          <w:rFonts w:ascii="Times New Roman" w:eastAsia="Times New Roman" w:hAnsi="Times New Roman" w:cs="Times New Roman"/>
+          <w:rFonts w:ascii="Times New Roman" w:hAnsi="Times New Roman" w:eastAsia="Times New Roman" w:cs="Times New Roman"/>
+          <w:sz w:val="24"/>
+          <w:szCs w:val="24"/>
+        </w:rPr>
+      </w:pPr>
+      <w:r>
+        <w:rPr>
+          <w:rFonts w:ascii="Times New Roman" w:hAnsi="Times New Roman" w:eastAsia="Times New Roman" w:cs="Times New Roman"/>
           <w:b/>
           <w:sz w:val="24"/>
           <w:szCs w:val="24"/>
@@ -219,7 +219,7 @@
       </w:r>
       <w:r>
         <w:rPr>
-          <w:rFonts w:ascii="Times New Roman" w:eastAsia="Times New Roman" w:hAnsi="Times New Roman" w:cs="Times New Roman"/>
+          <w:rFonts w:ascii="Times New Roman" w:hAnsi="Times New Roman" w:eastAsia="Times New Roman" w:cs="Times New Roman"/>
           <w:sz w:val="24"/>
           <w:szCs w:val="24"/>
         </w:rPr>
@@ -230,14 +230,14 @@
       <w:pPr>
         <w:spacing w:before="280" w:after="280" w:line="240" w:lineRule="auto"/>
         <w:rPr>
-          <w:rFonts w:ascii="Times New Roman" w:eastAsia="Times New Roman" w:hAnsi="Times New Roman" w:cs="Times New Roman"/>
-          <w:sz w:val="24"/>
-          <w:szCs w:val="24"/>
-        </w:rPr>
-      </w:pPr>
-      <w:r>
-        <w:rPr>
-          <w:rFonts w:ascii="Times New Roman" w:eastAsia="Times New Roman" w:hAnsi="Times New Roman" w:cs="Times New Roman"/>
+          <w:rFonts w:ascii="Times New Roman" w:hAnsi="Times New Roman" w:eastAsia="Times New Roman" w:cs="Times New Roman"/>
+          <w:sz w:val="24"/>
+          <w:szCs w:val="24"/>
+        </w:rPr>
+      </w:pPr>
+      <w:r>
+        <w:rPr>
+          <w:rFonts w:ascii="Times New Roman" w:hAnsi="Times New Roman" w:eastAsia="Times New Roman" w:cs="Times New Roman"/>
           <w:b/>
           <w:sz w:val="24"/>
           <w:szCs w:val="24"/>
@@ -246,7 +246,7 @@
       </w:r>
       <w:r>
         <w:rPr>
-          <w:rFonts w:ascii="Times New Roman" w:eastAsia="Times New Roman" w:hAnsi="Times New Roman" w:cs="Times New Roman"/>
+          <w:rFonts w:ascii="Times New Roman" w:hAnsi="Times New Roman" w:eastAsia="Times New Roman" w:cs="Times New Roman"/>
           <w:sz w:val="24"/>
           <w:szCs w:val="24"/>
         </w:rPr>
@@ -261,14 +261,14 @@
         </w:numPr>
         <w:spacing w:before="280" w:after="0" w:line="240" w:lineRule="auto"/>
         <w:rPr>
-          <w:rFonts w:ascii="Times New Roman" w:eastAsia="Times New Roman" w:hAnsi="Times New Roman" w:cs="Times New Roman"/>
-          <w:sz w:val="24"/>
-          <w:szCs w:val="24"/>
-        </w:rPr>
-      </w:pPr>
-      <w:r>
-        <w:rPr>
-          <w:rFonts w:ascii="Times New Roman" w:eastAsia="Times New Roman" w:hAnsi="Times New Roman" w:cs="Times New Roman"/>
+          <w:rFonts w:ascii="Times New Roman" w:hAnsi="Times New Roman" w:eastAsia="Times New Roman" w:cs="Times New Roman"/>
+          <w:sz w:val="24"/>
+          <w:szCs w:val="24"/>
+        </w:rPr>
+      </w:pPr>
+      <w:r>
+        <w:rPr>
+          <w:rFonts w:ascii="Times New Roman" w:hAnsi="Times New Roman" w:eastAsia="Times New Roman" w:cs="Times New Roman"/>
           <w:b/>
           <w:sz w:val="24"/>
           <w:szCs w:val="24"/>
@@ -277,7 +277,7 @@
       </w:r>
       <w:r>
         <w:rPr>
-          <w:rFonts w:ascii="Times New Roman" w:eastAsia="Times New Roman" w:hAnsi="Times New Roman" w:cs="Times New Roman"/>
+          <w:rFonts w:ascii="Times New Roman" w:hAnsi="Times New Roman" w:eastAsia="Times New Roman" w:cs="Times New Roman"/>
           <w:sz w:val="24"/>
           <w:szCs w:val="24"/>
         </w:rPr>
@@ -292,14 +292,14 @@
         </w:numPr>
         <w:spacing w:after="0" w:line="240" w:lineRule="auto"/>
         <w:rPr>
-          <w:rFonts w:ascii="Times New Roman" w:eastAsia="Times New Roman" w:hAnsi="Times New Roman" w:cs="Times New Roman"/>
-          <w:sz w:val="24"/>
-          <w:szCs w:val="24"/>
-        </w:rPr>
-      </w:pPr>
-      <w:r>
-        <w:rPr>
-          <w:rFonts w:ascii="Times New Roman" w:eastAsia="Times New Roman" w:hAnsi="Times New Roman" w:cs="Times New Roman"/>
+          <w:rFonts w:ascii="Times New Roman" w:hAnsi="Times New Roman" w:eastAsia="Times New Roman" w:cs="Times New Roman"/>
+          <w:sz w:val="24"/>
+          <w:szCs w:val="24"/>
+        </w:rPr>
+      </w:pPr>
+      <w:r>
+        <w:rPr>
+          <w:rFonts w:ascii="Times New Roman" w:hAnsi="Times New Roman" w:eastAsia="Times New Roman" w:cs="Times New Roman"/>
           <w:b/>
           <w:sz w:val="24"/>
           <w:szCs w:val="24"/>
@@ -308,7 +308,7 @@
       </w:r>
       <w:r>
         <w:rPr>
-          <w:rFonts w:ascii="Times New Roman" w:eastAsia="Times New Roman" w:hAnsi="Times New Roman" w:cs="Times New Roman"/>
+          <w:rFonts w:ascii="Times New Roman" w:hAnsi="Times New Roman" w:eastAsia="Times New Roman" w:cs="Times New Roman"/>
           <w:sz w:val="24"/>
           <w:szCs w:val="24"/>
         </w:rPr>
@@ -323,14 +323,14 @@
         </w:numPr>
         <w:spacing w:after="280" w:line="240" w:lineRule="auto"/>
         <w:rPr>
-          <w:rFonts w:ascii="Times New Roman" w:eastAsia="Times New Roman" w:hAnsi="Times New Roman" w:cs="Times New Roman"/>
-          <w:sz w:val="24"/>
-          <w:szCs w:val="24"/>
-        </w:rPr>
-      </w:pPr>
-      <w:r>
-        <w:rPr>
-          <w:rFonts w:ascii="Times New Roman" w:eastAsia="Times New Roman" w:hAnsi="Times New Roman" w:cs="Times New Roman"/>
+          <w:rFonts w:ascii="Times New Roman" w:hAnsi="Times New Roman" w:eastAsia="Times New Roman" w:cs="Times New Roman"/>
+          <w:sz w:val="24"/>
+          <w:szCs w:val="24"/>
+        </w:rPr>
+      </w:pPr>
+      <w:r>
+        <w:rPr>
+          <w:rFonts w:ascii="Times New Roman" w:hAnsi="Times New Roman" w:eastAsia="Times New Roman" w:cs="Times New Roman"/>
           <w:b/>
           <w:sz w:val="24"/>
           <w:szCs w:val="24"/>
@@ -339,7 +339,7 @@
       </w:r>
       <w:r>
         <w:rPr>
-          <w:rFonts w:ascii="Times New Roman" w:eastAsia="Times New Roman" w:hAnsi="Times New Roman" w:cs="Times New Roman"/>
+          <w:rFonts w:ascii="Times New Roman" w:hAnsi="Times New Roman" w:eastAsia="Times New Roman" w:cs="Times New Roman"/>
           <w:sz w:val="24"/>
           <w:szCs w:val="24"/>
         </w:rPr>
@@ -350,14 +350,14 @@
       <w:pPr>
         <w:spacing w:before="280" w:after="280" w:line="240" w:lineRule="auto"/>
         <w:rPr>
-          <w:rFonts w:ascii="Times New Roman" w:eastAsia="Times New Roman" w:hAnsi="Times New Roman" w:cs="Times New Roman"/>
-          <w:sz w:val="24"/>
-          <w:szCs w:val="24"/>
-        </w:rPr>
-      </w:pPr>
-      <w:r>
-        <w:rPr>
-          <w:rFonts w:ascii="Times New Roman" w:eastAsia="Times New Roman" w:hAnsi="Times New Roman" w:cs="Times New Roman"/>
+          <w:rFonts w:ascii="Times New Roman" w:hAnsi="Times New Roman" w:eastAsia="Times New Roman" w:cs="Times New Roman"/>
+          <w:sz w:val="24"/>
+          <w:szCs w:val="24"/>
+        </w:rPr>
+      </w:pPr>
+      <w:r>
+        <w:rPr>
+          <w:rFonts w:ascii="Times New Roman" w:hAnsi="Times New Roman" w:eastAsia="Times New Roman" w:cs="Times New Roman"/>
           <w:b/>
           <w:sz w:val="24"/>
           <w:szCs w:val="24"/>
@@ -366,7 +366,7 @@
       </w:r>
       <w:r>
         <w:rPr>
-          <w:rFonts w:ascii="Times New Roman" w:eastAsia="Times New Roman" w:hAnsi="Times New Roman" w:cs="Times New Roman"/>
+          <w:rFonts w:ascii="Times New Roman" w:hAnsi="Times New Roman" w:eastAsia="Times New Roman" w:cs="Times New Roman"/>
           <w:sz w:val="24"/>
           <w:szCs w:val="24"/>
         </w:rPr>
@@ -381,14 +381,14 @@
         </w:numPr>
         <w:spacing w:before="280" w:after="0" w:line="240" w:lineRule="auto"/>
         <w:rPr>
-          <w:rFonts w:ascii="Times New Roman" w:eastAsia="Times New Roman" w:hAnsi="Times New Roman" w:cs="Times New Roman"/>
-          <w:sz w:val="24"/>
-          <w:szCs w:val="24"/>
-        </w:rPr>
-      </w:pPr>
-      <w:r>
-        <w:rPr>
-          <w:rFonts w:ascii="Times New Roman" w:eastAsia="Times New Roman" w:hAnsi="Times New Roman" w:cs="Times New Roman"/>
+          <w:rFonts w:ascii="Times New Roman" w:hAnsi="Times New Roman" w:eastAsia="Times New Roman" w:cs="Times New Roman"/>
+          <w:sz w:val="24"/>
+          <w:szCs w:val="24"/>
+        </w:rPr>
+      </w:pPr>
+      <w:r>
+        <w:rPr>
+          <w:rFonts w:ascii="Times New Roman" w:hAnsi="Times New Roman" w:eastAsia="Times New Roman" w:cs="Times New Roman"/>
           <w:b/>
           <w:sz w:val="24"/>
           <w:szCs w:val="24"/>
@@ -397,7 +397,7 @@
       </w:r>
       <w:r>
         <w:rPr>
-          <w:rFonts w:ascii="Times New Roman" w:eastAsia="Times New Roman" w:hAnsi="Times New Roman" w:cs="Times New Roman"/>
+          <w:rFonts w:ascii="Times New Roman" w:hAnsi="Times New Roman" w:eastAsia="Times New Roman" w:cs="Times New Roman"/>
           <w:sz w:val="24"/>
           <w:szCs w:val="24"/>
         </w:rPr>
@@ -412,14 +412,14 @@
         </w:numPr>
         <w:spacing w:after="0" w:line="240" w:lineRule="auto"/>
         <w:rPr>
-          <w:rFonts w:ascii="Times New Roman" w:eastAsia="Times New Roman" w:hAnsi="Times New Roman" w:cs="Times New Roman"/>
-          <w:sz w:val="24"/>
-          <w:szCs w:val="24"/>
-        </w:rPr>
-      </w:pPr>
-      <w:r>
-        <w:rPr>
-          <w:rFonts w:ascii="Times New Roman" w:eastAsia="Times New Roman" w:hAnsi="Times New Roman" w:cs="Times New Roman"/>
+          <w:rFonts w:ascii="Times New Roman" w:hAnsi="Times New Roman" w:eastAsia="Times New Roman" w:cs="Times New Roman"/>
+          <w:sz w:val="24"/>
+          <w:szCs w:val="24"/>
+        </w:rPr>
+      </w:pPr>
+      <w:r>
+        <w:rPr>
+          <w:rFonts w:ascii="Times New Roman" w:hAnsi="Times New Roman" w:eastAsia="Times New Roman" w:cs="Times New Roman"/>
           <w:b/>
           <w:sz w:val="24"/>
           <w:szCs w:val="24"/>
@@ -428,7 +428,7 @@
       </w:r>
       <w:r>
         <w:rPr>
-          <w:rFonts w:ascii="Times New Roman" w:eastAsia="Times New Roman" w:hAnsi="Times New Roman" w:cs="Times New Roman"/>
+          <w:rFonts w:ascii="Times New Roman" w:hAnsi="Times New Roman" w:eastAsia="Times New Roman" w:cs="Times New Roman"/>
           <w:sz w:val="24"/>
           <w:szCs w:val="24"/>
         </w:rPr>
@@ -443,14 +443,14 @@
         </w:numPr>
         <w:spacing w:after="280" w:line="240" w:lineRule="auto"/>
         <w:rPr>
-          <w:rFonts w:ascii="Times New Roman" w:eastAsia="Times New Roman" w:hAnsi="Times New Roman" w:cs="Times New Roman"/>
-          <w:sz w:val="24"/>
-          <w:szCs w:val="24"/>
-        </w:rPr>
-      </w:pPr>
-      <w:r>
-        <w:rPr>
-          <w:rFonts w:ascii="Times New Roman" w:eastAsia="Times New Roman" w:hAnsi="Times New Roman" w:cs="Times New Roman"/>
+          <w:rFonts w:ascii="Times New Roman" w:hAnsi="Times New Roman" w:eastAsia="Times New Roman" w:cs="Times New Roman"/>
+          <w:sz w:val="24"/>
+          <w:szCs w:val="24"/>
+        </w:rPr>
+      </w:pPr>
+      <w:r>
+        <w:rPr>
+          <w:rFonts w:ascii="Times New Roman" w:hAnsi="Times New Roman" w:eastAsia="Times New Roman" w:cs="Times New Roman"/>
           <w:b/>
           <w:sz w:val="24"/>
           <w:szCs w:val="24"/>
@@ -459,7 +459,7 @@
       </w:r>
       <w:r>
         <w:rPr>
-          <w:rFonts w:ascii="Times New Roman" w:eastAsia="Times New Roman" w:hAnsi="Times New Roman" w:cs="Times New Roman"/>
+          <w:rFonts w:ascii="Times New Roman" w:hAnsi="Times New Roman" w:eastAsia="Times New Roman" w:cs="Times New Roman"/>
           <w:sz w:val="24"/>
           <w:szCs w:val="24"/>
         </w:rPr>
@@ -467,11 +467,10 @@
       </w:r>
       <w:r>
         <w:rPr>
-          <w:rFonts w:ascii="Times New Roman" w:eastAsia="Times New Roman" w:hAnsi="Times New Roman" w:cs="Times New Roman"/>
-          <w:sz w:val="24"/>
-          <w:szCs w:val="24"/>
-        </w:rPr>
-        <w:lastRenderedPageBreak/>
+          <w:rFonts w:ascii="Times New Roman" w:hAnsi="Times New Roman" w:eastAsia="Times New Roman" w:cs="Times New Roman"/>
+          <w:sz w:val="24"/>
+          <w:szCs w:val="24"/>
+        </w:rPr>
         <w:t>Ausgleich von Arbeitsbelastungen tragen dazu bei, die Motivation und Zufriedenheit unserer Mitarbeiter zu erhöhen.</w:t>
       </w:r>
     </w:p>
@@ -479,7 +478,7 @@
       <w:pPr>
         <w:spacing w:before="280" w:after="280" w:line="240" w:lineRule="auto"/>
         <w:rPr>
-          <w:rFonts w:ascii="Times New Roman" w:eastAsia="Times New Roman" w:hAnsi="Times New Roman" w:cs="Times New Roman"/>
+          <w:rFonts w:ascii="Times New Roman" w:hAnsi="Times New Roman" w:eastAsia="Times New Roman" w:cs="Times New Roman"/>
           <w:b/>
           <w:sz w:val="27"/>
           <w:szCs w:val="27"/>
@@ -487,7 +486,7 @@
       </w:pPr>
       <w:r>
         <w:rPr>
-          <w:rFonts w:ascii="Times New Roman" w:eastAsia="Times New Roman" w:hAnsi="Times New Roman" w:cs="Times New Roman"/>
+          <w:rFonts w:ascii="Times New Roman" w:hAnsi="Times New Roman" w:eastAsia="Times New Roman" w:cs="Times New Roman"/>
           <w:b/>
           <w:sz w:val="27"/>
           <w:szCs w:val="27"/>
@@ -499,14 +498,14 @@
       <w:pPr>
         <w:spacing w:before="280" w:after="280" w:line="240" w:lineRule="auto"/>
         <w:rPr>
-          <w:rFonts w:ascii="Times New Roman" w:eastAsia="Times New Roman" w:hAnsi="Times New Roman" w:cs="Times New Roman"/>
-          <w:sz w:val="24"/>
-          <w:szCs w:val="24"/>
-        </w:rPr>
-      </w:pPr>
-      <w:r>
-        <w:rPr>
-          <w:rFonts w:ascii="Times New Roman" w:eastAsia="Times New Roman" w:hAnsi="Times New Roman" w:cs="Times New Roman"/>
+          <w:rFonts w:ascii="Times New Roman" w:hAnsi="Times New Roman" w:eastAsia="Times New Roman" w:cs="Times New Roman"/>
+          <w:sz w:val="24"/>
+          <w:szCs w:val="24"/>
+        </w:rPr>
+      </w:pPr>
+      <w:r>
+        <w:rPr>
+          <w:rFonts w:ascii="Times New Roman" w:hAnsi="Times New Roman" w:eastAsia="Times New Roman" w:cs="Times New Roman"/>
           <w:sz w:val="24"/>
           <w:szCs w:val="24"/>
         </w:rPr>
@@ -515,7 +514,7 @@
       <w:proofErr w:type="spellStart"/>
       <w:r>
         <w:rPr>
-          <w:rFonts w:ascii="Times New Roman" w:eastAsia="Times New Roman" w:hAnsi="Times New Roman" w:cs="Times New Roman"/>
+          <w:rFonts w:ascii="Times New Roman" w:hAnsi="Times New Roman" w:eastAsia="Times New Roman" w:cs="Times New Roman"/>
           <w:sz w:val="24"/>
           <w:szCs w:val="24"/>
         </w:rPr>
@@ -524,7 +523,7 @@
       <w:proofErr w:type="spellEnd"/>
       <w:r>
         <w:rPr>
-          <w:rFonts w:ascii="Times New Roman" w:eastAsia="Times New Roman" w:hAnsi="Times New Roman" w:cs="Times New Roman"/>
+          <w:rFonts w:ascii="Times New Roman" w:hAnsi="Times New Roman" w:eastAsia="Times New Roman" w:cs="Times New Roman"/>
           <w:sz w:val="24"/>
           <w:szCs w:val="24"/>
         </w:rPr>
@@ -532,7 +531,7 @@
       </w:r>
       <w:r>
         <w:rPr>
-          <w:rFonts w:ascii="Times New Roman" w:eastAsia="Times New Roman" w:hAnsi="Times New Roman" w:cs="Times New Roman"/>
+          <w:rFonts w:ascii="Times New Roman" w:hAnsi="Times New Roman" w:eastAsia="Times New Roman" w:cs="Times New Roman"/>
           <w:sz w:val="24"/>
           <w:szCs w:val="24"/>
         </w:rPr>
@@ -540,7 +539,7 @@
       </w:r>
       <w:r>
         <w:rPr>
-          <w:rFonts w:ascii="Times New Roman" w:eastAsia="Times New Roman" w:hAnsi="Times New Roman" w:cs="Times New Roman"/>
+          <w:rFonts w:ascii="Times New Roman" w:hAnsi="Times New Roman" w:eastAsia="Times New Roman" w:cs="Times New Roman"/>
           <w:sz w:val="24"/>
           <w:szCs w:val="24"/>
         </w:rPr>
@@ -548,7 +547,7 @@
       </w:r>
       <w:r>
         <w:rPr>
-          <w:rFonts w:ascii="Times New Roman" w:eastAsia="Times New Roman" w:hAnsi="Times New Roman" w:cs="Times New Roman"/>
+          <w:rFonts w:ascii="Times New Roman" w:hAnsi="Times New Roman" w:eastAsia="Times New Roman" w:cs="Times New Roman"/>
           <w:sz w:val="24"/>
           <w:szCs w:val="24"/>
         </w:rPr>
@@ -559,14 +558,14 @@
       <w:pPr>
         <w:spacing w:before="280" w:after="280" w:line="240" w:lineRule="auto"/>
         <w:rPr>
-          <w:rFonts w:ascii="Times New Roman" w:eastAsia="Times New Roman" w:hAnsi="Times New Roman" w:cs="Times New Roman"/>
-          <w:sz w:val="24"/>
-          <w:szCs w:val="24"/>
-        </w:rPr>
-      </w:pPr>
-      <w:r>
-        <w:rPr>
-          <w:rFonts w:ascii="Times New Roman" w:eastAsia="Times New Roman" w:hAnsi="Times New Roman" w:cs="Times New Roman"/>
+          <w:rFonts w:ascii="Times New Roman" w:hAnsi="Times New Roman" w:eastAsia="Times New Roman" w:cs="Times New Roman"/>
+          <w:sz w:val="24"/>
+          <w:szCs w:val="24"/>
+        </w:rPr>
+      </w:pPr>
+      <w:r>
+        <w:rPr>
+          <w:rFonts w:ascii="Times New Roman" w:hAnsi="Times New Roman" w:eastAsia="Times New Roman" w:cs="Times New Roman"/>
           <w:sz w:val="24"/>
           <w:szCs w:val="24"/>
         </w:rPr>
@@ -592,7 +591,7 @@
     <w:sectPr>
       <w:headerReference w:type="default" r:id="rId9"/>
       <w:footerReference w:type="default" r:id="rId10"/>
-      <w:pgSz w:w="11906" w:h="16838"/>
+      <w:pgSz w:w="11906" w:h="16838" w:orient="portrait"/>
       <w:pgMar w:top="1701" w:right="1418" w:bottom="1701" w:left="1418" w:header="709" w:footer="709" w:gutter="0"/>
       <w:pgNumType w:start="1"/>
       <w:cols w:space="720"/>
@@ -627,14 +626,14 @@
 </file>
 
 <file path=word/footer1.xml><?xml version="1.0" encoding="utf-8"?>
-<w:ftr xmlns:wpc="http://schemas.microsoft.com/office/word/2010/wordprocessingCanvas" xmlns:cx="http://schemas.microsoft.com/office/drawing/2014/chartex" xmlns:cx1="http://schemas.microsoft.com/office/drawing/2015/9/8/chartex" xmlns:cx2="http://schemas.microsoft.com/office/drawing/2015/10/21/chartex" xmlns:cx3="http://schemas.microsoft.com/office/drawing/2016/5/9/chartex" xmlns:cx4="http://schemas.microsoft.com/office/drawing/2016/5/10/chartex" xmlns:cx5="http://schemas.microsoft.com/office/drawing/2016/5/11/chartex" xmlns:cx6="http://schemas.microsoft.com/office/drawing/2016/5/12/chartex" xmlns:cx7="http://schemas.microsoft.com/office/drawing/2016/5/13/chartex" xmlns:cx8="http://schemas.microsoft.com/office/drawing/2016/5/14/chartex" xmlns:mc="http://schemas.openxmlformats.org/markup-compatibility/2006" xmlns:aink="http://schemas.microsoft.com/office/drawing/2016/ink" xmlns:am3d="http://schemas.microsoft.com/office/drawing/2017/model3d" xmlns:o="urn:schemas-microsoft-com:office:office" xmlns:oel="http://schemas.microsoft.com/office/2019/extlst" xmlns:r="http://schemas.openxmlformats.org/officeDocument/2006/relationships" xmlns:m="http://schemas.openxmlformats.org/officeDocument/2006/math" xmlns:v="urn:schemas-microsoft-com:vml" xmlns:wp14="http://schemas.microsoft.com/office/word/2010/wordprocessingDrawing" xmlns:wp="http://schemas.openxmlformats.org/drawingml/2006/wordprocessingDrawing" xmlns:w10="urn:schemas-microsoft-com:office:word" xmlns:w="http://schemas.openxmlformats.org/wordprocessingml/2006/main" xmlns:w14="http://schemas.microsoft.com/office/word/2010/wordml" xmlns:w15="http://schemas.microsoft.com/office/word/2012/wordml" xmlns:w16cex="http://schemas.microsoft.com/office/word/2018/wordml/cex" xmlns:w16cid="http://schemas.microsoft.com/office/word/2016/wordml/cid" xmlns:w16="http://schemas.microsoft.com/office/word/2018/wordml" xmlns:w16du="http://schemas.microsoft.com/office/word/2023/wordml/word16du" xmlns:w16sdtdh="http://schemas.microsoft.com/office/word/2020/wordml/sdtdatahash" xmlns:w16sdtfl="http://schemas.microsoft.com/office/word/2024/wordml/sdtformatlock" xmlns:w16se="http://schemas.microsoft.com/office/word/2015/wordml/symex" xmlns:wpg="http://schemas.microsoft.com/office/word/2010/wordprocessingGroup" xmlns:wpi="http://schemas.microsoft.com/office/word/2010/wordprocessingInk" xmlns:wne="http://schemas.microsoft.com/office/word/2006/wordml" xmlns:wps="http://schemas.microsoft.com/office/word/2010/wordprocessingShape" mc:Ignorable="w14 w15 w16se w16cid w16 w16cex w16sdtdh w16sdtfl w16du wp14">
-  <w:bookmarkStart w:id="0" w:name="_Hlk167319170"/>
-  <w:bookmarkStart w:id="1" w:name="_Hlk167319171"/>
+<w:ftr xmlns:wpc="http://schemas.microsoft.com/office/word/2010/wordprocessingCanvas" xmlns:cx="http://schemas.microsoft.com/office/drawing/2014/chartex" xmlns:cx1="http://schemas.microsoft.com/office/drawing/2015/9/8/chartex" xmlns:cx2="http://schemas.microsoft.com/office/drawing/2015/10/21/chartex" xmlns:cx3="http://schemas.microsoft.com/office/drawing/2016/5/9/chartex" xmlns:cx4="http://schemas.microsoft.com/office/drawing/2016/5/10/chartex" xmlns:cx5="http://schemas.microsoft.com/office/drawing/2016/5/11/chartex" xmlns:cx6="http://schemas.microsoft.com/office/drawing/2016/5/12/chartex" xmlns:cx7="http://schemas.microsoft.com/office/drawing/2016/5/13/chartex" xmlns:cx8="http://schemas.microsoft.com/office/drawing/2016/5/14/chartex" xmlns:mc="http://schemas.openxmlformats.org/markup-compatibility/2006" xmlns:aink="http://schemas.microsoft.com/office/drawing/2016/ink" xmlns:am3d="http://schemas.microsoft.com/office/drawing/2017/model3d" xmlns:o="urn:schemas-microsoft-com:office:office" xmlns:oel="http://schemas.microsoft.com/office/2019/extlst" xmlns:r="http://schemas.openxmlformats.org/officeDocument/2006/relationships" xmlns:m="http://schemas.openxmlformats.org/officeDocument/2006/math" xmlns:v="urn:schemas-microsoft-com:vml" xmlns:wp14="http://schemas.microsoft.com/office/word/2010/wordprocessingDrawing" xmlns:wp="http://schemas.openxmlformats.org/drawingml/2006/wordprocessingDrawing" xmlns:w10="urn:schemas-microsoft-com:office:word" xmlns:w="http://schemas.openxmlformats.org/wordprocessingml/2006/main" xmlns:w14="http://schemas.microsoft.com/office/word/2010/wordml" xmlns:w15="http://schemas.microsoft.com/office/word/2012/wordml" xmlns:w16cex="http://schemas.microsoft.com/office/word/2018/wordml/cex" xmlns:w16cid="http://schemas.microsoft.com/office/word/2016/wordml/cid" xmlns:w16="http://schemas.microsoft.com/office/word/2018/wordml" xmlns:w16du="http://schemas.microsoft.com/office/word/2023/wordml/word16du" xmlns:w16sdtdh="http://schemas.microsoft.com/office/word/2020/wordml/sdtdatahash" xmlns:w16sdtfl="http://schemas.microsoft.com/office/word/2024/wordml/sdtformatlock" xmlns:w16se="http://schemas.microsoft.com/office/word/2015/wordml/symex" xmlns:wpg="http://schemas.microsoft.com/office/word/2010/wordprocessingGroup" xmlns:wpi="http://schemas.microsoft.com/office/word/2010/wordprocessingInk" xmlns:wne="http://schemas.microsoft.com/office/word/2006/wordml" xmlns:wps="http://schemas.microsoft.com/office/word/2010/wordprocessingShape" xmlns:a="http://schemas.openxmlformats.org/drawingml/2006/main" mc:Ignorable="w14 w15 w16se w16cid w16 w16cex w16sdtdh w16sdtfl w16du wp14">
+  <w:bookmarkStart w:name="_Hlk167319170" w:id="0"/>
+  <w:bookmarkStart w:name="_Hlk167319171" w:id="1"/>
   <w:p>
     <w:pPr>
       <w:pStyle w:val="Footer"/>
       <w:pBdr>
-        <w:top w:val="single" w:sz="4" w:space="1" w:color="D9D9D9" w:themeColor="background1" w:themeShade="D9"/>
+        <w:top w:val="single" w:color="D9D9D9" w:themeColor="background1" w:themeShade="D9" w:sz="4" w:space="1"/>
       </w:pBdr>
     </w:pPr>
     <w:r>
@@ -777,12 +776,12 @@
           </w:drawing>
         </mc:Choice>
         <mc:Fallback>
-          <w:pict>
-            <v:shapetype w14:anchorId="475E44FD" id="_x0000_t202" coordsize="21600,21600" o:spt="202" path="m,l,21600r21600,l21600,xe">
+          <w:pict w14:anchorId="22492FB6">
+            <v:shapetype id="_x0000_t202" coordsize="21600,21600" o:spt="202" path="m,l,21600r21600,l21600,xe" w14:anchorId="475E44FD">
               <v:stroke joinstyle="miter"/>
               <v:path gradientshapeok="t" o:connecttype="rect"/>
             </v:shapetype>
-            <v:shape id="Textfeld 35" o:spid="_x0000_s1026" type="#_x0000_t202" style="position:absolute;margin-left:427.15pt;margin-top:6.35pt;width:83.5pt;height:20.5pt;z-index:251680768;visibility:visible;mso-wrap-style:square;mso-width-percent:0;mso-height-percent:0;mso-wrap-distance-left:9pt;mso-wrap-distance-top:0;mso-wrap-distance-right:9pt;mso-wrap-distance-bottom:0;mso-position-horizontal:absolute;mso-position-horizontal-relative:text;mso-position-vertical:absolute;mso-position-vertical-relative:text;mso-width-percent:0;mso-height-percent:0;mso-width-relative:margin;mso-height-relative:margin;v-text-anchor:top" o:gfxdata="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" fillcolor="white [3201]" stroked="f" strokeweight=".5pt">
+            <v:shape id="Textfeld 35" style="position:absolute;margin-left:427.15pt;margin-top:6.35pt;width:83.5pt;height:20.5pt;z-index:251680768;visibility:visible;mso-wrap-style:square;mso-width-percent:0;mso-height-percent:0;mso-wrap-distance-left:9pt;mso-wrap-distance-top:0;mso-wrap-distance-right:9pt;mso-wrap-distance-bottom:0;mso-position-horizontal:absolute;mso-position-horizontal-relative:text;mso-position-vertical:absolute;mso-position-vertical-relative:text;mso-width-percent:0;mso-height-percent:0;mso-width-relative:margin;mso-height-relative:margin;v-text-anchor:top" o:spid="_x0000_s1026" fillcolor="white [3201]" stroked="f" strokeweight=".5pt" type="#_x0000_t202" o:gfxdata="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">
               <v:textbox>
                 <w:txbxContent>
                   <w:p>
@@ -877,189 +876,118 @@
     <w:pPr>
       <w:spacing w:after="0"/>
       <w:rPr>
-        <w:rFonts w:cstheme="minorHAnsi"/>
-        <w:b/>
-        <w:bCs/>
-        <w:highlight w:val="yellow"/>
+        <w:rFonts w:cs="Calibri" w:cstheme="minorAscii"/>
       </w:rPr>
     </w:pPr>
     <w:r>
       <w:rPr>
-        <w:rFonts w:cstheme="minorHAnsi"/>
+        <w:rFonts w:cs="Calibri" w:cstheme="minorAscii"/>
       </w:rPr>
       <w:t>Version: 1</w:t>
     </w:r>
     <w:r>
-      <w:rPr>
-        <w:rFonts w:cstheme="minorHAnsi"/>
-        <w:highlight w:val="yellow"/>
-      </w:rPr>
       <w:br/>
     </w:r>
-    <w:proofErr w:type="gramStart"/>
-    <w:r>
-      <w:rPr>
-        <w:rFonts w:cstheme="minorHAnsi"/>
+    <w:r>
+      <w:rPr>
+        <w:rFonts w:cs="Calibri" w:cstheme="minorAscii"/>
       </w:rPr>
       <w:t>Erstellt</w:t>
     </w:r>
     <w:r>
       <w:rPr>
-        <w:rFonts w:cstheme="minorHAnsi"/>
-        <w:highlight w:val="yellow"/>
+        <w:rFonts w:cs="Calibri" w:cstheme="minorAscii"/>
       </w:rPr>
       <w:t xml:space="preserve">: </w:t>
     </w:r>
     <w:r>
       <w:rPr>
-        <w:rFonts w:cstheme="minorHAnsi"/>
-        <w:b/>
-        <w:bCs/>
-        <w:highlight w:val="yellow"/>
-      </w:rPr>
-      <w:t xml:space="preserve"> </w:t>
-    </w:r>
-    <w:r>
-      <w:rPr>
-        <w:rFonts w:cstheme="minorHAnsi"/>
-        <w:b/>
-        <w:bCs/>
-        <w:highlight w:val="yellow"/>
-      </w:rPr>
-      <w:t>{</w:t>
-    </w:r>
-    <w:proofErr w:type="spellStart"/>
-    <w:proofErr w:type="gramEnd"/>
-    <w:r>
-      <w:rPr>
-        <w:rFonts w:cstheme="minorHAnsi"/>
-        <w:b/>
-        <w:bCs/>
-        <w:highlight w:val="yellow"/>
-      </w:rPr>
-      <w:t>ceo_name</w:t>
-    </w:r>
-    <w:proofErr w:type="spellEnd"/>
-    <w:r>
-      <w:rPr>
-        <w:rFonts w:cstheme="minorHAnsi"/>
-        <w:b/>
-        <w:bCs/>
-        <w:highlight w:val="yellow"/>
-      </w:rPr>
-      <w:t>}</w:t>
+        <w:rFonts w:cs="Calibri" w:cstheme="minorAscii"/>
+      </w:rPr>
+      <w:t>{ceo_name}</w:t>
     </w:r>
   </w:p>
   <w:p>
     <w:pPr>
       <w:pStyle w:val="Footer"/>
       <w:jc w:val="center"/>
+      <w:rPr>
+        <w:noProof/>
+      </w:rPr>
     </w:pPr>
     <w:r>
       <w:rPr>
-        <w:rFonts w:cstheme="minorHAnsi"/>
+        <w:rFonts w:cs="Calibri" w:cstheme="minorAscii"/>
       </w:rPr>
       <w:t>Freigegeben</w:t>
     </w:r>
     <w:r>
       <w:rPr>
-        <w:rFonts w:cstheme="minorHAnsi"/>
-        <w:b/>
-        <w:bCs/>
+        <w:rFonts w:cs="Calibri" w:cstheme="minorAscii"/>
+        <w:b w:val="1"/>
+        <w:bCs w:val="1"/>
       </w:rPr>
       <w:t xml:space="preserve">: </w:t>
     </w:r>
     <w:r>
       <w:rPr>
-        <w:rFonts w:cstheme="minorHAnsi"/>
-        <w:b/>
-        <w:bCs/>
-      </w:rPr>
-      <w:t>{</w:t>
-    </w:r>
-    <w:proofErr w:type="spellStart"/>
-    <w:r>
-      <w:rPr>
-        <w:rFonts w:cstheme="minorHAnsi"/>
-        <w:b/>
-        <w:bCs/>
-      </w:rPr>
-      <w:t>releasedBy</w:t>
-    </w:r>
-    <w:proofErr w:type="spellEnd"/>
-    <w:r>
-      <w:rPr>
-        <w:rFonts w:cstheme="minorHAnsi"/>
-        <w:b/>
-        <w:bCs/>
-      </w:rPr>
-      <w:t>}</w:t>
-    </w:r>
-    <w:r>
-      <w:rPr>
-        <w:rFonts w:cstheme="minorHAnsi"/>
-        <w:b/>
-        <w:bCs/>
-      </w:rPr>
+        <w:rFonts w:cs="Calibri" w:cstheme="minorAscii"/>
+        <w:b w:val="1"/>
+        <w:bCs w:val="1"/>
+      </w:rPr>
+      <w:t>{releasedBy}</w:t>
+    </w:r>
+    <w:r>
       <w:tab/>
     </w:r>
     <w:r>
-      <w:rPr>
-        <w:rFonts w:cstheme="minorHAnsi"/>
-        <w:b/>
-        <w:bCs/>
-      </w:rPr>
       <w:tab/>
     </w:r>
-    <w:fldSimple w:instr=" FILENAME \* MERGEFORMAT ">
-      <w:r>
-        <w:rPr>
-          <w:noProof/>
-        </w:rPr>
-        <w:t>Kap. 5, D0 – Qualitätspolitik</w:t>
-      </w:r>
-    </w:fldSimple>
+    <w:r>
+      <w:fldChar w:fldCharType="begin"/>
+    </w:r>
+    <w:r>
+      <w:instrText xml:space="preserve"> FILENAME \* MERGEFORMAT </w:instrText>
+    </w:r>
+    <w:r>
+      <w:fldChar w:fldCharType="separate"/>
+    </w:r>
+    <w:r>
+      <w:rPr>
+        <w:noProof/>
+      </w:rPr>
+      <w:t>Kap. 5, D</w:t>
+    </w:r>
+    <w:r>
+      <w:rPr>
+        <w:noProof/>
+      </w:rPr>
+      <w:t>0 – Qualitätspolitik</w:t>
+    </w:r>
+    <w:r>
+      <w:fldChar w:fldCharType="end"/>
+    </w:r>
   </w:p>
   <w:p>
     <w:pPr>
       <w:spacing w:after="0"/>
       <w:rPr>
-        <w:rFonts w:cstheme="minorHAnsi"/>
-        <w:b/>
-        <w:bCs/>
+        <w:rFonts w:cs="Calibri" w:cstheme="minorAscii"/>
+        <w:b w:val="1"/>
+        <w:bCs w:val="1"/>
       </w:rPr>
     </w:pPr>
     <w:r>
       <w:rPr>
-        <w:rFonts w:cstheme="minorHAnsi"/>
+        <w:rFonts w:cs="Calibri" w:cstheme="minorAscii"/>
       </w:rPr>
       <w:t xml:space="preserve">Datum: </w:t>
     </w:r>
     <w:r>
       <w:rPr>
-        <w:rFonts w:cstheme="minorHAnsi"/>
-        <w:b/>
-        <w:bCs/>
-      </w:rPr>
-      <w:t>{</w:t>
-    </w:r>
-    <w:proofErr w:type="spellStart"/>
-    <w:r>
-      <w:rPr>
-        <w:rFonts w:cstheme="minorHAnsi"/>
-        <w:b/>
-        <w:bCs/>
-      </w:rPr>
-      <w:t>doc_date</w:t>
-    </w:r>
-    <w:proofErr w:type="spellEnd"/>
-    <w:r>
-      <w:rPr>
-        <w:rFonts w:cstheme="minorHAnsi"/>
-        <w:b/>
-        <w:bCs/>
-      </w:rPr>
-      <w:t>}</w:t>
+        <w:rFonts w:cs="Calibri" w:cstheme="minorAscii"/>
+      </w:rPr>
+      <w:t>{doc_date}</w:t>
     </w:r>
   </w:p>
 </w:ftr>
@@ -1107,7 +1035,7 @@
     </w:pPr>
     <w:r>
       <w:rPr>
-        <w:rFonts w:asciiTheme="majorHAnsi" w:eastAsiaTheme="majorEastAsia" w:hAnsiTheme="majorHAnsi" w:cstheme="majorBidi"/>
+        <w:rFonts w:asciiTheme="majorHAnsi" w:hAnsiTheme="majorHAnsi" w:eastAsiaTheme="majorEastAsia" w:cstheme="majorBidi"/>
         <w:b/>
         <w:bCs/>
         <w:sz w:val="32"/>
@@ -1117,7 +1045,7 @@
     </w:r>
     <w:r>
       <w:rPr>
-        <w:rFonts w:asciiTheme="majorHAnsi" w:eastAsiaTheme="majorEastAsia" w:hAnsiTheme="majorHAnsi" w:cstheme="majorBidi"/>
+        <w:rFonts w:asciiTheme="majorHAnsi" w:hAnsiTheme="majorHAnsi" w:eastAsiaTheme="majorEastAsia" w:cstheme="majorBidi"/>
         <w:b/>
         <w:bCs/>
         <w:sz w:val="32"/>
@@ -1127,7 +1055,7 @@
     </w:r>
     <w:r>
       <w:rPr>
-        <w:rFonts w:asciiTheme="majorHAnsi" w:eastAsiaTheme="majorEastAsia" w:hAnsiTheme="majorHAnsi" w:cstheme="majorBidi"/>
+        <w:rFonts w:asciiTheme="majorHAnsi" w:hAnsiTheme="majorHAnsi" w:eastAsiaTheme="majorEastAsia" w:cstheme="majorBidi"/>
         <w:b/>
         <w:bCs/>
         <w:sz w:val="32"/>
@@ -1137,7 +1065,7 @@
     </w:r>
     <w:r>
       <w:rPr>
-        <w:rFonts w:asciiTheme="majorHAnsi" w:eastAsiaTheme="majorEastAsia" w:hAnsiTheme="majorHAnsi" w:cstheme="majorBidi"/>
+        <w:rFonts w:asciiTheme="majorHAnsi" w:hAnsiTheme="majorHAnsi" w:eastAsiaTheme="majorEastAsia" w:cstheme="majorBidi"/>
         <w:b/>
         <w:bCs/>
         <w:noProof/>
@@ -1148,7 +1076,7 @@
     </w:r>
     <w:r>
       <w:rPr>
-        <w:rFonts w:asciiTheme="majorHAnsi" w:eastAsiaTheme="majorEastAsia" w:hAnsiTheme="majorHAnsi" w:cstheme="majorBidi"/>
+        <w:rFonts w:asciiTheme="majorHAnsi" w:hAnsiTheme="majorHAnsi" w:eastAsiaTheme="majorEastAsia" w:cstheme="majorBidi"/>
         <w:b/>
         <w:bCs/>
         <w:sz w:val="32"/>
@@ -1214,7 +1142,7 @@
         <w:ind w:left="720" w:hanging="360"/>
       </w:pPr>
       <w:rPr>
-        <w:rFonts w:ascii="Noto Sans Symbols" w:eastAsia="Noto Sans Symbols" w:hAnsi="Noto Sans Symbols" w:cs="Noto Sans Symbols"/>
+        <w:rFonts w:ascii="Noto Sans Symbols" w:hAnsi="Noto Sans Symbols" w:eastAsia="Noto Sans Symbols" w:cs="Noto Sans Symbols"/>
         <w:sz w:val="20"/>
         <w:szCs w:val="20"/>
       </w:rPr>
@@ -1228,7 +1156,7 @@
         <w:ind w:left="1440" w:hanging="360"/>
       </w:pPr>
       <w:rPr>
-        <w:rFonts w:ascii="Courier New" w:eastAsia="Courier New" w:hAnsi="Courier New" w:cs="Courier New"/>
+        <w:rFonts w:ascii="Courier New" w:hAnsi="Courier New" w:eastAsia="Courier New" w:cs="Courier New"/>
         <w:sz w:val="20"/>
         <w:szCs w:val="20"/>
       </w:rPr>
@@ -1242,7 +1170,7 @@
         <w:ind w:left="2160" w:hanging="360"/>
       </w:pPr>
       <w:rPr>
-        <w:rFonts w:ascii="Noto Sans Symbols" w:eastAsia="Noto Sans Symbols" w:hAnsi="Noto Sans Symbols" w:cs="Noto Sans Symbols"/>
+        <w:rFonts w:ascii="Noto Sans Symbols" w:hAnsi="Noto Sans Symbols" w:eastAsia="Noto Sans Symbols" w:cs="Noto Sans Symbols"/>
         <w:sz w:val="20"/>
         <w:szCs w:val="20"/>
       </w:rPr>
@@ -1256,7 +1184,7 @@
         <w:ind w:left="2880" w:hanging="360"/>
       </w:pPr>
       <w:rPr>
-        <w:rFonts w:ascii="Noto Sans Symbols" w:eastAsia="Noto Sans Symbols" w:hAnsi="Noto Sans Symbols" w:cs="Noto Sans Symbols"/>
+        <w:rFonts w:ascii="Noto Sans Symbols" w:hAnsi="Noto Sans Symbols" w:eastAsia="Noto Sans Symbols" w:cs="Noto Sans Symbols"/>
         <w:sz w:val="20"/>
         <w:szCs w:val="20"/>
       </w:rPr>
@@ -1270,7 +1198,7 @@
         <w:ind w:left="3600" w:hanging="360"/>
       </w:pPr>
       <w:rPr>
-        <w:rFonts w:ascii="Noto Sans Symbols" w:eastAsia="Noto Sans Symbols" w:hAnsi="Noto Sans Symbols" w:cs="Noto Sans Symbols"/>
+        <w:rFonts w:ascii="Noto Sans Symbols" w:hAnsi="Noto Sans Symbols" w:eastAsia="Noto Sans Symbols" w:cs="Noto Sans Symbols"/>
         <w:sz w:val="20"/>
         <w:szCs w:val="20"/>
       </w:rPr>
@@ -1284,7 +1212,7 @@
         <w:ind w:left="4320" w:hanging="360"/>
       </w:pPr>
       <w:rPr>
-        <w:rFonts w:ascii="Noto Sans Symbols" w:eastAsia="Noto Sans Symbols" w:hAnsi="Noto Sans Symbols" w:cs="Noto Sans Symbols"/>
+        <w:rFonts w:ascii="Noto Sans Symbols" w:hAnsi="Noto Sans Symbols" w:eastAsia="Noto Sans Symbols" w:cs="Noto Sans Symbols"/>
         <w:sz w:val="20"/>
         <w:szCs w:val="20"/>
       </w:rPr>
@@ -1298,7 +1226,7 @@
         <w:ind w:left="5040" w:hanging="360"/>
       </w:pPr>
       <w:rPr>
-        <w:rFonts w:ascii="Noto Sans Symbols" w:eastAsia="Noto Sans Symbols" w:hAnsi="Noto Sans Symbols" w:cs="Noto Sans Symbols"/>
+        <w:rFonts w:ascii="Noto Sans Symbols" w:hAnsi="Noto Sans Symbols" w:eastAsia="Noto Sans Symbols" w:cs="Noto Sans Symbols"/>
         <w:sz w:val="20"/>
         <w:szCs w:val="20"/>
       </w:rPr>
@@ -1312,7 +1240,7 @@
         <w:ind w:left="5760" w:hanging="360"/>
       </w:pPr>
       <w:rPr>
-        <w:rFonts w:ascii="Noto Sans Symbols" w:eastAsia="Noto Sans Symbols" w:hAnsi="Noto Sans Symbols" w:cs="Noto Sans Symbols"/>
+        <w:rFonts w:ascii="Noto Sans Symbols" w:hAnsi="Noto Sans Symbols" w:eastAsia="Noto Sans Symbols" w:cs="Noto Sans Symbols"/>
         <w:sz w:val="20"/>
         <w:szCs w:val="20"/>
       </w:rPr>
@@ -1326,7 +1254,7 @@
         <w:ind w:left="6480" w:hanging="360"/>
       </w:pPr>
       <w:rPr>
-        <w:rFonts w:ascii="Noto Sans Symbols" w:eastAsia="Noto Sans Symbols" w:hAnsi="Noto Sans Symbols" w:cs="Noto Sans Symbols"/>
+        <w:rFonts w:ascii="Noto Sans Symbols" w:hAnsi="Noto Sans Symbols" w:eastAsia="Noto Sans Symbols" w:cs="Noto Sans Symbols"/>
         <w:sz w:val="20"/>
         <w:szCs w:val="20"/>
       </w:rPr>
@@ -1345,7 +1273,7 @@
         <w:ind w:left="720" w:hanging="360"/>
       </w:pPr>
       <w:rPr>
-        <w:rFonts w:ascii="Noto Sans Symbols" w:eastAsia="Noto Sans Symbols" w:hAnsi="Noto Sans Symbols" w:cs="Noto Sans Symbols"/>
+        <w:rFonts w:ascii="Noto Sans Symbols" w:hAnsi="Noto Sans Symbols" w:eastAsia="Noto Sans Symbols" w:cs="Noto Sans Symbols"/>
         <w:sz w:val="20"/>
         <w:szCs w:val="20"/>
       </w:rPr>
@@ -1359,7 +1287,7 @@
         <w:ind w:left="1440" w:hanging="360"/>
       </w:pPr>
       <w:rPr>
-        <w:rFonts w:ascii="Courier New" w:eastAsia="Courier New" w:hAnsi="Courier New" w:cs="Courier New"/>
+        <w:rFonts w:ascii="Courier New" w:hAnsi="Courier New" w:eastAsia="Courier New" w:cs="Courier New"/>
         <w:sz w:val="20"/>
         <w:szCs w:val="20"/>
       </w:rPr>
@@ -1373,7 +1301,7 @@
         <w:ind w:left="2160" w:hanging="360"/>
       </w:pPr>
       <w:rPr>
-        <w:rFonts w:ascii="Noto Sans Symbols" w:eastAsia="Noto Sans Symbols" w:hAnsi="Noto Sans Symbols" w:cs="Noto Sans Symbols"/>
+        <w:rFonts w:ascii="Noto Sans Symbols" w:hAnsi="Noto Sans Symbols" w:eastAsia="Noto Sans Symbols" w:cs="Noto Sans Symbols"/>
         <w:sz w:val="20"/>
         <w:szCs w:val="20"/>
       </w:rPr>
@@ -1387,7 +1315,7 @@
         <w:ind w:left="2880" w:hanging="360"/>
       </w:pPr>
       <w:rPr>
-        <w:rFonts w:ascii="Noto Sans Symbols" w:eastAsia="Noto Sans Symbols" w:hAnsi="Noto Sans Symbols" w:cs="Noto Sans Symbols"/>
+        <w:rFonts w:ascii="Noto Sans Symbols" w:hAnsi="Noto Sans Symbols" w:eastAsia="Noto Sans Symbols" w:cs="Noto Sans Symbols"/>
         <w:sz w:val="20"/>
         <w:szCs w:val="20"/>
       </w:rPr>
@@ -1401,7 +1329,7 @@
         <w:ind w:left="3600" w:hanging="360"/>
       </w:pPr>
       <w:rPr>
-        <w:rFonts w:ascii="Noto Sans Symbols" w:eastAsia="Noto Sans Symbols" w:hAnsi="Noto Sans Symbols" w:cs="Noto Sans Symbols"/>
+        <w:rFonts w:ascii="Noto Sans Symbols" w:hAnsi="Noto Sans Symbols" w:eastAsia="Noto Sans Symbols" w:cs="Noto Sans Symbols"/>
         <w:sz w:val="20"/>
         <w:szCs w:val="20"/>
       </w:rPr>
@@ -1415,7 +1343,7 @@
         <w:ind w:left="4320" w:hanging="360"/>
       </w:pPr>
       <w:rPr>
-        <w:rFonts w:ascii="Noto Sans Symbols" w:eastAsia="Noto Sans Symbols" w:hAnsi="Noto Sans Symbols" w:cs="Noto Sans Symbols"/>
+        <w:rFonts w:ascii="Noto Sans Symbols" w:hAnsi="Noto Sans Symbols" w:eastAsia="Noto Sans Symbols" w:cs="Noto Sans Symbols"/>
         <w:sz w:val="20"/>
         <w:szCs w:val="20"/>
       </w:rPr>
@@ -1429,7 +1357,7 @@
         <w:ind w:left="5040" w:hanging="360"/>
       </w:pPr>
       <w:rPr>
-        <w:rFonts w:ascii="Noto Sans Symbols" w:eastAsia="Noto Sans Symbols" w:hAnsi="Noto Sans Symbols" w:cs="Noto Sans Symbols"/>
+        <w:rFonts w:ascii="Noto Sans Symbols" w:hAnsi="Noto Sans Symbols" w:eastAsia="Noto Sans Symbols" w:cs="Noto Sans Symbols"/>
         <w:sz w:val="20"/>
         <w:szCs w:val="20"/>
       </w:rPr>
@@ -1443,7 +1371,7 @@
         <w:ind w:left="5760" w:hanging="360"/>
       </w:pPr>
       <w:rPr>
-        <w:rFonts w:ascii="Noto Sans Symbols" w:eastAsia="Noto Sans Symbols" w:hAnsi="Noto Sans Symbols" w:cs="Noto Sans Symbols"/>
+        <w:rFonts w:ascii="Noto Sans Symbols" w:hAnsi="Noto Sans Symbols" w:eastAsia="Noto Sans Symbols" w:cs="Noto Sans Symbols"/>
         <w:sz w:val="20"/>
         <w:szCs w:val="20"/>
       </w:rPr>
@@ -1457,7 +1385,7 @@
         <w:ind w:left="6480" w:hanging="360"/>
       </w:pPr>
       <w:rPr>
-        <w:rFonts w:ascii="Noto Sans Symbols" w:eastAsia="Noto Sans Symbols" w:hAnsi="Noto Sans Symbols" w:cs="Noto Sans Symbols"/>
+        <w:rFonts w:ascii="Noto Sans Symbols" w:hAnsi="Noto Sans Symbols" w:eastAsia="Noto Sans Symbols" w:cs="Noto Sans Symbols"/>
         <w:sz w:val="20"/>
         <w:szCs w:val="20"/>
       </w:rPr>
@@ -1476,7 +1404,7 @@
         <w:ind w:left="720" w:hanging="360"/>
       </w:pPr>
       <w:rPr>
-        <w:rFonts w:ascii="Noto Sans Symbols" w:eastAsia="Noto Sans Symbols" w:hAnsi="Noto Sans Symbols" w:cs="Noto Sans Symbols"/>
+        <w:rFonts w:ascii="Noto Sans Symbols" w:hAnsi="Noto Sans Symbols" w:eastAsia="Noto Sans Symbols" w:cs="Noto Sans Symbols"/>
         <w:sz w:val="20"/>
         <w:szCs w:val="20"/>
       </w:rPr>
@@ -1490,7 +1418,7 @@
         <w:ind w:left="1440" w:hanging="360"/>
       </w:pPr>
       <w:rPr>
-        <w:rFonts w:ascii="Courier New" w:eastAsia="Courier New" w:hAnsi="Courier New" w:cs="Courier New"/>
+        <w:rFonts w:ascii="Courier New" w:hAnsi="Courier New" w:eastAsia="Courier New" w:cs="Courier New"/>
         <w:sz w:val="20"/>
         <w:szCs w:val="20"/>
       </w:rPr>
@@ -1504,7 +1432,7 @@
         <w:ind w:left="2160" w:hanging="360"/>
       </w:pPr>
       <w:rPr>
-        <w:rFonts w:ascii="Noto Sans Symbols" w:eastAsia="Noto Sans Symbols" w:hAnsi="Noto Sans Symbols" w:cs="Noto Sans Symbols"/>
+        <w:rFonts w:ascii="Noto Sans Symbols" w:hAnsi="Noto Sans Symbols" w:eastAsia="Noto Sans Symbols" w:cs="Noto Sans Symbols"/>
         <w:sz w:val="20"/>
         <w:szCs w:val="20"/>
       </w:rPr>
@@ -1518,7 +1446,7 @@
         <w:ind w:left="2880" w:hanging="360"/>
       </w:pPr>
       <w:rPr>
-        <w:rFonts w:ascii="Noto Sans Symbols" w:eastAsia="Noto Sans Symbols" w:hAnsi="Noto Sans Symbols" w:cs="Noto Sans Symbols"/>
+        <w:rFonts w:ascii="Noto Sans Symbols" w:hAnsi="Noto Sans Symbols" w:eastAsia="Noto Sans Symbols" w:cs="Noto Sans Symbols"/>
         <w:sz w:val="20"/>
         <w:szCs w:val="20"/>
       </w:rPr>
@@ -1532,7 +1460,7 @@
         <w:ind w:left="3600" w:hanging="360"/>
       </w:pPr>
       <w:rPr>
-        <w:rFonts w:ascii="Noto Sans Symbols" w:eastAsia="Noto Sans Symbols" w:hAnsi="Noto Sans Symbols" w:cs="Noto Sans Symbols"/>
+        <w:rFonts w:ascii="Noto Sans Symbols" w:hAnsi="Noto Sans Symbols" w:eastAsia="Noto Sans Symbols" w:cs="Noto Sans Symbols"/>
         <w:sz w:val="20"/>
         <w:szCs w:val="20"/>
       </w:rPr>
@@ -1546,7 +1474,7 @@
         <w:ind w:left="4320" w:hanging="360"/>
       </w:pPr>
       <w:rPr>
-        <w:rFonts w:ascii="Noto Sans Symbols" w:eastAsia="Noto Sans Symbols" w:hAnsi="Noto Sans Symbols" w:cs="Noto Sans Symbols"/>
+        <w:rFonts w:ascii="Noto Sans Symbols" w:hAnsi="Noto Sans Symbols" w:eastAsia="Noto Sans Symbols" w:cs="Noto Sans Symbols"/>
         <w:sz w:val="20"/>
         <w:szCs w:val="20"/>
       </w:rPr>
@@ -1560,7 +1488,7 @@
         <w:ind w:left="5040" w:hanging="360"/>
       </w:pPr>
       <w:rPr>
-        <w:rFonts w:ascii="Noto Sans Symbols" w:eastAsia="Noto Sans Symbols" w:hAnsi="Noto Sans Symbols" w:cs="Noto Sans Symbols"/>
+        <w:rFonts w:ascii="Noto Sans Symbols" w:hAnsi="Noto Sans Symbols" w:eastAsia="Noto Sans Symbols" w:cs="Noto Sans Symbols"/>
         <w:sz w:val="20"/>
         <w:szCs w:val="20"/>
       </w:rPr>
@@ -1574,7 +1502,7 @@
         <w:ind w:left="5760" w:hanging="360"/>
       </w:pPr>
       <w:rPr>
-        <w:rFonts w:ascii="Noto Sans Symbols" w:eastAsia="Noto Sans Symbols" w:hAnsi="Noto Sans Symbols" w:cs="Noto Sans Symbols"/>
+        <w:rFonts w:ascii="Noto Sans Symbols" w:hAnsi="Noto Sans Symbols" w:eastAsia="Noto Sans Symbols" w:cs="Noto Sans Symbols"/>
         <w:sz w:val="20"/>
         <w:szCs w:val="20"/>
       </w:rPr>
@@ -1588,7 +1516,7 @@
         <w:ind w:left="6480" w:hanging="360"/>
       </w:pPr>
       <w:rPr>
-        <w:rFonts w:ascii="Noto Sans Symbols" w:eastAsia="Noto Sans Symbols" w:hAnsi="Noto Sans Symbols" w:cs="Noto Sans Symbols"/>
+        <w:rFonts w:ascii="Noto Sans Symbols" w:hAnsi="Noto Sans Symbols" w:eastAsia="Noto Sans Symbols" w:cs="Noto Sans Symbols"/>
         <w:sz w:val="20"/>
         <w:szCs w:val="20"/>
       </w:rPr>
@@ -1607,11 +1535,11 @@
 </file>
 
 <file path=word/styles.xml><?xml version="1.0" encoding="utf-8"?>
-<w:styles xmlns:mc="http://schemas.openxmlformats.org/markup-compatibility/2006" xmlns:r="http://schemas.openxmlformats.org/officeDocument/2006/relationships" xmlns:w="http://schemas.openxmlformats.org/wordprocessingml/2006/main" xmlns:w14="http://schemas.microsoft.com/office/word/2010/wordml" xmlns:w15="http://schemas.microsoft.com/office/word/2012/wordml" xmlns:w16cex="http://schemas.microsoft.com/office/word/2018/wordml/cex" xmlns:w16cid="http://schemas.microsoft.com/office/word/2016/wordml/cid" xmlns:w16="http://schemas.microsoft.com/office/word/2018/wordml" xmlns:w16du="http://schemas.microsoft.com/office/word/2023/wordml/word16du" xmlns:w16sdtdh="http://schemas.microsoft.com/office/word/2020/wordml/sdtdatahash" xmlns:w16sdtfl="http://schemas.microsoft.com/office/word/2024/wordml/sdtformatlock" xmlns:w16se="http://schemas.microsoft.com/office/word/2015/wordml/symex" mc:Ignorable="w14 w15 w16se w16cid w16 w16cex w16sdtdh w16sdtfl w16du">
+<w:styles xmlns:wp14="http://schemas.microsoft.com/office/word/2010/wordprocessingDrawing" xmlns:mc="http://schemas.openxmlformats.org/markup-compatibility/2006" xmlns:r="http://schemas.openxmlformats.org/officeDocument/2006/relationships" xmlns:w="http://schemas.openxmlformats.org/wordprocessingml/2006/main" xmlns:w14="http://schemas.microsoft.com/office/word/2010/wordml" xmlns:w15="http://schemas.microsoft.com/office/word/2012/wordml" xmlns:w16cex="http://schemas.microsoft.com/office/word/2018/wordml/cex" xmlns:w16cid="http://schemas.microsoft.com/office/word/2016/wordml/cid" xmlns:w16="http://schemas.microsoft.com/office/word/2018/wordml" xmlns:w16du="http://schemas.microsoft.com/office/word/2023/wordml/word16du" xmlns:w16sdtdh="http://schemas.microsoft.com/office/word/2020/wordml/sdtdatahash" xmlns:w16sdtfl="http://schemas.microsoft.com/office/word/2024/wordml/sdtformatlock" xmlns:w16se="http://schemas.microsoft.com/office/word/2015/wordml/symex" mc:Ignorable="w14 w15 w16se w16cid w16 w16cex w16sdtdh w16sdtfl w16du wp14">
   <w:docDefaults>
     <w:rPrDefault>
       <w:rPr>
-        <w:rFonts w:ascii="Arial" w:eastAsia="Arial" w:hAnsi="Arial" w:cs="Arial"/>
+        <w:rFonts w:ascii="Arial" w:hAnsi="Arial" w:eastAsia="Arial" w:cs="Arial"/>
         <w:sz w:val="22"/>
         <w:szCs w:val="22"/>
         <w:lang w:val="de-DE" w:eastAsia="de-DE" w:bidi="ar-SA"/>
@@ -1626,14 +1554,14 @@
   <w:latentStyles w:defLockedState="0" w:defUIPriority="99" w:defSemiHidden="0" w:defUnhideWhenUsed="0" w:defQFormat="0" w:count="376">
     <w:lsdException w:name="Normal" w:uiPriority="0" w:qFormat="1"/>
     <w:lsdException w:name="heading 1" w:uiPriority="9" w:qFormat="1"/>
-    <w:lsdException w:name="heading 2" w:semiHidden="1" w:uiPriority="9" w:unhideWhenUsed="1" w:qFormat="1"/>
-    <w:lsdException w:name="heading 3" w:semiHidden="1" w:uiPriority="9" w:unhideWhenUsed="1" w:qFormat="1"/>
-    <w:lsdException w:name="heading 4" w:semiHidden="1" w:uiPriority="9" w:unhideWhenUsed="1" w:qFormat="1"/>
-    <w:lsdException w:name="heading 5" w:semiHidden="1" w:uiPriority="9" w:unhideWhenUsed="1" w:qFormat="1"/>
-    <w:lsdException w:name="heading 6" w:semiHidden="1" w:uiPriority="9" w:unhideWhenUsed="1" w:qFormat="1"/>
-    <w:lsdException w:name="heading 7" w:semiHidden="1" w:uiPriority="9" w:unhideWhenUsed="1" w:qFormat="1"/>
-    <w:lsdException w:name="heading 8" w:semiHidden="1" w:uiPriority="9" w:unhideWhenUsed="1" w:qFormat="1"/>
-    <w:lsdException w:name="heading 9" w:semiHidden="1" w:uiPriority="9" w:unhideWhenUsed="1" w:qFormat="1"/>
+    <w:lsdException w:name="heading 2" w:uiPriority="9" w:semiHidden="1" w:unhideWhenUsed="1" w:qFormat="1"/>
+    <w:lsdException w:name="heading 3" w:uiPriority="9" w:semiHidden="1" w:unhideWhenUsed="1" w:qFormat="1"/>
+    <w:lsdException w:name="heading 4" w:uiPriority="9" w:semiHidden="1" w:unhideWhenUsed="1" w:qFormat="1"/>
+    <w:lsdException w:name="heading 5" w:uiPriority="9" w:semiHidden="1" w:unhideWhenUsed="1" w:qFormat="1"/>
+    <w:lsdException w:name="heading 6" w:uiPriority="9" w:semiHidden="1" w:unhideWhenUsed="1" w:qFormat="1"/>
+    <w:lsdException w:name="heading 7" w:uiPriority="9" w:semiHidden="1" w:unhideWhenUsed="1" w:qFormat="1"/>
+    <w:lsdException w:name="heading 8" w:uiPriority="9" w:semiHidden="1" w:unhideWhenUsed="1" w:qFormat="1"/>
+    <w:lsdException w:name="heading 9" w:uiPriority="9" w:semiHidden="1" w:unhideWhenUsed="1" w:qFormat="1"/>
     <w:lsdException w:name="index 1" w:semiHidden="1" w:unhideWhenUsed="1"/>
     <w:lsdException w:name="index 2" w:semiHidden="1" w:unhideWhenUsed="1"/>
     <w:lsdException w:name="index 3" w:semiHidden="1" w:unhideWhenUsed="1"/>
@@ -1643,22 +1571,22 @@
     <w:lsdException w:name="index 7" w:semiHidden="1" w:unhideWhenUsed="1"/>
     <w:lsdException w:name="index 8" w:semiHidden="1" w:unhideWhenUsed="1"/>
     <w:lsdException w:name="index 9" w:semiHidden="1" w:unhideWhenUsed="1"/>
-    <w:lsdException w:name="toc 1" w:semiHidden="1" w:uiPriority="39" w:unhideWhenUsed="1"/>
-    <w:lsdException w:name="toc 2" w:semiHidden="1" w:uiPriority="39" w:unhideWhenUsed="1"/>
-    <w:lsdException w:name="toc 3" w:semiHidden="1" w:uiPriority="39" w:unhideWhenUsed="1"/>
-    <w:lsdException w:name="toc 4" w:semiHidden="1" w:uiPriority="39" w:unhideWhenUsed="1"/>
-    <w:lsdException w:name="toc 5" w:semiHidden="1" w:uiPriority="39" w:unhideWhenUsed="1"/>
-    <w:lsdException w:name="toc 6" w:semiHidden="1" w:uiPriority="39" w:unhideWhenUsed="1"/>
-    <w:lsdException w:name="toc 7" w:semiHidden="1" w:uiPriority="39" w:unhideWhenUsed="1"/>
-    <w:lsdException w:name="toc 8" w:semiHidden="1" w:uiPriority="39" w:unhideWhenUsed="1"/>
-    <w:lsdException w:name="toc 9" w:semiHidden="1" w:uiPriority="39" w:unhideWhenUsed="1"/>
+    <w:lsdException w:name="toc 1" w:uiPriority="39" w:semiHidden="1" w:unhideWhenUsed="1"/>
+    <w:lsdException w:name="toc 2" w:uiPriority="39" w:semiHidden="1" w:unhideWhenUsed="1"/>
+    <w:lsdException w:name="toc 3" w:uiPriority="39" w:semiHidden="1" w:unhideWhenUsed="1"/>
+    <w:lsdException w:name="toc 4" w:uiPriority="39" w:semiHidden="1" w:unhideWhenUsed="1"/>
+    <w:lsdException w:name="toc 5" w:uiPriority="39" w:semiHidden="1" w:unhideWhenUsed="1"/>
+    <w:lsdException w:name="toc 6" w:uiPriority="39" w:semiHidden="1" w:unhideWhenUsed="1"/>
+    <w:lsdException w:name="toc 7" w:uiPriority="39" w:semiHidden="1" w:unhideWhenUsed="1"/>
+    <w:lsdException w:name="toc 8" w:uiPriority="39" w:semiHidden="1" w:unhideWhenUsed="1"/>
+    <w:lsdException w:name="toc 9" w:uiPriority="39" w:semiHidden="1" w:unhideWhenUsed="1"/>
     <w:lsdException w:name="Normal Indent" w:semiHidden="1" w:unhideWhenUsed="1"/>
     <w:lsdException w:name="footnote text" w:semiHidden="1" w:unhideWhenUsed="1"/>
     <w:lsdException w:name="annotation text" w:semiHidden="1" w:unhideWhenUsed="1"/>
     <w:lsdException w:name="header" w:semiHidden="1" w:unhideWhenUsed="1"/>
     <w:lsdException w:name="footer" w:semiHidden="1" w:unhideWhenUsed="1"/>
     <w:lsdException w:name="index heading" w:semiHidden="1" w:unhideWhenUsed="1"/>
-    <w:lsdException w:name="caption" w:semiHidden="1" w:uiPriority="35" w:unhideWhenUsed="1" w:qFormat="1"/>
+    <w:lsdException w:name="caption" w:uiPriority="35" w:semiHidden="1" w:unhideWhenUsed="1" w:qFormat="1"/>
     <w:lsdException w:name="table of figures" w:semiHidden="1" w:unhideWhenUsed="1"/>
     <w:lsdException w:name="envelope address" w:semiHidden="1" w:unhideWhenUsed="1"/>
     <w:lsdException w:name="envelope return" w:semiHidden="1" w:unhideWhenUsed="1"/>
@@ -1689,7 +1617,7 @@
     <w:lsdException w:name="Title" w:uiPriority="10" w:qFormat="1"/>
     <w:lsdException w:name="Closing" w:semiHidden="1" w:unhideWhenUsed="1"/>
     <w:lsdException w:name="Signature" w:semiHidden="1" w:unhideWhenUsed="1"/>
-    <w:lsdException w:name="Default Paragraph Font" w:semiHidden="1" w:uiPriority="1" w:unhideWhenUsed="1"/>
+    <w:lsdException w:name="Default Paragraph Font" w:uiPriority="1" w:semiHidden="1" w:unhideWhenUsed="1"/>
     <w:lsdException w:name="Body Text" w:semiHidden="1" w:unhideWhenUsed="1"/>
     <w:lsdException w:name="Body Text Indent" w:semiHidden="1" w:unhideWhenUsed="1"/>
     <w:lsdException w:name="List Continue" w:semiHidden="1" w:unhideWhenUsed="1"/>
@@ -1889,8 +1817,8 @@
     <w:lsdException w:name="Subtle Reference" w:uiPriority="31" w:qFormat="1"/>
     <w:lsdException w:name="Intense Reference" w:uiPriority="32" w:qFormat="1"/>
     <w:lsdException w:name="Book Title" w:uiPriority="33" w:qFormat="1"/>
-    <w:lsdException w:name="Bibliography" w:semiHidden="1" w:uiPriority="37" w:unhideWhenUsed="1"/>
-    <w:lsdException w:name="TOC Heading" w:semiHidden="1" w:uiPriority="39" w:unhideWhenUsed="1" w:qFormat="1"/>
+    <w:lsdException w:name="Bibliography" w:uiPriority="37" w:semiHidden="1" w:unhideWhenUsed="1"/>
+    <w:lsdException w:name="TOC Heading" w:uiPriority="39" w:semiHidden="1" w:unhideWhenUsed="1" w:qFormat="1"/>
     <w:lsdException w:name="Plain Table 1" w:uiPriority="41"/>
     <w:lsdException w:name="Plain Table 2" w:uiPriority="42"/>
     <w:lsdException w:name="Plain Table 3" w:uiPriority="43"/>
@@ -2001,7 +1929,7 @@
     <w:lsdException w:name="Unresolved Mention" w:semiHidden="1" w:unhideWhenUsed="1"/>
     <w:lsdException w:name="Smart Link" w:semiHidden="1" w:unhideWhenUsed="1"/>
   </w:latentStyles>
-  <w:style w:type="paragraph" w:default="1" w:styleId="Normal">
+  <w:style w:type="paragraph" w:styleId="Normal" w:default="1">
     <w:name w:val="Normal"/>
     <w:qFormat/>
     <w:rsid w:val="00EA3FD1"/>
@@ -2122,13 +2050,13 @@
       <w:szCs w:val="20"/>
     </w:rPr>
   </w:style>
-  <w:style w:type="character" w:default="1" w:styleId="DefaultParagraphFont">
+  <w:style w:type="character" w:styleId="DefaultParagraphFont" w:default="1">
     <w:name w:val="Default Paragraph Font"/>
     <w:uiPriority w:val="1"/>
     <w:semiHidden/>
     <w:unhideWhenUsed/>
   </w:style>
-  <w:style w:type="table" w:default="1" w:styleId="TableNormal">
+  <w:style w:type="table" w:styleId="TableNormal" w:default="1">
     <w:name w:val="Normal Table"/>
     <w:uiPriority w:val="99"/>
     <w:semiHidden/>
@@ -2143,13 +2071,13 @@
       </w:tblCellMar>
     </w:tblPr>
   </w:style>
-  <w:style w:type="numbering" w:default="1" w:styleId="NoList">
+  <w:style w:type="numbering" w:styleId="NoList" w:default="1">
     <w:name w:val="No List"/>
     <w:uiPriority w:val="99"/>
     <w:semiHidden/>
     <w:unhideWhenUsed/>
   </w:style>
-  <w:style w:type="table" w:customStyle="1" w:styleId="TableNormal1">
+  <w:style w:type="table" w:styleId="TableNormal1" w:customStyle="1">
     <w:name w:val="Table Normal1"/>
     <w:tblPr>
       <w:tblCellMar>
@@ -2191,7 +2119,7 @@
       </w:tabs>
     </w:pPr>
   </w:style>
-  <w:style w:type="character" w:customStyle="1" w:styleId="HeaderChar">
+  <w:style w:type="character" w:styleId="HeaderChar" w:customStyle="1">
     <w:name w:val="Header Char"/>
     <w:basedOn w:val="DefaultParagraphFont"/>
     <w:link w:val="Header"/>
@@ -2212,14 +2140,14 @@
       </w:tabs>
     </w:pPr>
   </w:style>
-  <w:style w:type="character" w:customStyle="1" w:styleId="FooterChar">
+  <w:style w:type="character" w:styleId="FooterChar" w:customStyle="1">
     <w:name w:val="Footer Char"/>
     <w:basedOn w:val="DefaultParagraphFont"/>
     <w:link w:val="Footer"/>
     <w:uiPriority w:val="99"/>
     <w:rsid w:val="00270B1B"/>
   </w:style>
-  <w:style w:type="paragraph" w:customStyle="1" w:styleId="201FO01Dokumentenhinweis">
+  <w:style w:type="paragraph" w:styleId="201FO01Dokumentenhinweis" w:customStyle="1">
     <w:name w:val="201FO01 Dokumentenhinweis"/>
     <w:basedOn w:val="Normal"/>
     <w:rsid w:val="00AB3E78"/>
@@ -2253,7 +2181,7 @@
       <w:contextualSpacing/>
     </w:pPr>
   </w:style>
-  <w:style w:type="paragraph" w:customStyle="1" w:styleId="contactitem">
+  <w:style w:type="paragraph" w:styleId="contactitem" w:customStyle="1">
     <w:name w:val="contactitem"/>
     <w:basedOn w:val="Normal"/>
     <w:rsid w:val="00D25753"/>
@@ -2261,17 +2189,17 @@
       <w:spacing w:before="100" w:beforeAutospacing="1" w:after="100" w:afterAutospacing="1" w:line="240" w:lineRule="auto"/>
     </w:pPr>
     <w:rPr>
-      <w:rFonts w:ascii="Times New Roman" w:eastAsia="Times New Roman" w:hAnsi="Times New Roman" w:cs="Times New Roman"/>
+      <w:rFonts w:ascii="Times New Roman" w:hAnsi="Times New Roman" w:eastAsia="Times New Roman" w:cs="Times New Roman"/>
       <w:sz w:val="24"/>
       <w:szCs w:val="24"/>
     </w:rPr>
   </w:style>
-  <w:style w:type="character" w:customStyle="1" w:styleId="key">
+  <w:style w:type="character" w:styleId="key" w:customStyle="1">
     <w:name w:val="key"/>
     <w:basedOn w:val="DefaultParagraphFont"/>
     <w:rsid w:val="00D25753"/>
   </w:style>
-  <w:style w:type="character" w:customStyle="1" w:styleId="value">
+  <w:style w:type="character" w:styleId="value" w:customStyle="1">
     <w:name w:val="value"/>
     <w:basedOn w:val="DefaultParagraphFont"/>
     <w:rsid w:val="00D25753"/>
@@ -2297,7 +2225,7 @@
       <w:spacing w:before="360" w:after="80"/>
     </w:pPr>
     <w:rPr>
-      <w:rFonts w:ascii="Georgia" w:eastAsia="Georgia" w:hAnsi="Georgia" w:cs="Georgia"/>
+      <w:rFonts w:ascii="Georgia" w:hAnsi="Georgia" w:eastAsia="Georgia" w:cs="Georgia"/>
       <w:i/>
       <w:color w:val="666666"/>
       <w:sz w:val="48"/>
@@ -2308,7 +2236,7 @@
 </file>
 
 <file path=word/theme/theme1.xml><?xml version="1.0" encoding="utf-8"?>
-<a:theme xmlns:a="http://schemas.openxmlformats.org/drawingml/2006/main" name="Office">
+<a:theme xmlns:a="http://schemas.openxmlformats.org/drawingml/2006/main" xmlns:thm15="http://schemas.microsoft.com/office/thememl/2012/main" name="Office">
   <a:themeElements>
     <a:clrScheme name="Office">
       <a:dk1>

</xml_diff>

<commit_message>
modify the model layout
</commit_message>
<xml_diff>
--- a/templates/model_1.docx
+++ b/templates/model_1.docx
@@ -19,14 +19,14 @@
       <w:pPr>
         <w:spacing w:after="280" w:line="240" w:lineRule="auto"/>
         <w:rPr>
-          <w:rFonts w:ascii="Times New Roman" w:hAnsi="Times New Roman" w:eastAsia="Times New Roman" w:cs="Times New Roman"/>
-          <w:sz w:val="24"/>
-          <w:szCs w:val="24"/>
-        </w:rPr>
-      </w:pPr>
-      <w:r>
-        <w:rPr>
-          <w:rFonts w:ascii="Times New Roman" w:hAnsi="Times New Roman" w:eastAsia="Times New Roman" w:cs="Times New Roman"/>
+          <w:rFonts w:ascii="Times New Roman" w:eastAsia="Times New Roman" w:hAnsi="Times New Roman" w:cs="Times New Roman"/>
+          <w:sz w:val="24"/>
+          <w:szCs w:val="24"/>
+        </w:rPr>
+      </w:pPr>
+      <w:r>
+        <w:rPr>
+          <w:rFonts w:ascii="Times New Roman" w:eastAsia="Times New Roman" w:hAnsi="Times New Roman" w:cs="Times New Roman"/>
           <w:b/>
           <w:sz w:val="24"/>
           <w:szCs w:val="24"/>
@@ -35,7 +35,7 @@
       </w:r>
       <w:r>
         <w:rPr>
-          <w:rFonts w:ascii="Times New Roman" w:hAnsi="Times New Roman" w:eastAsia="Times New Roman" w:cs="Times New Roman"/>
+          <w:rFonts w:ascii="Times New Roman" w:eastAsia="Times New Roman" w:hAnsi="Times New Roman" w:cs="Times New Roman"/>
           <w:sz w:val="24"/>
           <w:szCs w:val="24"/>
         </w:rPr>
@@ -43,7 +43,7 @@
       </w:r>
       <w:r>
         <w:rPr>
-          <w:rFonts w:ascii="Times New Roman" w:hAnsi="Times New Roman" w:eastAsia="Times New Roman" w:cs="Times New Roman"/>
+          <w:rFonts w:ascii="Times New Roman" w:eastAsia="Times New Roman" w:hAnsi="Times New Roman" w:cs="Times New Roman"/>
           <w:sz w:val="24"/>
           <w:szCs w:val="24"/>
         </w:rPr>
@@ -51,7 +51,7 @@
       </w:r>
       <w:r>
         <w:rPr>
-          <w:rFonts w:ascii="Times New Roman" w:hAnsi="Times New Roman" w:eastAsia="Times New Roman" w:cs="Times New Roman"/>
+          <w:rFonts w:ascii="Times New Roman" w:eastAsia="Times New Roman" w:hAnsi="Times New Roman" w:cs="Times New Roman"/>
           <w:b/>
           <w:bCs/>
           <w:sz w:val="24"/>
@@ -62,7 +62,7 @@
       <w:proofErr w:type="spellStart"/>
       <w:r>
         <w:rPr>
-          <w:rFonts w:ascii="Times New Roman" w:hAnsi="Times New Roman" w:eastAsia="Times New Roman" w:cs="Times New Roman"/>
+          <w:rFonts w:ascii="Times New Roman" w:eastAsia="Times New Roman" w:hAnsi="Times New Roman" w:cs="Times New Roman"/>
           <w:b/>
           <w:bCs/>
           <w:sz w:val="24"/>
@@ -73,7 +73,7 @@
       <w:proofErr w:type="spellEnd"/>
       <w:r>
         <w:rPr>
-          <w:rFonts w:ascii="Times New Roman" w:hAnsi="Times New Roman" w:eastAsia="Times New Roman" w:cs="Times New Roman"/>
+          <w:rFonts w:ascii="Times New Roman" w:eastAsia="Times New Roman" w:hAnsi="Times New Roman" w:cs="Times New Roman"/>
           <w:b/>
           <w:bCs/>
           <w:sz w:val="24"/>
@@ -83,7 +83,7 @@
       </w:r>
       <w:r>
         <w:rPr>
-          <w:rFonts w:ascii="Times New Roman" w:hAnsi="Times New Roman" w:eastAsia="Times New Roman" w:cs="Times New Roman"/>
+          <w:rFonts w:ascii="Times New Roman" w:eastAsia="Times New Roman" w:hAnsi="Times New Roman" w:cs="Times New Roman"/>
           <w:sz w:val="24"/>
           <w:szCs w:val="24"/>
         </w:rPr>
@@ -94,14 +94,14 @@
       <w:pPr>
         <w:spacing w:before="280" w:after="280" w:line="240" w:lineRule="auto"/>
         <w:rPr>
-          <w:rFonts w:ascii="Times New Roman" w:hAnsi="Times New Roman" w:eastAsia="Times New Roman" w:cs="Times New Roman"/>
-          <w:sz w:val="24"/>
-          <w:szCs w:val="24"/>
-        </w:rPr>
-      </w:pPr>
-      <w:r>
-        <w:rPr>
-          <w:rFonts w:ascii="Times New Roman" w:hAnsi="Times New Roman" w:eastAsia="Times New Roman" w:cs="Times New Roman"/>
+          <w:rFonts w:ascii="Times New Roman" w:eastAsia="Times New Roman" w:hAnsi="Times New Roman" w:cs="Times New Roman"/>
+          <w:sz w:val="24"/>
+          <w:szCs w:val="24"/>
+        </w:rPr>
+      </w:pPr>
+      <w:r>
+        <w:rPr>
+          <w:rFonts w:ascii="Times New Roman" w:eastAsia="Times New Roman" w:hAnsi="Times New Roman" w:cs="Times New Roman"/>
           <w:b/>
           <w:sz w:val="24"/>
           <w:szCs w:val="24"/>
@@ -110,7 +110,7 @@
       </w:r>
       <w:r>
         <w:rPr>
-          <w:rFonts w:ascii="Times New Roman" w:hAnsi="Times New Roman" w:eastAsia="Times New Roman" w:cs="Times New Roman"/>
+          <w:rFonts w:ascii="Times New Roman" w:eastAsia="Times New Roman" w:hAnsi="Times New Roman" w:cs="Times New Roman"/>
           <w:sz w:val="24"/>
           <w:szCs w:val="24"/>
         </w:rPr>
@@ -121,7 +121,7 @@
       <w:pPr>
         <w:spacing w:before="280" w:after="280" w:line="240" w:lineRule="auto"/>
         <w:rPr>
-          <w:rFonts w:ascii="Times New Roman" w:hAnsi="Times New Roman" w:eastAsia="Times New Roman" w:cs="Times New Roman"/>
+          <w:rFonts w:ascii="Times New Roman" w:eastAsia="Times New Roman" w:hAnsi="Times New Roman" w:cs="Times New Roman"/>
           <w:b/>
           <w:sz w:val="27"/>
           <w:szCs w:val="27"/>
@@ -129,7 +129,7 @@
       </w:pPr>
       <w:r>
         <w:rPr>
-          <w:rFonts w:ascii="Times New Roman" w:hAnsi="Times New Roman" w:eastAsia="Times New Roman" w:cs="Times New Roman"/>
+          <w:rFonts w:ascii="Times New Roman" w:eastAsia="Times New Roman" w:hAnsi="Times New Roman" w:cs="Times New Roman"/>
           <w:b/>
           <w:sz w:val="27"/>
           <w:szCs w:val="27"/>
@@ -141,14 +141,14 @@
       <w:pPr>
         <w:spacing w:before="280" w:after="280" w:line="240" w:lineRule="auto"/>
         <w:rPr>
-          <w:rFonts w:ascii="Times New Roman" w:hAnsi="Times New Roman" w:eastAsia="Times New Roman" w:cs="Times New Roman"/>
-          <w:sz w:val="24"/>
-          <w:szCs w:val="24"/>
-        </w:rPr>
-      </w:pPr>
-      <w:r>
-        <w:rPr>
-          <w:rFonts w:ascii="Times New Roman" w:hAnsi="Times New Roman" w:eastAsia="Times New Roman" w:cs="Times New Roman"/>
+          <w:rFonts w:ascii="Times New Roman" w:eastAsia="Times New Roman" w:hAnsi="Times New Roman" w:cs="Times New Roman"/>
+          <w:sz w:val="24"/>
+          <w:szCs w:val="24"/>
+        </w:rPr>
+      </w:pPr>
+      <w:r>
+        <w:rPr>
+          <w:rFonts w:ascii="Times New Roman" w:eastAsia="Times New Roman" w:hAnsi="Times New Roman" w:cs="Times New Roman"/>
           <w:b/>
           <w:sz w:val="24"/>
           <w:szCs w:val="24"/>
@@ -157,7 +157,7 @@
       </w:r>
       <w:r>
         <w:rPr>
-          <w:rFonts w:ascii="Times New Roman" w:hAnsi="Times New Roman" w:eastAsia="Times New Roman" w:cs="Times New Roman"/>
+          <w:rFonts w:ascii="Times New Roman" w:eastAsia="Times New Roman" w:hAnsi="Times New Roman" w:cs="Times New Roman"/>
           <w:sz w:val="24"/>
           <w:szCs w:val="24"/>
         </w:rPr>
@@ -172,14 +172,14 @@
         </w:numPr>
         <w:spacing w:before="280" w:after="0" w:line="240" w:lineRule="auto"/>
         <w:rPr>
-          <w:rFonts w:ascii="Times New Roman" w:hAnsi="Times New Roman" w:eastAsia="Times New Roman" w:cs="Times New Roman"/>
-          <w:sz w:val="24"/>
-          <w:szCs w:val="24"/>
-        </w:rPr>
-      </w:pPr>
-      <w:r>
-        <w:rPr>
-          <w:rFonts w:ascii="Times New Roman" w:hAnsi="Times New Roman" w:eastAsia="Times New Roman" w:cs="Times New Roman"/>
+          <w:rFonts w:ascii="Times New Roman" w:eastAsia="Times New Roman" w:hAnsi="Times New Roman" w:cs="Times New Roman"/>
+          <w:sz w:val="24"/>
+          <w:szCs w:val="24"/>
+        </w:rPr>
+      </w:pPr>
+      <w:r>
+        <w:rPr>
+          <w:rFonts w:ascii="Times New Roman" w:eastAsia="Times New Roman" w:hAnsi="Times New Roman" w:cs="Times New Roman"/>
           <w:b/>
           <w:sz w:val="24"/>
           <w:szCs w:val="24"/>
@@ -188,7 +188,7 @@
       </w:r>
       <w:r>
         <w:rPr>
-          <w:rFonts w:ascii="Times New Roman" w:hAnsi="Times New Roman" w:eastAsia="Times New Roman" w:cs="Times New Roman"/>
+          <w:rFonts w:ascii="Times New Roman" w:eastAsia="Times New Roman" w:hAnsi="Times New Roman" w:cs="Times New Roman"/>
           <w:sz w:val="24"/>
           <w:szCs w:val="24"/>
         </w:rPr>
@@ -203,14 +203,14 @@
         </w:numPr>
         <w:spacing w:after="280" w:line="240" w:lineRule="auto"/>
         <w:rPr>
-          <w:rFonts w:ascii="Times New Roman" w:hAnsi="Times New Roman" w:eastAsia="Times New Roman" w:cs="Times New Roman"/>
-          <w:sz w:val="24"/>
-          <w:szCs w:val="24"/>
-        </w:rPr>
-      </w:pPr>
-      <w:r>
-        <w:rPr>
-          <w:rFonts w:ascii="Times New Roman" w:hAnsi="Times New Roman" w:eastAsia="Times New Roman" w:cs="Times New Roman"/>
+          <w:rFonts w:ascii="Times New Roman" w:eastAsia="Times New Roman" w:hAnsi="Times New Roman" w:cs="Times New Roman"/>
+          <w:sz w:val="24"/>
+          <w:szCs w:val="24"/>
+        </w:rPr>
+      </w:pPr>
+      <w:r>
+        <w:rPr>
+          <w:rFonts w:ascii="Times New Roman" w:eastAsia="Times New Roman" w:hAnsi="Times New Roman" w:cs="Times New Roman"/>
           <w:b/>
           <w:sz w:val="24"/>
           <w:szCs w:val="24"/>
@@ -219,7 +219,7 @@
       </w:r>
       <w:r>
         <w:rPr>
-          <w:rFonts w:ascii="Times New Roman" w:hAnsi="Times New Roman" w:eastAsia="Times New Roman" w:cs="Times New Roman"/>
+          <w:rFonts w:ascii="Times New Roman" w:eastAsia="Times New Roman" w:hAnsi="Times New Roman" w:cs="Times New Roman"/>
           <w:sz w:val="24"/>
           <w:szCs w:val="24"/>
         </w:rPr>
@@ -230,14 +230,14 @@
       <w:pPr>
         <w:spacing w:before="280" w:after="280" w:line="240" w:lineRule="auto"/>
         <w:rPr>
-          <w:rFonts w:ascii="Times New Roman" w:hAnsi="Times New Roman" w:eastAsia="Times New Roman" w:cs="Times New Roman"/>
-          <w:sz w:val="24"/>
-          <w:szCs w:val="24"/>
-        </w:rPr>
-      </w:pPr>
-      <w:r>
-        <w:rPr>
-          <w:rFonts w:ascii="Times New Roman" w:hAnsi="Times New Roman" w:eastAsia="Times New Roman" w:cs="Times New Roman"/>
+          <w:rFonts w:ascii="Times New Roman" w:eastAsia="Times New Roman" w:hAnsi="Times New Roman" w:cs="Times New Roman"/>
+          <w:sz w:val="24"/>
+          <w:szCs w:val="24"/>
+        </w:rPr>
+      </w:pPr>
+      <w:r>
+        <w:rPr>
+          <w:rFonts w:ascii="Times New Roman" w:eastAsia="Times New Roman" w:hAnsi="Times New Roman" w:cs="Times New Roman"/>
           <w:b/>
           <w:sz w:val="24"/>
           <w:szCs w:val="24"/>
@@ -246,7 +246,7 @@
       </w:r>
       <w:r>
         <w:rPr>
-          <w:rFonts w:ascii="Times New Roman" w:hAnsi="Times New Roman" w:eastAsia="Times New Roman" w:cs="Times New Roman"/>
+          <w:rFonts w:ascii="Times New Roman" w:eastAsia="Times New Roman" w:hAnsi="Times New Roman" w:cs="Times New Roman"/>
           <w:sz w:val="24"/>
           <w:szCs w:val="24"/>
         </w:rPr>
@@ -261,14 +261,14 @@
         </w:numPr>
         <w:spacing w:before="280" w:after="0" w:line="240" w:lineRule="auto"/>
         <w:rPr>
-          <w:rFonts w:ascii="Times New Roman" w:hAnsi="Times New Roman" w:eastAsia="Times New Roman" w:cs="Times New Roman"/>
-          <w:sz w:val="24"/>
-          <w:szCs w:val="24"/>
-        </w:rPr>
-      </w:pPr>
-      <w:r>
-        <w:rPr>
-          <w:rFonts w:ascii="Times New Roman" w:hAnsi="Times New Roman" w:eastAsia="Times New Roman" w:cs="Times New Roman"/>
+          <w:rFonts w:ascii="Times New Roman" w:eastAsia="Times New Roman" w:hAnsi="Times New Roman" w:cs="Times New Roman"/>
+          <w:sz w:val="24"/>
+          <w:szCs w:val="24"/>
+        </w:rPr>
+      </w:pPr>
+      <w:r>
+        <w:rPr>
+          <w:rFonts w:ascii="Times New Roman" w:eastAsia="Times New Roman" w:hAnsi="Times New Roman" w:cs="Times New Roman"/>
           <w:b/>
           <w:sz w:val="24"/>
           <w:szCs w:val="24"/>
@@ -277,7 +277,7 @@
       </w:r>
       <w:r>
         <w:rPr>
-          <w:rFonts w:ascii="Times New Roman" w:hAnsi="Times New Roman" w:eastAsia="Times New Roman" w:cs="Times New Roman"/>
+          <w:rFonts w:ascii="Times New Roman" w:eastAsia="Times New Roman" w:hAnsi="Times New Roman" w:cs="Times New Roman"/>
           <w:sz w:val="24"/>
           <w:szCs w:val="24"/>
         </w:rPr>
@@ -292,14 +292,14 @@
         </w:numPr>
         <w:spacing w:after="0" w:line="240" w:lineRule="auto"/>
         <w:rPr>
-          <w:rFonts w:ascii="Times New Roman" w:hAnsi="Times New Roman" w:eastAsia="Times New Roman" w:cs="Times New Roman"/>
-          <w:sz w:val="24"/>
-          <w:szCs w:val="24"/>
-        </w:rPr>
-      </w:pPr>
-      <w:r>
-        <w:rPr>
-          <w:rFonts w:ascii="Times New Roman" w:hAnsi="Times New Roman" w:eastAsia="Times New Roman" w:cs="Times New Roman"/>
+          <w:rFonts w:ascii="Times New Roman" w:eastAsia="Times New Roman" w:hAnsi="Times New Roman" w:cs="Times New Roman"/>
+          <w:sz w:val="24"/>
+          <w:szCs w:val="24"/>
+        </w:rPr>
+      </w:pPr>
+      <w:r>
+        <w:rPr>
+          <w:rFonts w:ascii="Times New Roman" w:eastAsia="Times New Roman" w:hAnsi="Times New Roman" w:cs="Times New Roman"/>
           <w:b/>
           <w:sz w:val="24"/>
           <w:szCs w:val="24"/>
@@ -308,7 +308,7 @@
       </w:r>
       <w:r>
         <w:rPr>
-          <w:rFonts w:ascii="Times New Roman" w:hAnsi="Times New Roman" w:eastAsia="Times New Roman" w:cs="Times New Roman"/>
+          <w:rFonts w:ascii="Times New Roman" w:eastAsia="Times New Roman" w:hAnsi="Times New Roman" w:cs="Times New Roman"/>
           <w:sz w:val="24"/>
           <w:szCs w:val="24"/>
         </w:rPr>
@@ -323,14 +323,14 @@
         </w:numPr>
         <w:spacing w:after="280" w:line="240" w:lineRule="auto"/>
         <w:rPr>
-          <w:rFonts w:ascii="Times New Roman" w:hAnsi="Times New Roman" w:eastAsia="Times New Roman" w:cs="Times New Roman"/>
-          <w:sz w:val="24"/>
-          <w:szCs w:val="24"/>
-        </w:rPr>
-      </w:pPr>
-      <w:r>
-        <w:rPr>
-          <w:rFonts w:ascii="Times New Roman" w:hAnsi="Times New Roman" w:eastAsia="Times New Roman" w:cs="Times New Roman"/>
+          <w:rFonts w:ascii="Times New Roman" w:eastAsia="Times New Roman" w:hAnsi="Times New Roman" w:cs="Times New Roman"/>
+          <w:sz w:val="24"/>
+          <w:szCs w:val="24"/>
+        </w:rPr>
+      </w:pPr>
+      <w:r>
+        <w:rPr>
+          <w:rFonts w:ascii="Times New Roman" w:eastAsia="Times New Roman" w:hAnsi="Times New Roman" w:cs="Times New Roman"/>
           <w:b/>
           <w:sz w:val="24"/>
           <w:szCs w:val="24"/>
@@ -339,7 +339,7 @@
       </w:r>
       <w:r>
         <w:rPr>
-          <w:rFonts w:ascii="Times New Roman" w:hAnsi="Times New Roman" w:eastAsia="Times New Roman" w:cs="Times New Roman"/>
+          <w:rFonts w:ascii="Times New Roman" w:eastAsia="Times New Roman" w:hAnsi="Times New Roman" w:cs="Times New Roman"/>
           <w:sz w:val="24"/>
           <w:szCs w:val="24"/>
         </w:rPr>
@@ -350,14 +350,14 @@
       <w:pPr>
         <w:spacing w:before="280" w:after="280" w:line="240" w:lineRule="auto"/>
         <w:rPr>
-          <w:rFonts w:ascii="Times New Roman" w:hAnsi="Times New Roman" w:eastAsia="Times New Roman" w:cs="Times New Roman"/>
-          <w:sz w:val="24"/>
-          <w:szCs w:val="24"/>
-        </w:rPr>
-      </w:pPr>
-      <w:r>
-        <w:rPr>
-          <w:rFonts w:ascii="Times New Roman" w:hAnsi="Times New Roman" w:eastAsia="Times New Roman" w:cs="Times New Roman"/>
+          <w:rFonts w:ascii="Times New Roman" w:eastAsia="Times New Roman" w:hAnsi="Times New Roman" w:cs="Times New Roman"/>
+          <w:sz w:val="24"/>
+          <w:szCs w:val="24"/>
+        </w:rPr>
+      </w:pPr>
+      <w:r>
+        <w:rPr>
+          <w:rFonts w:ascii="Times New Roman" w:eastAsia="Times New Roman" w:hAnsi="Times New Roman" w:cs="Times New Roman"/>
           <w:b/>
           <w:sz w:val="24"/>
           <w:szCs w:val="24"/>
@@ -366,7 +366,7 @@
       </w:r>
       <w:r>
         <w:rPr>
-          <w:rFonts w:ascii="Times New Roman" w:hAnsi="Times New Roman" w:eastAsia="Times New Roman" w:cs="Times New Roman"/>
+          <w:rFonts w:ascii="Times New Roman" w:eastAsia="Times New Roman" w:hAnsi="Times New Roman" w:cs="Times New Roman"/>
           <w:sz w:val="24"/>
           <w:szCs w:val="24"/>
         </w:rPr>
@@ -381,14 +381,14 @@
         </w:numPr>
         <w:spacing w:before="280" w:after="0" w:line="240" w:lineRule="auto"/>
         <w:rPr>
-          <w:rFonts w:ascii="Times New Roman" w:hAnsi="Times New Roman" w:eastAsia="Times New Roman" w:cs="Times New Roman"/>
-          <w:sz w:val="24"/>
-          <w:szCs w:val="24"/>
-        </w:rPr>
-      </w:pPr>
-      <w:r>
-        <w:rPr>
-          <w:rFonts w:ascii="Times New Roman" w:hAnsi="Times New Roman" w:eastAsia="Times New Roman" w:cs="Times New Roman"/>
+          <w:rFonts w:ascii="Times New Roman" w:eastAsia="Times New Roman" w:hAnsi="Times New Roman" w:cs="Times New Roman"/>
+          <w:sz w:val="24"/>
+          <w:szCs w:val="24"/>
+        </w:rPr>
+      </w:pPr>
+      <w:r>
+        <w:rPr>
+          <w:rFonts w:ascii="Times New Roman" w:eastAsia="Times New Roman" w:hAnsi="Times New Roman" w:cs="Times New Roman"/>
           <w:b/>
           <w:sz w:val="24"/>
           <w:szCs w:val="24"/>
@@ -397,7 +397,7 @@
       </w:r>
       <w:r>
         <w:rPr>
-          <w:rFonts w:ascii="Times New Roman" w:hAnsi="Times New Roman" w:eastAsia="Times New Roman" w:cs="Times New Roman"/>
+          <w:rFonts w:ascii="Times New Roman" w:eastAsia="Times New Roman" w:hAnsi="Times New Roman" w:cs="Times New Roman"/>
           <w:sz w:val="24"/>
           <w:szCs w:val="24"/>
         </w:rPr>
@@ -412,23 +412,24 @@
         </w:numPr>
         <w:spacing w:after="0" w:line="240" w:lineRule="auto"/>
         <w:rPr>
-          <w:rFonts w:ascii="Times New Roman" w:hAnsi="Times New Roman" w:eastAsia="Times New Roman" w:cs="Times New Roman"/>
-          <w:sz w:val="24"/>
-          <w:szCs w:val="24"/>
-        </w:rPr>
-      </w:pPr>
-      <w:r>
-        <w:rPr>
-          <w:rFonts w:ascii="Times New Roman" w:hAnsi="Times New Roman" w:eastAsia="Times New Roman" w:cs="Times New Roman"/>
+          <w:rFonts w:ascii="Times New Roman" w:eastAsia="Times New Roman" w:hAnsi="Times New Roman" w:cs="Times New Roman"/>
+          <w:sz w:val="24"/>
+          <w:szCs w:val="24"/>
+        </w:rPr>
+      </w:pPr>
+      <w:r>
+        <w:rPr>
+          <w:rFonts w:ascii="Times New Roman" w:eastAsia="Times New Roman" w:hAnsi="Times New Roman" w:cs="Times New Roman"/>
           <w:b/>
           <w:sz w:val="24"/>
           <w:szCs w:val="24"/>
         </w:rPr>
+        <w:lastRenderedPageBreak/>
         <w:t>Teamarbeit und Kommunikation:</w:t>
       </w:r>
       <w:r>
         <w:rPr>
-          <w:rFonts w:ascii="Times New Roman" w:hAnsi="Times New Roman" w:eastAsia="Times New Roman" w:cs="Times New Roman"/>
+          <w:rFonts w:ascii="Times New Roman" w:eastAsia="Times New Roman" w:hAnsi="Times New Roman" w:cs="Times New Roman"/>
           <w:sz w:val="24"/>
           <w:szCs w:val="24"/>
         </w:rPr>
@@ -443,14 +444,14 @@
         </w:numPr>
         <w:spacing w:after="280" w:line="240" w:lineRule="auto"/>
         <w:rPr>
-          <w:rFonts w:ascii="Times New Roman" w:hAnsi="Times New Roman" w:eastAsia="Times New Roman" w:cs="Times New Roman"/>
-          <w:sz w:val="24"/>
-          <w:szCs w:val="24"/>
-        </w:rPr>
-      </w:pPr>
-      <w:r>
-        <w:rPr>
-          <w:rFonts w:ascii="Times New Roman" w:hAnsi="Times New Roman" w:eastAsia="Times New Roman" w:cs="Times New Roman"/>
+          <w:rFonts w:ascii="Times New Roman" w:eastAsia="Times New Roman" w:hAnsi="Times New Roman" w:cs="Times New Roman"/>
+          <w:sz w:val="24"/>
+          <w:szCs w:val="24"/>
+        </w:rPr>
+      </w:pPr>
+      <w:r>
+        <w:rPr>
+          <w:rFonts w:ascii="Times New Roman" w:eastAsia="Times New Roman" w:hAnsi="Times New Roman" w:cs="Times New Roman"/>
           <w:b/>
           <w:sz w:val="24"/>
           <w:szCs w:val="24"/>
@@ -459,26 +460,18 @@
       </w:r>
       <w:r>
         <w:rPr>
-          <w:rFonts w:ascii="Times New Roman" w:hAnsi="Times New Roman" w:eastAsia="Times New Roman" w:cs="Times New Roman"/>
-          <w:sz w:val="24"/>
-          <w:szCs w:val="24"/>
-        </w:rPr>
-        <w:t xml:space="preserve"> Wir unterstützen unsere Mitarbeiter dabei, eine gesunde Balance zwischen Arbeit und Privatleben zu finden. Flexible Arbeitszeiten und ein fairer </w:t>
-      </w:r>
-      <w:r>
-        <w:rPr>
-          <w:rFonts w:ascii="Times New Roman" w:hAnsi="Times New Roman" w:eastAsia="Times New Roman" w:cs="Times New Roman"/>
-          <w:sz w:val="24"/>
-          <w:szCs w:val="24"/>
-        </w:rPr>
-        <w:t>Ausgleich von Arbeitsbelastungen tragen dazu bei, die Motivation und Zufriedenheit unserer Mitarbeiter zu erhöhen.</w:t>
+          <w:rFonts w:ascii="Times New Roman" w:eastAsia="Times New Roman" w:hAnsi="Times New Roman" w:cs="Times New Roman"/>
+          <w:sz w:val="24"/>
+          <w:szCs w:val="24"/>
+        </w:rPr>
+        <w:t xml:space="preserve"> Wir unterstützen unsere Mitarbeiter dabei, eine gesunde Balance zwischen Arbeit und Privatleben zu finden. Flexible Arbeitszeiten und ein fairer Ausgleich von Arbeitsbelastungen tragen dazu bei, die Motivation und Zufriedenheit unserer Mitarbeiter zu erhöhen.</w:t>
       </w:r>
     </w:p>
     <w:p>
       <w:pPr>
         <w:spacing w:before="280" w:after="280" w:line="240" w:lineRule="auto"/>
         <w:rPr>
-          <w:rFonts w:ascii="Times New Roman" w:hAnsi="Times New Roman" w:eastAsia="Times New Roman" w:cs="Times New Roman"/>
+          <w:rFonts w:ascii="Times New Roman" w:eastAsia="Times New Roman" w:hAnsi="Times New Roman" w:cs="Times New Roman"/>
           <w:b/>
           <w:sz w:val="27"/>
           <w:szCs w:val="27"/>
@@ -486,7 +479,7 @@
       </w:pPr>
       <w:r>
         <w:rPr>
-          <w:rFonts w:ascii="Times New Roman" w:hAnsi="Times New Roman" w:eastAsia="Times New Roman" w:cs="Times New Roman"/>
+          <w:rFonts w:ascii="Times New Roman" w:eastAsia="Times New Roman" w:hAnsi="Times New Roman" w:cs="Times New Roman"/>
           <w:b/>
           <w:sz w:val="27"/>
           <w:szCs w:val="27"/>
@@ -498,14 +491,14 @@
       <w:pPr>
         <w:spacing w:before="280" w:after="280" w:line="240" w:lineRule="auto"/>
         <w:rPr>
-          <w:rFonts w:ascii="Times New Roman" w:hAnsi="Times New Roman" w:eastAsia="Times New Roman" w:cs="Times New Roman"/>
-          <w:sz w:val="24"/>
-          <w:szCs w:val="24"/>
-        </w:rPr>
-      </w:pPr>
-      <w:r>
-        <w:rPr>
-          <w:rFonts w:ascii="Times New Roman" w:hAnsi="Times New Roman" w:eastAsia="Times New Roman" w:cs="Times New Roman"/>
+          <w:rFonts w:ascii="Times New Roman" w:eastAsia="Times New Roman" w:hAnsi="Times New Roman" w:cs="Times New Roman"/>
+          <w:sz w:val="24"/>
+          <w:szCs w:val="24"/>
+        </w:rPr>
+      </w:pPr>
+      <w:r>
+        <w:rPr>
+          <w:rFonts w:ascii="Times New Roman" w:eastAsia="Times New Roman" w:hAnsi="Times New Roman" w:cs="Times New Roman"/>
           <w:sz w:val="24"/>
           <w:szCs w:val="24"/>
         </w:rPr>
@@ -514,7 +507,7 @@
       <w:proofErr w:type="spellStart"/>
       <w:r>
         <w:rPr>
-          <w:rFonts w:ascii="Times New Roman" w:hAnsi="Times New Roman" w:eastAsia="Times New Roman" w:cs="Times New Roman"/>
+          <w:rFonts w:ascii="Times New Roman" w:eastAsia="Times New Roman" w:hAnsi="Times New Roman" w:cs="Times New Roman"/>
           <w:sz w:val="24"/>
           <w:szCs w:val="24"/>
         </w:rPr>
@@ -523,7 +516,7 @@
       <w:proofErr w:type="spellEnd"/>
       <w:r>
         <w:rPr>
-          <w:rFonts w:ascii="Times New Roman" w:hAnsi="Times New Roman" w:eastAsia="Times New Roman" w:cs="Times New Roman"/>
+          <w:rFonts w:ascii="Times New Roman" w:eastAsia="Times New Roman" w:hAnsi="Times New Roman" w:cs="Times New Roman"/>
           <w:sz w:val="24"/>
           <w:szCs w:val="24"/>
         </w:rPr>
@@ -531,7 +524,7 @@
       </w:r>
       <w:r>
         <w:rPr>
-          <w:rFonts w:ascii="Times New Roman" w:hAnsi="Times New Roman" w:eastAsia="Times New Roman" w:cs="Times New Roman"/>
+          <w:rFonts w:ascii="Times New Roman" w:eastAsia="Times New Roman" w:hAnsi="Times New Roman" w:cs="Times New Roman"/>
           <w:sz w:val="24"/>
           <w:szCs w:val="24"/>
         </w:rPr>
@@ -539,7 +532,7 @@
       </w:r>
       <w:r>
         <w:rPr>
-          <w:rFonts w:ascii="Times New Roman" w:hAnsi="Times New Roman" w:eastAsia="Times New Roman" w:cs="Times New Roman"/>
+          <w:rFonts w:ascii="Times New Roman" w:eastAsia="Times New Roman" w:hAnsi="Times New Roman" w:cs="Times New Roman"/>
           <w:sz w:val="24"/>
           <w:szCs w:val="24"/>
         </w:rPr>
@@ -547,7 +540,7 @@
       </w:r>
       <w:r>
         <w:rPr>
-          <w:rFonts w:ascii="Times New Roman" w:hAnsi="Times New Roman" w:eastAsia="Times New Roman" w:cs="Times New Roman"/>
+          <w:rFonts w:ascii="Times New Roman" w:eastAsia="Times New Roman" w:hAnsi="Times New Roman" w:cs="Times New Roman"/>
           <w:sz w:val="24"/>
           <w:szCs w:val="24"/>
         </w:rPr>
@@ -558,14 +551,14 @@
       <w:pPr>
         <w:spacing w:before="280" w:after="280" w:line="240" w:lineRule="auto"/>
         <w:rPr>
-          <w:rFonts w:ascii="Times New Roman" w:hAnsi="Times New Roman" w:eastAsia="Times New Roman" w:cs="Times New Roman"/>
-          <w:sz w:val="24"/>
-          <w:szCs w:val="24"/>
-        </w:rPr>
-      </w:pPr>
-      <w:r>
-        <w:rPr>
-          <w:rFonts w:ascii="Times New Roman" w:hAnsi="Times New Roman" w:eastAsia="Times New Roman" w:cs="Times New Roman"/>
+          <w:rFonts w:ascii="Times New Roman" w:eastAsia="Times New Roman" w:hAnsi="Times New Roman" w:cs="Times New Roman"/>
+          <w:sz w:val="24"/>
+          <w:szCs w:val="24"/>
+        </w:rPr>
+      </w:pPr>
+      <w:r>
+        <w:rPr>
+          <w:rFonts w:ascii="Times New Roman" w:eastAsia="Times New Roman" w:hAnsi="Times New Roman" w:cs="Times New Roman"/>
           <w:sz w:val="24"/>
           <w:szCs w:val="24"/>
         </w:rPr>
@@ -589,9 +582,13 @@
       </w:pPr>
     </w:p>
     <w:sectPr>
-      <w:headerReference w:type="default" r:id="rId9"/>
-      <w:footerReference w:type="default" r:id="rId10"/>
-      <w:pgSz w:w="11906" w:h="16838" w:orient="portrait"/>
+      <w:headerReference w:type="even" r:id="rId9"/>
+      <w:headerReference w:type="default" r:id="rId10"/>
+      <w:footerReference w:type="even" r:id="rId11"/>
+      <w:footerReference w:type="default" r:id="rId12"/>
+      <w:headerReference w:type="first" r:id="rId13"/>
+      <w:footerReference w:type="first" r:id="rId14"/>
+      <w:pgSz w:w="11906" w:h="16838"/>
       <w:pgMar w:top="1701" w:right="1418" w:bottom="1701" w:left="1418" w:header="709" w:footer="709" w:gutter="0"/>
       <w:pgNumType w:start="1"/>
       <w:cols w:space="720"/>
@@ -626,14 +623,24 @@
 </file>
 
 <file path=word/footer1.xml><?xml version="1.0" encoding="utf-8"?>
-<w:ftr xmlns:wpc="http://schemas.microsoft.com/office/word/2010/wordprocessingCanvas" xmlns:cx="http://schemas.microsoft.com/office/drawing/2014/chartex" xmlns:cx1="http://schemas.microsoft.com/office/drawing/2015/9/8/chartex" xmlns:cx2="http://schemas.microsoft.com/office/drawing/2015/10/21/chartex" xmlns:cx3="http://schemas.microsoft.com/office/drawing/2016/5/9/chartex" xmlns:cx4="http://schemas.microsoft.com/office/drawing/2016/5/10/chartex" xmlns:cx5="http://schemas.microsoft.com/office/drawing/2016/5/11/chartex" xmlns:cx6="http://schemas.microsoft.com/office/drawing/2016/5/12/chartex" xmlns:cx7="http://schemas.microsoft.com/office/drawing/2016/5/13/chartex" xmlns:cx8="http://schemas.microsoft.com/office/drawing/2016/5/14/chartex" xmlns:mc="http://schemas.openxmlformats.org/markup-compatibility/2006" xmlns:aink="http://schemas.microsoft.com/office/drawing/2016/ink" xmlns:am3d="http://schemas.microsoft.com/office/drawing/2017/model3d" xmlns:o="urn:schemas-microsoft-com:office:office" xmlns:oel="http://schemas.microsoft.com/office/2019/extlst" xmlns:r="http://schemas.openxmlformats.org/officeDocument/2006/relationships" xmlns:m="http://schemas.openxmlformats.org/officeDocument/2006/math" xmlns:v="urn:schemas-microsoft-com:vml" xmlns:wp14="http://schemas.microsoft.com/office/word/2010/wordprocessingDrawing" xmlns:wp="http://schemas.openxmlformats.org/drawingml/2006/wordprocessingDrawing" xmlns:w10="urn:schemas-microsoft-com:office:word" xmlns:w="http://schemas.openxmlformats.org/wordprocessingml/2006/main" xmlns:w14="http://schemas.microsoft.com/office/word/2010/wordml" xmlns:w15="http://schemas.microsoft.com/office/word/2012/wordml" xmlns:w16cex="http://schemas.microsoft.com/office/word/2018/wordml/cex" xmlns:w16cid="http://schemas.microsoft.com/office/word/2016/wordml/cid" xmlns:w16="http://schemas.microsoft.com/office/word/2018/wordml" xmlns:w16du="http://schemas.microsoft.com/office/word/2023/wordml/word16du" xmlns:w16sdtdh="http://schemas.microsoft.com/office/word/2020/wordml/sdtdatahash" xmlns:w16sdtfl="http://schemas.microsoft.com/office/word/2024/wordml/sdtformatlock" xmlns:w16se="http://schemas.microsoft.com/office/word/2015/wordml/symex" xmlns:wpg="http://schemas.microsoft.com/office/word/2010/wordprocessingGroup" xmlns:wpi="http://schemas.microsoft.com/office/word/2010/wordprocessingInk" xmlns:wne="http://schemas.microsoft.com/office/word/2006/wordml" xmlns:wps="http://schemas.microsoft.com/office/word/2010/wordprocessingShape" xmlns:a="http://schemas.openxmlformats.org/drawingml/2006/main" mc:Ignorable="w14 w15 w16se w16cid w16 w16cex w16sdtdh w16sdtfl w16du wp14">
-  <w:bookmarkStart w:name="_Hlk167319170" w:id="0"/>
-  <w:bookmarkStart w:name="_Hlk167319171" w:id="1"/>
+<w:ftr xmlns:wpc="http://schemas.microsoft.com/office/word/2010/wordprocessingCanvas" xmlns:cx="http://schemas.microsoft.com/office/drawing/2014/chartex" xmlns:cx1="http://schemas.microsoft.com/office/drawing/2015/9/8/chartex" xmlns:cx2="http://schemas.microsoft.com/office/drawing/2015/10/21/chartex" xmlns:cx3="http://schemas.microsoft.com/office/drawing/2016/5/9/chartex" xmlns:cx4="http://schemas.microsoft.com/office/drawing/2016/5/10/chartex" xmlns:cx5="http://schemas.microsoft.com/office/drawing/2016/5/11/chartex" xmlns:cx6="http://schemas.microsoft.com/office/drawing/2016/5/12/chartex" xmlns:cx7="http://schemas.microsoft.com/office/drawing/2016/5/13/chartex" xmlns:cx8="http://schemas.microsoft.com/office/drawing/2016/5/14/chartex" xmlns:mc="http://schemas.openxmlformats.org/markup-compatibility/2006" xmlns:aink="http://schemas.microsoft.com/office/drawing/2016/ink" xmlns:am3d="http://schemas.microsoft.com/office/drawing/2017/model3d" xmlns:o="urn:schemas-microsoft-com:office:office" xmlns:oel="http://schemas.microsoft.com/office/2019/extlst" xmlns:r="http://schemas.openxmlformats.org/officeDocument/2006/relationships" xmlns:m="http://schemas.openxmlformats.org/officeDocument/2006/math" xmlns:v="urn:schemas-microsoft-com:vml" xmlns:wp14="http://schemas.microsoft.com/office/word/2010/wordprocessingDrawing" xmlns:wp="http://schemas.openxmlformats.org/drawingml/2006/wordprocessingDrawing" xmlns:w10="urn:schemas-microsoft-com:office:word" xmlns:w="http://schemas.openxmlformats.org/wordprocessingml/2006/main" xmlns:w14="http://schemas.microsoft.com/office/word/2010/wordml" xmlns:w15="http://schemas.microsoft.com/office/word/2012/wordml" xmlns:w16cex="http://schemas.microsoft.com/office/word/2018/wordml/cex" xmlns:w16cid="http://schemas.microsoft.com/office/word/2016/wordml/cid" xmlns:w16="http://schemas.microsoft.com/office/word/2018/wordml" xmlns:w16du="http://schemas.microsoft.com/office/word/2023/wordml/word16du" xmlns:w16sdtdh="http://schemas.microsoft.com/office/word/2020/wordml/sdtdatahash" xmlns:w16sdtfl="http://schemas.microsoft.com/office/word/2024/wordml/sdtformatlock" xmlns:w16se="http://schemas.microsoft.com/office/word/2015/wordml/symex" xmlns:wpg="http://schemas.microsoft.com/office/word/2010/wordprocessingGroup" xmlns:wpi="http://schemas.microsoft.com/office/word/2010/wordprocessingInk" xmlns:wne="http://schemas.microsoft.com/office/word/2006/wordml" xmlns:wps="http://schemas.microsoft.com/office/word/2010/wordprocessingShape" mc:Ignorable="w14 w15 w16se w16cid w16 w16cex w16sdtdh w16sdtfl w16du wp14">
+  <w:p>
+    <w:pPr>
+      <w:pStyle w:val="Footer"/>
+    </w:pPr>
+  </w:p>
+</w:ftr>
+</file>
+
+<file path=word/footer2.xml><?xml version="1.0" encoding="utf-8"?>
+<w:ftr xmlns:wpc="http://schemas.microsoft.com/office/word/2010/wordprocessingCanvas" xmlns:cx="http://schemas.microsoft.com/office/drawing/2014/chartex" xmlns:cx1="http://schemas.microsoft.com/office/drawing/2015/9/8/chartex" xmlns:cx2="http://schemas.microsoft.com/office/drawing/2015/10/21/chartex" xmlns:cx3="http://schemas.microsoft.com/office/drawing/2016/5/9/chartex" xmlns:cx4="http://schemas.microsoft.com/office/drawing/2016/5/10/chartex" xmlns:cx5="http://schemas.microsoft.com/office/drawing/2016/5/11/chartex" xmlns:cx6="http://schemas.microsoft.com/office/drawing/2016/5/12/chartex" xmlns:cx7="http://schemas.microsoft.com/office/drawing/2016/5/13/chartex" xmlns:cx8="http://schemas.microsoft.com/office/drawing/2016/5/14/chartex" xmlns:mc="http://schemas.openxmlformats.org/markup-compatibility/2006" xmlns:aink="http://schemas.microsoft.com/office/drawing/2016/ink" xmlns:am3d="http://schemas.microsoft.com/office/drawing/2017/model3d" xmlns:o="urn:schemas-microsoft-com:office:office" xmlns:oel="http://schemas.microsoft.com/office/2019/extlst" xmlns:r="http://schemas.openxmlformats.org/officeDocument/2006/relationships" xmlns:m="http://schemas.openxmlformats.org/officeDocument/2006/math" xmlns:v="urn:schemas-microsoft-com:vml" xmlns:wp14="http://schemas.microsoft.com/office/word/2010/wordprocessingDrawing" xmlns:wp="http://schemas.openxmlformats.org/drawingml/2006/wordprocessingDrawing" xmlns:w10="urn:schemas-microsoft-com:office:word" xmlns:w="http://schemas.openxmlformats.org/wordprocessingml/2006/main" xmlns:w14="http://schemas.microsoft.com/office/word/2010/wordml" xmlns:w15="http://schemas.microsoft.com/office/word/2012/wordml" xmlns:w16cex="http://schemas.microsoft.com/office/word/2018/wordml/cex" xmlns:w16cid="http://schemas.microsoft.com/office/word/2016/wordml/cid" xmlns:w16="http://schemas.microsoft.com/office/word/2018/wordml" xmlns:w16du="http://schemas.microsoft.com/office/word/2023/wordml/word16du" xmlns:w16sdtdh="http://schemas.microsoft.com/office/word/2020/wordml/sdtdatahash" xmlns:w16sdtfl="http://schemas.microsoft.com/office/word/2024/wordml/sdtformatlock" xmlns:w16se="http://schemas.microsoft.com/office/word/2015/wordml/symex" xmlns:wpg="http://schemas.microsoft.com/office/word/2010/wordprocessingGroup" xmlns:wpi="http://schemas.microsoft.com/office/word/2010/wordprocessingInk" xmlns:wne="http://schemas.microsoft.com/office/word/2006/wordml" xmlns:wps="http://schemas.microsoft.com/office/word/2010/wordprocessingShape" mc:Ignorable="w14 w15 w16se w16cid w16 w16cex w16sdtdh w16sdtfl w16du wp14">
+  <w:bookmarkStart w:id="0" w:name="_Hlk167319170"/>
+  <w:bookmarkStart w:id="1" w:name="_Hlk167319171"/>
   <w:p>
     <w:pPr>
       <w:pStyle w:val="Footer"/>
       <w:pBdr>
-        <w:top w:val="single" w:color="D9D9D9" w:themeColor="background1" w:themeShade="D9" w:sz="4" w:space="1"/>
+        <w:top w:val="single" w:sz="4" w:space="1" w:color="D9D9D9" w:themeColor="background1" w:themeShade="D9"/>
       </w:pBdr>
     </w:pPr>
     <w:r>
@@ -776,12 +783,12 @@
           </w:drawing>
         </mc:Choice>
         <mc:Fallback>
-          <w:pict w14:anchorId="22492FB6">
-            <v:shapetype id="_x0000_t202" coordsize="21600,21600" o:spt="202" path="m,l,21600r21600,l21600,xe" w14:anchorId="475E44FD">
+          <w:pict>
+            <v:shapetype w14:anchorId="475E44FD" id="_x0000_t202" coordsize="21600,21600" o:spt="202" path="m,l,21600r21600,l21600,xe">
               <v:stroke joinstyle="miter"/>
               <v:path gradientshapeok="t" o:connecttype="rect"/>
             </v:shapetype>
-            <v:shape id="Textfeld 35" style="position:absolute;margin-left:427.15pt;margin-top:6.35pt;width:83.5pt;height:20.5pt;z-index:251680768;visibility:visible;mso-wrap-style:square;mso-width-percent:0;mso-height-percent:0;mso-wrap-distance-left:9pt;mso-wrap-distance-top:0;mso-wrap-distance-right:9pt;mso-wrap-distance-bottom:0;mso-position-horizontal:absolute;mso-position-horizontal-relative:text;mso-position-vertical:absolute;mso-position-vertical-relative:text;mso-width-percent:0;mso-height-percent:0;mso-width-relative:margin;mso-height-relative:margin;v-text-anchor:top" o:spid="_x0000_s1026" fillcolor="white [3201]" stroked="f" strokeweight=".5pt" type="#_x0000_t202" o:gfxdata="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">
+            <v:shape id="Textfeld 35" o:spid="_x0000_s1026" type="#_x0000_t202" style="position:absolute;margin-left:427.15pt;margin-top:6.35pt;width:83.5pt;height:20.5pt;z-index:251680768;visibility:visible;mso-wrap-style:square;mso-width-percent:0;mso-height-percent:0;mso-wrap-distance-left:9pt;mso-wrap-distance-top:0;mso-wrap-distance-right:9pt;mso-wrap-distance-bottom:0;mso-position-horizontal:absolute;mso-position-horizontal-relative:text;mso-position-vertical:absolute;mso-position-vertical-relative:text;mso-width-percent:0;mso-height-percent:0;mso-width-relative:margin;mso-height-relative:margin;v-text-anchor:top" o:gfxdata="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" fillcolor="white [3201]" stroked="f" strokeweight=".5pt">
               <v:textbox>
                 <w:txbxContent>
                   <w:p>
@@ -876,35 +883,45 @@
     <w:pPr>
       <w:spacing w:after="0"/>
       <w:rPr>
-        <w:rFonts w:cs="Calibri" w:cstheme="minorAscii"/>
+        <w:rFonts w:cstheme="minorBidi"/>
       </w:rPr>
     </w:pPr>
     <w:r>
       <w:rPr>
-        <w:rFonts w:cs="Calibri" w:cstheme="minorAscii"/>
+        <w:rFonts w:cstheme="minorBidi"/>
       </w:rPr>
       <w:t>Version: 1</w:t>
     </w:r>
     <w:r>
       <w:br/>
     </w:r>
+    <w:proofErr w:type="gramStart"/>
     <w:r>
       <w:rPr>
-        <w:rFonts w:cs="Calibri" w:cstheme="minorAscii"/>
+        <w:rFonts w:cstheme="minorBidi"/>
       </w:rPr>
       <w:t>Erstellt</w:t>
     </w:r>
+    <w:proofErr w:type="gramEnd"/>
     <w:r>
       <w:rPr>
-        <w:rFonts w:cs="Calibri" w:cstheme="minorAscii"/>
-      </w:rPr>
-      <w:t xml:space="preserve">: </w:t>
+        <w:rFonts w:cstheme="minorBidi"/>
+      </w:rPr>
+      <w:t>: {</w:t>
     </w:r>
+    <w:proofErr w:type="spellStart"/>
     <w:r>
       <w:rPr>
-        <w:rFonts w:cs="Calibri" w:cstheme="minorAscii"/>
-      </w:rPr>
-      <w:t>{ceo_name}</w:t>
+        <w:rFonts w:cstheme="minorBidi"/>
+      </w:rPr>
+      <w:t>ceo_name</w:t>
+    </w:r>
+    <w:proofErr w:type="spellEnd"/>
+    <w:r>
+      <w:rPr>
+        <w:rFonts w:cstheme="minorBidi"/>
+      </w:rPr>
+      <w:t>}</w:t>
     </w:r>
   </w:p>
   <w:p>
@@ -917,25 +934,35 @@
     </w:pPr>
     <w:r>
       <w:rPr>
-        <w:rFonts w:cs="Calibri" w:cstheme="minorAscii"/>
+        <w:rFonts w:cstheme="minorBidi"/>
       </w:rPr>
       <w:t>Freigegeben</w:t>
     </w:r>
     <w:r>
       <w:rPr>
-        <w:rFonts w:cs="Calibri" w:cstheme="minorAscii"/>
-        <w:b w:val="1"/>
-        <w:bCs w:val="1"/>
-      </w:rPr>
-      <w:t xml:space="preserve">: </w:t>
+        <w:rFonts w:cstheme="minorBidi"/>
+        <w:b/>
+        <w:bCs/>
+      </w:rPr>
+      <w:t>: {</w:t>
     </w:r>
+    <w:proofErr w:type="spellStart"/>
     <w:r>
       <w:rPr>
-        <w:rFonts w:cs="Calibri" w:cstheme="minorAscii"/>
-        <w:b w:val="1"/>
-        <w:bCs w:val="1"/>
-      </w:rPr>
-      <w:t>{releasedBy}</w:t>
+        <w:rFonts w:cstheme="minorBidi"/>
+        <w:b/>
+        <w:bCs/>
+      </w:rPr>
+      <w:t>releasedBy</w:t>
+    </w:r>
+    <w:proofErr w:type="spellEnd"/>
+    <w:r>
+      <w:rPr>
+        <w:rFonts w:cstheme="minorBidi"/>
+        <w:b/>
+        <w:bCs/>
+      </w:rPr>
+      <w:t>}</w:t>
     </w:r>
     <w:r>
       <w:tab/>
@@ -943,52 +970,54 @@
     <w:r>
       <w:tab/>
     </w:r>
-    <w:r>
-      <w:fldChar w:fldCharType="begin"/>
-    </w:r>
-    <w:r>
-      <w:instrText xml:space="preserve"> FILENAME \* MERGEFORMAT </w:instrText>
-    </w:r>
-    <w:r>
-      <w:fldChar w:fldCharType="separate"/>
-    </w:r>
-    <w:r>
-      <w:rPr>
-        <w:noProof/>
-      </w:rPr>
-      <w:t>Kap. 5, D</w:t>
-    </w:r>
-    <w:r>
-      <w:rPr>
-        <w:noProof/>
-      </w:rPr>
-      <w:t>0 – Qualitätspolitik</w:t>
-    </w:r>
-    <w:r>
-      <w:fldChar w:fldCharType="end"/>
-    </w:r>
+    <w:fldSimple w:instr=" FILENAME \* MERGEFORMAT ">
+      <w:r>
+        <w:rPr>
+          <w:noProof/>
+        </w:rPr>
+        <w:t>Kap. 5, D0 – Qualitätspolitik</w:t>
+      </w:r>
+    </w:fldSimple>
   </w:p>
   <w:p>
     <w:pPr>
       <w:spacing w:after="0"/>
       <w:rPr>
-        <w:rFonts w:cs="Calibri" w:cstheme="minorAscii"/>
-        <w:b w:val="1"/>
-        <w:bCs w:val="1"/>
+        <w:rFonts w:cstheme="minorBidi"/>
+        <w:b/>
+        <w:bCs/>
       </w:rPr>
     </w:pPr>
     <w:r>
       <w:rPr>
-        <w:rFonts w:cs="Calibri" w:cstheme="minorAscii"/>
-      </w:rPr>
-      <w:t xml:space="preserve">Datum: </w:t>
+        <w:rFonts w:cstheme="minorBidi"/>
+      </w:rPr>
+      <w:t>Datum: {</w:t>
     </w:r>
+    <w:proofErr w:type="spellStart"/>
     <w:r>
       <w:rPr>
-        <w:rFonts w:cs="Calibri" w:cstheme="minorAscii"/>
-      </w:rPr>
-      <w:t>{doc_date}</w:t>
+        <w:rFonts w:cstheme="minorBidi"/>
+      </w:rPr>
+      <w:t>doc_date</w:t>
     </w:r>
+    <w:proofErr w:type="spellEnd"/>
+    <w:r>
+      <w:rPr>
+        <w:rFonts w:cstheme="minorBidi"/>
+      </w:rPr>
+      <w:t>}</w:t>
+    </w:r>
+  </w:p>
+</w:ftr>
+</file>
+
+<file path=word/footer3.xml><?xml version="1.0" encoding="utf-8"?>
+<w:ftr xmlns:wpc="http://schemas.microsoft.com/office/word/2010/wordprocessingCanvas" xmlns:cx="http://schemas.microsoft.com/office/drawing/2014/chartex" xmlns:cx1="http://schemas.microsoft.com/office/drawing/2015/9/8/chartex" xmlns:cx2="http://schemas.microsoft.com/office/drawing/2015/10/21/chartex" xmlns:cx3="http://schemas.microsoft.com/office/drawing/2016/5/9/chartex" xmlns:cx4="http://schemas.microsoft.com/office/drawing/2016/5/10/chartex" xmlns:cx5="http://schemas.microsoft.com/office/drawing/2016/5/11/chartex" xmlns:cx6="http://schemas.microsoft.com/office/drawing/2016/5/12/chartex" xmlns:cx7="http://schemas.microsoft.com/office/drawing/2016/5/13/chartex" xmlns:cx8="http://schemas.microsoft.com/office/drawing/2016/5/14/chartex" xmlns:mc="http://schemas.openxmlformats.org/markup-compatibility/2006" xmlns:aink="http://schemas.microsoft.com/office/drawing/2016/ink" xmlns:am3d="http://schemas.microsoft.com/office/drawing/2017/model3d" xmlns:o="urn:schemas-microsoft-com:office:office" xmlns:oel="http://schemas.microsoft.com/office/2019/extlst" xmlns:r="http://schemas.openxmlformats.org/officeDocument/2006/relationships" xmlns:m="http://schemas.openxmlformats.org/officeDocument/2006/math" xmlns:v="urn:schemas-microsoft-com:vml" xmlns:wp14="http://schemas.microsoft.com/office/word/2010/wordprocessingDrawing" xmlns:wp="http://schemas.openxmlformats.org/drawingml/2006/wordprocessingDrawing" xmlns:w10="urn:schemas-microsoft-com:office:word" xmlns:w="http://schemas.openxmlformats.org/wordprocessingml/2006/main" xmlns:w14="http://schemas.microsoft.com/office/word/2010/wordml" xmlns:w15="http://schemas.microsoft.com/office/word/2012/wordml" xmlns:w16cex="http://schemas.microsoft.com/office/word/2018/wordml/cex" xmlns:w16cid="http://schemas.microsoft.com/office/word/2016/wordml/cid" xmlns:w16="http://schemas.microsoft.com/office/word/2018/wordml" xmlns:w16du="http://schemas.microsoft.com/office/word/2023/wordml/word16du" xmlns:w16sdtdh="http://schemas.microsoft.com/office/word/2020/wordml/sdtdatahash" xmlns:w16sdtfl="http://schemas.microsoft.com/office/word/2024/wordml/sdtformatlock" xmlns:w16se="http://schemas.microsoft.com/office/word/2015/wordml/symex" xmlns:wpg="http://schemas.microsoft.com/office/word/2010/wordprocessingGroup" xmlns:wpi="http://schemas.microsoft.com/office/word/2010/wordprocessingInk" xmlns:wne="http://schemas.microsoft.com/office/word/2006/wordml" xmlns:wps="http://schemas.microsoft.com/office/word/2010/wordprocessingShape" mc:Ignorable="w14 w15 w16se w16cid w16 w16cex w16sdtdh w16sdtfl w16du wp14">
+  <w:p>
+    <w:pPr>
+      <w:pStyle w:val="Footer"/>
+    </w:pPr>
   </w:p>
 </w:ftr>
 </file>
@@ -1019,6 +1048,16 @@
 </file>
 
 <file path=word/header1.xml><?xml version="1.0" encoding="utf-8"?>
+<w:hdr xmlns:wpc="http://schemas.microsoft.com/office/word/2010/wordprocessingCanvas" xmlns:cx="http://schemas.microsoft.com/office/drawing/2014/chartex" xmlns:cx1="http://schemas.microsoft.com/office/drawing/2015/9/8/chartex" xmlns:cx2="http://schemas.microsoft.com/office/drawing/2015/10/21/chartex" xmlns:cx3="http://schemas.microsoft.com/office/drawing/2016/5/9/chartex" xmlns:cx4="http://schemas.microsoft.com/office/drawing/2016/5/10/chartex" xmlns:cx5="http://schemas.microsoft.com/office/drawing/2016/5/11/chartex" xmlns:cx6="http://schemas.microsoft.com/office/drawing/2016/5/12/chartex" xmlns:cx7="http://schemas.microsoft.com/office/drawing/2016/5/13/chartex" xmlns:cx8="http://schemas.microsoft.com/office/drawing/2016/5/14/chartex" xmlns:mc="http://schemas.openxmlformats.org/markup-compatibility/2006" xmlns:aink="http://schemas.microsoft.com/office/drawing/2016/ink" xmlns:am3d="http://schemas.microsoft.com/office/drawing/2017/model3d" xmlns:o="urn:schemas-microsoft-com:office:office" xmlns:oel="http://schemas.microsoft.com/office/2019/extlst" xmlns:r="http://schemas.openxmlformats.org/officeDocument/2006/relationships" xmlns:m="http://schemas.openxmlformats.org/officeDocument/2006/math" xmlns:v="urn:schemas-microsoft-com:vml" xmlns:wp14="http://schemas.microsoft.com/office/word/2010/wordprocessingDrawing" xmlns:wp="http://schemas.openxmlformats.org/drawingml/2006/wordprocessingDrawing" xmlns:w10="urn:schemas-microsoft-com:office:word" xmlns:w="http://schemas.openxmlformats.org/wordprocessingml/2006/main" xmlns:w14="http://schemas.microsoft.com/office/word/2010/wordml" xmlns:w15="http://schemas.microsoft.com/office/word/2012/wordml" xmlns:w16cex="http://schemas.microsoft.com/office/word/2018/wordml/cex" xmlns:w16cid="http://schemas.microsoft.com/office/word/2016/wordml/cid" xmlns:w16="http://schemas.microsoft.com/office/word/2018/wordml" xmlns:w16du="http://schemas.microsoft.com/office/word/2023/wordml/word16du" xmlns:w16sdtdh="http://schemas.microsoft.com/office/word/2020/wordml/sdtdatahash" xmlns:w16sdtfl="http://schemas.microsoft.com/office/word/2024/wordml/sdtformatlock" xmlns:w16se="http://schemas.microsoft.com/office/word/2015/wordml/symex" xmlns:wpg="http://schemas.microsoft.com/office/word/2010/wordprocessingGroup" xmlns:wpi="http://schemas.microsoft.com/office/word/2010/wordprocessingInk" xmlns:wne="http://schemas.microsoft.com/office/word/2006/wordml" xmlns:wps="http://schemas.microsoft.com/office/word/2010/wordprocessingShape" mc:Ignorable="w14 w15 w16se w16cid w16 w16cex w16sdtdh w16sdtfl w16du wp14">
+  <w:p>
+    <w:pPr>
+      <w:pStyle w:val="Header"/>
+    </w:pPr>
+  </w:p>
+</w:hdr>
+</file>
+
+<file path=word/header2.xml><?xml version="1.0" encoding="utf-8"?>
 <w:hdr xmlns:wpc="http://schemas.microsoft.com/office/word/2010/wordprocessingCanvas" xmlns:cx="http://schemas.microsoft.com/office/drawing/2014/chartex" xmlns:cx1="http://schemas.microsoft.com/office/drawing/2015/9/8/chartex" xmlns:cx2="http://schemas.microsoft.com/office/drawing/2015/10/21/chartex" xmlns:cx3="http://schemas.microsoft.com/office/drawing/2016/5/9/chartex" xmlns:cx4="http://schemas.microsoft.com/office/drawing/2016/5/10/chartex" xmlns:cx5="http://schemas.microsoft.com/office/drawing/2016/5/11/chartex" xmlns:cx6="http://schemas.microsoft.com/office/drawing/2016/5/12/chartex" xmlns:cx7="http://schemas.microsoft.com/office/drawing/2016/5/13/chartex" xmlns:cx8="http://schemas.microsoft.com/office/drawing/2016/5/14/chartex" xmlns:mc="http://schemas.openxmlformats.org/markup-compatibility/2006" xmlns:aink="http://schemas.microsoft.com/office/drawing/2016/ink" xmlns:am3d="http://schemas.microsoft.com/office/drawing/2017/model3d" xmlns:o="urn:schemas-microsoft-com:office:office" xmlns:oel="http://schemas.microsoft.com/office/2019/extlst" xmlns:r="http://schemas.openxmlformats.org/officeDocument/2006/relationships" xmlns:m="http://schemas.openxmlformats.org/officeDocument/2006/math" xmlns:v="urn:schemas-microsoft-com:vml" xmlns:wp14="http://schemas.microsoft.com/office/word/2010/wordprocessingDrawing" xmlns:wp="http://schemas.openxmlformats.org/drawingml/2006/wordprocessingDrawing" xmlns:w10="urn:schemas-microsoft-com:office:word" xmlns:w="http://schemas.openxmlformats.org/wordprocessingml/2006/main" xmlns:w14="http://schemas.microsoft.com/office/word/2010/wordml" xmlns:w15="http://schemas.microsoft.com/office/word/2012/wordml" xmlns:w16cex="http://schemas.microsoft.com/office/word/2018/wordml/cex" xmlns:w16cid="http://schemas.microsoft.com/office/word/2016/wordml/cid" xmlns:w16="http://schemas.microsoft.com/office/word/2018/wordml" xmlns:w16du="http://schemas.microsoft.com/office/word/2023/wordml/word16du" xmlns:w16sdtdh="http://schemas.microsoft.com/office/word/2020/wordml/sdtdatahash" xmlns:w16sdtfl="http://schemas.microsoft.com/office/word/2024/wordml/sdtformatlock" xmlns:w16se="http://schemas.microsoft.com/office/word/2015/wordml/symex" xmlns:wpg="http://schemas.microsoft.com/office/word/2010/wordprocessingGroup" xmlns:wpi="http://schemas.microsoft.com/office/word/2010/wordprocessingInk" xmlns:wne="http://schemas.microsoft.com/office/word/2006/wordml" xmlns:wps="http://schemas.microsoft.com/office/word/2010/wordprocessingShape" mc:Ignorable="w14 w15 w16se w16cid w16 w16cex w16sdtdh w16sdtfl w16du wp14">
   <w:p>
     <w:pPr>
@@ -1035,7 +1074,75 @@
     </w:pPr>
     <w:r>
       <w:rPr>
-        <w:rFonts w:asciiTheme="majorHAnsi" w:hAnsiTheme="majorHAnsi" w:eastAsiaTheme="majorEastAsia" w:cstheme="majorBidi"/>
+        <w:noProof/>
+      </w:rPr>
+      <w:drawing>
+        <wp:anchor distT="0" distB="0" distL="114300" distR="114300" simplePos="0" relativeHeight="251681792" behindDoc="1" locked="0" layoutInCell="1" allowOverlap="1" wp14:anchorId="55DD7743" wp14:editId="5362EB82">
+          <wp:simplePos x="0" y="0"/>
+          <wp:positionH relativeFrom="column">
+            <wp:posOffset>3493770</wp:posOffset>
+          </wp:positionH>
+          <wp:positionV relativeFrom="paragraph">
+            <wp:posOffset>70485</wp:posOffset>
+          </wp:positionV>
+          <wp:extent cx="2679700" cy="981710"/>
+          <wp:effectExtent l="0" t="0" r="0" b="0"/>
+          <wp:wrapThrough wrapText="bothSides">
+            <wp:wrapPolygon edited="0">
+              <wp:start x="0" y="0"/>
+              <wp:lineTo x="0" y="21237"/>
+              <wp:lineTo x="21498" y="21237"/>
+              <wp:lineTo x="21498" y="0"/>
+              <wp:lineTo x="0" y="0"/>
+            </wp:wrapPolygon>
+          </wp:wrapThrough>
+          <wp:docPr id="582597697" name="Picture 2" descr="{logo}"/>
+          <wp:cNvGraphicFramePr>
+            <a:graphicFrameLocks xmlns:a="http://schemas.openxmlformats.org/drawingml/2006/main" noChangeAspect="1"/>
+          </wp:cNvGraphicFramePr>
+          <a:graphic xmlns:a="http://schemas.openxmlformats.org/drawingml/2006/main">
+            <a:graphicData uri="http://schemas.openxmlformats.org/drawingml/2006/picture">
+              <pic:pic xmlns:pic="http://schemas.openxmlformats.org/drawingml/2006/picture">
+                <pic:nvPicPr>
+                  <pic:cNvPr id="582597697" name="Picture 2" descr="{logo}"/>
+                  <pic:cNvPicPr/>
+                </pic:nvPicPr>
+                <pic:blipFill>
+                  <a:blip r:embed="rId1">
+                    <a:extLst>
+                      <a:ext uri="{28A0092B-C50C-407E-A947-70E740481C1C}">
+                        <a14:useLocalDpi xmlns:a14="http://schemas.microsoft.com/office/drawing/2010/main" val="0"/>
+                      </a:ext>
+                    </a:extLst>
+                  </a:blip>
+                  <a:stretch>
+                    <a:fillRect/>
+                  </a:stretch>
+                </pic:blipFill>
+                <pic:spPr>
+                  <a:xfrm>
+                    <a:off x="0" y="0"/>
+                    <a:ext cx="2679700" cy="981710"/>
+                  </a:xfrm>
+                  <a:prstGeom prst="rect">
+                    <a:avLst/>
+                  </a:prstGeom>
+                </pic:spPr>
+              </pic:pic>
+            </a:graphicData>
+          </a:graphic>
+          <wp14:sizeRelH relativeFrom="page">
+            <wp14:pctWidth>0</wp14:pctWidth>
+          </wp14:sizeRelH>
+          <wp14:sizeRelV relativeFrom="page">
+            <wp14:pctHeight>0</wp14:pctHeight>
+          </wp14:sizeRelV>
+        </wp:anchor>
+      </w:drawing>
+    </w:r>
+    <w:r>
+      <w:rPr>
+        <w:rFonts w:asciiTheme="majorHAnsi" w:eastAsiaTheme="majorEastAsia" w:hAnsiTheme="majorHAnsi" w:cstheme="majorBidi"/>
         <w:b/>
         <w:bCs/>
         <w:sz w:val="32"/>
@@ -1045,7 +1152,7 @@
     </w:r>
     <w:r>
       <w:rPr>
-        <w:rFonts w:asciiTheme="majorHAnsi" w:hAnsiTheme="majorHAnsi" w:eastAsiaTheme="majorEastAsia" w:cstheme="majorBidi"/>
+        <w:rFonts w:asciiTheme="majorHAnsi" w:eastAsiaTheme="majorEastAsia" w:hAnsiTheme="majorHAnsi" w:cstheme="majorBidi"/>
         <w:b/>
         <w:bCs/>
         <w:sz w:val="32"/>
@@ -1055,7 +1162,7 @@
     </w:r>
     <w:r>
       <w:rPr>
-        <w:rFonts w:asciiTheme="majorHAnsi" w:hAnsiTheme="majorHAnsi" w:eastAsiaTheme="majorEastAsia" w:cstheme="majorBidi"/>
+        <w:rFonts w:asciiTheme="majorHAnsi" w:eastAsiaTheme="majorEastAsia" w:hAnsiTheme="majorHAnsi" w:cstheme="majorBidi"/>
         <w:b/>
         <w:bCs/>
         <w:sz w:val="32"/>
@@ -1065,7 +1172,7 @@
     </w:r>
     <w:r>
       <w:rPr>
-        <w:rFonts w:asciiTheme="majorHAnsi" w:hAnsiTheme="majorHAnsi" w:eastAsiaTheme="majorEastAsia" w:cstheme="majorBidi"/>
+        <w:rFonts w:asciiTheme="majorHAnsi" w:eastAsiaTheme="majorEastAsia" w:hAnsiTheme="majorHAnsi" w:cstheme="majorBidi"/>
         <w:b/>
         <w:bCs/>
         <w:noProof/>
@@ -1076,7 +1183,7 @@
     </w:r>
     <w:r>
       <w:rPr>
-        <w:rFonts w:asciiTheme="majorHAnsi" w:hAnsiTheme="majorHAnsi" w:eastAsiaTheme="majorEastAsia" w:cstheme="majorBidi"/>
+        <w:rFonts w:asciiTheme="majorHAnsi" w:eastAsiaTheme="majorEastAsia" w:hAnsiTheme="majorHAnsi" w:cstheme="majorBidi"/>
         <w:b/>
         <w:bCs/>
         <w:sz w:val="32"/>
@@ -1095,12 +1202,6 @@
         <w:noProof/>
       </w:rPr>
       <w:tab/>
-    </w:r>
-    <w:r>
-      <w:rPr>
-        <w:noProof/>
-      </w:rPr>
-      <w:t>{logo}</w:t>
     </w:r>
   </w:p>
   <w:p>
@@ -1126,6 +1227,16 @@
 </w:hdr>
 </file>
 
+<file path=word/header3.xml><?xml version="1.0" encoding="utf-8"?>
+<w:hdr xmlns:wpc="http://schemas.microsoft.com/office/word/2010/wordprocessingCanvas" xmlns:cx="http://schemas.microsoft.com/office/drawing/2014/chartex" xmlns:cx1="http://schemas.microsoft.com/office/drawing/2015/9/8/chartex" xmlns:cx2="http://schemas.microsoft.com/office/drawing/2015/10/21/chartex" xmlns:cx3="http://schemas.microsoft.com/office/drawing/2016/5/9/chartex" xmlns:cx4="http://schemas.microsoft.com/office/drawing/2016/5/10/chartex" xmlns:cx5="http://schemas.microsoft.com/office/drawing/2016/5/11/chartex" xmlns:cx6="http://schemas.microsoft.com/office/drawing/2016/5/12/chartex" xmlns:cx7="http://schemas.microsoft.com/office/drawing/2016/5/13/chartex" xmlns:cx8="http://schemas.microsoft.com/office/drawing/2016/5/14/chartex" xmlns:mc="http://schemas.openxmlformats.org/markup-compatibility/2006" xmlns:aink="http://schemas.microsoft.com/office/drawing/2016/ink" xmlns:am3d="http://schemas.microsoft.com/office/drawing/2017/model3d" xmlns:o="urn:schemas-microsoft-com:office:office" xmlns:oel="http://schemas.microsoft.com/office/2019/extlst" xmlns:r="http://schemas.openxmlformats.org/officeDocument/2006/relationships" xmlns:m="http://schemas.openxmlformats.org/officeDocument/2006/math" xmlns:v="urn:schemas-microsoft-com:vml" xmlns:wp14="http://schemas.microsoft.com/office/word/2010/wordprocessingDrawing" xmlns:wp="http://schemas.openxmlformats.org/drawingml/2006/wordprocessingDrawing" xmlns:w10="urn:schemas-microsoft-com:office:word" xmlns:w="http://schemas.openxmlformats.org/wordprocessingml/2006/main" xmlns:w14="http://schemas.microsoft.com/office/word/2010/wordml" xmlns:w15="http://schemas.microsoft.com/office/word/2012/wordml" xmlns:w16cex="http://schemas.microsoft.com/office/word/2018/wordml/cex" xmlns:w16cid="http://schemas.microsoft.com/office/word/2016/wordml/cid" xmlns:w16="http://schemas.microsoft.com/office/word/2018/wordml" xmlns:w16du="http://schemas.microsoft.com/office/word/2023/wordml/word16du" xmlns:w16sdtdh="http://schemas.microsoft.com/office/word/2020/wordml/sdtdatahash" xmlns:w16sdtfl="http://schemas.microsoft.com/office/word/2024/wordml/sdtformatlock" xmlns:w16se="http://schemas.microsoft.com/office/word/2015/wordml/symex" xmlns:wpg="http://schemas.microsoft.com/office/word/2010/wordprocessingGroup" xmlns:wpi="http://schemas.microsoft.com/office/word/2010/wordprocessingInk" xmlns:wne="http://schemas.microsoft.com/office/word/2006/wordml" xmlns:wps="http://schemas.microsoft.com/office/word/2010/wordprocessingShape" mc:Ignorable="w14 w15 w16se w16cid w16 w16cex w16sdtdh w16sdtfl w16du wp14">
+  <w:p>
+    <w:pPr>
+      <w:pStyle w:val="Header"/>
+    </w:pPr>
+  </w:p>
+</w:hdr>
+</file>
+
 <file path=word/numbering.xml><?xml version="1.0" encoding="utf-8"?>
 <w:numbering xmlns:wpc="http://schemas.microsoft.com/office/word/2010/wordprocessingCanvas" xmlns:cx="http://schemas.microsoft.com/office/drawing/2014/chartex" xmlns:cx1="http://schemas.microsoft.com/office/drawing/2015/9/8/chartex" xmlns:cx2="http://schemas.microsoft.com/office/drawing/2015/10/21/chartex" xmlns:cx3="http://schemas.microsoft.com/office/drawing/2016/5/9/chartex" xmlns:cx4="http://schemas.microsoft.com/office/drawing/2016/5/10/chartex" xmlns:cx5="http://schemas.microsoft.com/office/drawing/2016/5/11/chartex" xmlns:cx6="http://schemas.microsoft.com/office/drawing/2016/5/12/chartex" xmlns:cx7="http://schemas.microsoft.com/office/drawing/2016/5/13/chartex" xmlns:cx8="http://schemas.microsoft.com/office/drawing/2016/5/14/chartex" xmlns:mc="http://schemas.openxmlformats.org/markup-compatibility/2006" xmlns:aink="http://schemas.microsoft.com/office/drawing/2016/ink" xmlns:am3d="http://schemas.microsoft.com/office/drawing/2017/model3d" xmlns:o="urn:schemas-microsoft-com:office:office" xmlns:oel="http://schemas.microsoft.com/office/2019/extlst" xmlns:r="http://schemas.openxmlformats.org/officeDocument/2006/relationships" xmlns:m="http://schemas.openxmlformats.org/officeDocument/2006/math" xmlns:v="urn:schemas-microsoft-com:vml" xmlns:wp14="http://schemas.microsoft.com/office/word/2010/wordprocessingDrawing" xmlns:wp="http://schemas.openxmlformats.org/drawingml/2006/wordprocessingDrawing" xmlns:w10="urn:schemas-microsoft-com:office:word" xmlns:w="http://schemas.openxmlformats.org/wordprocessingml/2006/main" xmlns:w14="http://schemas.microsoft.com/office/word/2010/wordml" xmlns:w15="http://schemas.microsoft.com/office/word/2012/wordml" xmlns:w16cex="http://schemas.microsoft.com/office/word/2018/wordml/cex" xmlns:w16cid="http://schemas.microsoft.com/office/word/2016/wordml/cid" xmlns:w16="http://schemas.microsoft.com/office/word/2018/wordml" xmlns:w16du="http://schemas.microsoft.com/office/word/2023/wordml/word16du" xmlns:w16sdtdh="http://schemas.microsoft.com/office/word/2020/wordml/sdtdatahash" xmlns:w16sdtfl="http://schemas.microsoft.com/office/word/2024/wordml/sdtformatlock" xmlns:w16se="http://schemas.microsoft.com/office/word/2015/wordml/symex" xmlns:wpg="http://schemas.microsoft.com/office/word/2010/wordprocessingGroup" xmlns:wpi="http://schemas.microsoft.com/office/word/2010/wordprocessingInk" xmlns:wne="http://schemas.microsoft.com/office/word/2006/wordml" xmlns:wps="http://schemas.microsoft.com/office/word/2010/wordprocessingShape" mc:Ignorable="w14 w15 w16se w16cid w16 w16cex w16sdtdh w16sdtfl w16du wp14">
   <w:abstractNum w:abstractNumId="0" w15:restartNumberingAfterBreak="0">
@@ -1142,7 +1253,7 @@
         <w:ind w:left="720" w:hanging="360"/>
       </w:pPr>
       <w:rPr>
-        <w:rFonts w:ascii="Noto Sans Symbols" w:hAnsi="Noto Sans Symbols" w:eastAsia="Noto Sans Symbols" w:cs="Noto Sans Symbols"/>
+        <w:rFonts w:ascii="Noto Sans Symbols" w:eastAsia="Noto Sans Symbols" w:hAnsi="Noto Sans Symbols" w:cs="Noto Sans Symbols"/>
         <w:sz w:val="20"/>
         <w:szCs w:val="20"/>
       </w:rPr>
@@ -1156,7 +1267,7 @@
         <w:ind w:left="1440" w:hanging="360"/>
       </w:pPr>
       <w:rPr>
-        <w:rFonts w:ascii="Courier New" w:hAnsi="Courier New" w:eastAsia="Courier New" w:cs="Courier New"/>
+        <w:rFonts w:ascii="Courier New" w:eastAsia="Courier New" w:hAnsi="Courier New" w:cs="Courier New"/>
         <w:sz w:val="20"/>
         <w:szCs w:val="20"/>
       </w:rPr>
@@ -1170,7 +1281,7 @@
         <w:ind w:left="2160" w:hanging="360"/>
       </w:pPr>
       <w:rPr>
-        <w:rFonts w:ascii="Noto Sans Symbols" w:hAnsi="Noto Sans Symbols" w:eastAsia="Noto Sans Symbols" w:cs="Noto Sans Symbols"/>
+        <w:rFonts w:ascii="Noto Sans Symbols" w:eastAsia="Noto Sans Symbols" w:hAnsi="Noto Sans Symbols" w:cs="Noto Sans Symbols"/>
         <w:sz w:val="20"/>
         <w:szCs w:val="20"/>
       </w:rPr>
@@ -1184,7 +1295,7 @@
         <w:ind w:left="2880" w:hanging="360"/>
       </w:pPr>
       <w:rPr>
-        <w:rFonts w:ascii="Noto Sans Symbols" w:hAnsi="Noto Sans Symbols" w:eastAsia="Noto Sans Symbols" w:cs="Noto Sans Symbols"/>
+        <w:rFonts w:ascii="Noto Sans Symbols" w:eastAsia="Noto Sans Symbols" w:hAnsi="Noto Sans Symbols" w:cs="Noto Sans Symbols"/>
         <w:sz w:val="20"/>
         <w:szCs w:val="20"/>
       </w:rPr>
@@ -1198,7 +1309,7 @@
         <w:ind w:left="3600" w:hanging="360"/>
       </w:pPr>
       <w:rPr>
-        <w:rFonts w:ascii="Noto Sans Symbols" w:hAnsi="Noto Sans Symbols" w:eastAsia="Noto Sans Symbols" w:cs="Noto Sans Symbols"/>
+        <w:rFonts w:ascii="Noto Sans Symbols" w:eastAsia="Noto Sans Symbols" w:hAnsi="Noto Sans Symbols" w:cs="Noto Sans Symbols"/>
         <w:sz w:val="20"/>
         <w:szCs w:val="20"/>
       </w:rPr>
@@ -1212,7 +1323,7 @@
         <w:ind w:left="4320" w:hanging="360"/>
       </w:pPr>
       <w:rPr>
-        <w:rFonts w:ascii="Noto Sans Symbols" w:hAnsi="Noto Sans Symbols" w:eastAsia="Noto Sans Symbols" w:cs="Noto Sans Symbols"/>
+        <w:rFonts w:ascii="Noto Sans Symbols" w:eastAsia="Noto Sans Symbols" w:hAnsi="Noto Sans Symbols" w:cs="Noto Sans Symbols"/>
         <w:sz w:val="20"/>
         <w:szCs w:val="20"/>
       </w:rPr>
@@ -1226,7 +1337,7 @@
         <w:ind w:left="5040" w:hanging="360"/>
       </w:pPr>
       <w:rPr>
-        <w:rFonts w:ascii="Noto Sans Symbols" w:hAnsi="Noto Sans Symbols" w:eastAsia="Noto Sans Symbols" w:cs="Noto Sans Symbols"/>
+        <w:rFonts w:ascii="Noto Sans Symbols" w:eastAsia="Noto Sans Symbols" w:hAnsi="Noto Sans Symbols" w:cs="Noto Sans Symbols"/>
         <w:sz w:val="20"/>
         <w:szCs w:val="20"/>
       </w:rPr>
@@ -1240,7 +1351,7 @@
         <w:ind w:left="5760" w:hanging="360"/>
       </w:pPr>
       <w:rPr>
-        <w:rFonts w:ascii="Noto Sans Symbols" w:hAnsi="Noto Sans Symbols" w:eastAsia="Noto Sans Symbols" w:cs="Noto Sans Symbols"/>
+        <w:rFonts w:ascii="Noto Sans Symbols" w:eastAsia="Noto Sans Symbols" w:hAnsi="Noto Sans Symbols" w:cs="Noto Sans Symbols"/>
         <w:sz w:val="20"/>
         <w:szCs w:val="20"/>
       </w:rPr>
@@ -1254,7 +1365,7 @@
         <w:ind w:left="6480" w:hanging="360"/>
       </w:pPr>
       <w:rPr>
-        <w:rFonts w:ascii="Noto Sans Symbols" w:hAnsi="Noto Sans Symbols" w:eastAsia="Noto Sans Symbols" w:cs="Noto Sans Symbols"/>
+        <w:rFonts w:ascii="Noto Sans Symbols" w:eastAsia="Noto Sans Symbols" w:hAnsi="Noto Sans Symbols" w:cs="Noto Sans Symbols"/>
         <w:sz w:val="20"/>
         <w:szCs w:val="20"/>
       </w:rPr>
@@ -1273,7 +1384,7 @@
         <w:ind w:left="720" w:hanging="360"/>
       </w:pPr>
       <w:rPr>
-        <w:rFonts w:ascii="Noto Sans Symbols" w:hAnsi="Noto Sans Symbols" w:eastAsia="Noto Sans Symbols" w:cs="Noto Sans Symbols"/>
+        <w:rFonts w:ascii="Noto Sans Symbols" w:eastAsia="Noto Sans Symbols" w:hAnsi="Noto Sans Symbols" w:cs="Noto Sans Symbols"/>
         <w:sz w:val="20"/>
         <w:szCs w:val="20"/>
       </w:rPr>
@@ -1287,7 +1398,7 @@
         <w:ind w:left="1440" w:hanging="360"/>
       </w:pPr>
       <w:rPr>
-        <w:rFonts w:ascii="Courier New" w:hAnsi="Courier New" w:eastAsia="Courier New" w:cs="Courier New"/>
+        <w:rFonts w:ascii="Courier New" w:eastAsia="Courier New" w:hAnsi="Courier New" w:cs="Courier New"/>
         <w:sz w:val="20"/>
         <w:szCs w:val="20"/>
       </w:rPr>
@@ -1301,7 +1412,7 @@
         <w:ind w:left="2160" w:hanging="360"/>
       </w:pPr>
       <w:rPr>
-        <w:rFonts w:ascii="Noto Sans Symbols" w:hAnsi="Noto Sans Symbols" w:eastAsia="Noto Sans Symbols" w:cs="Noto Sans Symbols"/>
+        <w:rFonts w:ascii="Noto Sans Symbols" w:eastAsia="Noto Sans Symbols" w:hAnsi="Noto Sans Symbols" w:cs="Noto Sans Symbols"/>
         <w:sz w:val="20"/>
         <w:szCs w:val="20"/>
       </w:rPr>
@@ -1315,7 +1426,7 @@
         <w:ind w:left="2880" w:hanging="360"/>
       </w:pPr>
       <w:rPr>
-        <w:rFonts w:ascii="Noto Sans Symbols" w:hAnsi="Noto Sans Symbols" w:eastAsia="Noto Sans Symbols" w:cs="Noto Sans Symbols"/>
+        <w:rFonts w:ascii="Noto Sans Symbols" w:eastAsia="Noto Sans Symbols" w:hAnsi="Noto Sans Symbols" w:cs="Noto Sans Symbols"/>
         <w:sz w:val="20"/>
         <w:szCs w:val="20"/>
       </w:rPr>
@@ -1329,7 +1440,7 @@
         <w:ind w:left="3600" w:hanging="360"/>
       </w:pPr>
       <w:rPr>
-        <w:rFonts w:ascii="Noto Sans Symbols" w:hAnsi="Noto Sans Symbols" w:eastAsia="Noto Sans Symbols" w:cs="Noto Sans Symbols"/>
+        <w:rFonts w:ascii="Noto Sans Symbols" w:eastAsia="Noto Sans Symbols" w:hAnsi="Noto Sans Symbols" w:cs="Noto Sans Symbols"/>
         <w:sz w:val="20"/>
         <w:szCs w:val="20"/>
       </w:rPr>
@@ -1343,7 +1454,7 @@
         <w:ind w:left="4320" w:hanging="360"/>
       </w:pPr>
       <w:rPr>
-        <w:rFonts w:ascii="Noto Sans Symbols" w:hAnsi="Noto Sans Symbols" w:eastAsia="Noto Sans Symbols" w:cs="Noto Sans Symbols"/>
+        <w:rFonts w:ascii="Noto Sans Symbols" w:eastAsia="Noto Sans Symbols" w:hAnsi="Noto Sans Symbols" w:cs="Noto Sans Symbols"/>
         <w:sz w:val="20"/>
         <w:szCs w:val="20"/>
       </w:rPr>
@@ -1357,7 +1468,7 @@
         <w:ind w:left="5040" w:hanging="360"/>
       </w:pPr>
       <w:rPr>
-        <w:rFonts w:ascii="Noto Sans Symbols" w:hAnsi="Noto Sans Symbols" w:eastAsia="Noto Sans Symbols" w:cs="Noto Sans Symbols"/>
+        <w:rFonts w:ascii="Noto Sans Symbols" w:eastAsia="Noto Sans Symbols" w:hAnsi="Noto Sans Symbols" w:cs="Noto Sans Symbols"/>
         <w:sz w:val="20"/>
         <w:szCs w:val="20"/>
       </w:rPr>
@@ -1371,7 +1482,7 @@
         <w:ind w:left="5760" w:hanging="360"/>
       </w:pPr>
       <w:rPr>
-        <w:rFonts w:ascii="Noto Sans Symbols" w:hAnsi="Noto Sans Symbols" w:eastAsia="Noto Sans Symbols" w:cs="Noto Sans Symbols"/>
+        <w:rFonts w:ascii="Noto Sans Symbols" w:eastAsia="Noto Sans Symbols" w:hAnsi="Noto Sans Symbols" w:cs="Noto Sans Symbols"/>
         <w:sz w:val="20"/>
         <w:szCs w:val="20"/>
       </w:rPr>
@@ -1385,7 +1496,7 @@
         <w:ind w:left="6480" w:hanging="360"/>
       </w:pPr>
       <w:rPr>
-        <w:rFonts w:ascii="Noto Sans Symbols" w:hAnsi="Noto Sans Symbols" w:eastAsia="Noto Sans Symbols" w:cs="Noto Sans Symbols"/>
+        <w:rFonts w:ascii="Noto Sans Symbols" w:eastAsia="Noto Sans Symbols" w:hAnsi="Noto Sans Symbols" w:cs="Noto Sans Symbols"/>
         <w:sz w:val="20"/>
         <w:szCs w:val="20"/>
       </w:rPr>
@@ -1404,7 +1515,7 @@
         <w:ind w:left="720" w:hanging="360"/>
       </w:pPr>
       <w:rPr>
-        <w:rFonts w:ascii="Noto Sans Symbols" w:hAnsi="Noto Sans Symbols" w:eastAsia="Noto Sans Symbols" w:cs="Noto Sans Symbols"/>
+        <w:rFonts w:ascii="Noto Sans Symbols" w:eastAsia="Noto Sans Symbols" w:hAnsi="Noto Sans Symbols" w:cs="Noto Sans Symbols"/>
         <w:sz w:val="20"/>
         <w:szCs w:val="20"/>
       </w:rPr>
@@ -1418,7 +1529,7 @@
         <w:ind w:left="1440" w:hanging="360"/>
       </w:pPr>
       <w:rPr>
-        <w:rFonts w:ascii="Courier New" w:hAnsi="Courier New" w:eastAsia="Courier New" w:cs="Courier New"/>
+        <w:rFonts w:ascii="Courier New" w:eastAsia="Courier New" w:hAnsi="Courier New" w:cs="Courier New"/>
         <w:sz w:val="20"/>
         <w:szCs w:val="20"/>
       </w:rPr>
@@ -1432,7 +1543,7 @@
         <w:ind w:left="2160" w:hanging="360"/>
       </w:pPr>
       <w:rPr>
-        <w:rFonts w:ascii="Noto Sans Symbols" w:hAnsi="Noto Sans Symbols" w:eastAsia="Noto Sans Symbols" w:cs="Noto Sans Symbols"/>
+        <w:rFonts w:ascii="Noto Sans Symbols" w:eastAsia="Noto Sans Symbols" w:hAnsi="Noto Sans Symbols" w:cs="Noto Sans Symbols"/>
         <w:sz w:val="20"/>
         <w:szCs w:val="20"/>
       </w:rPr>
@@ -1446,7 +1557,7 @@
         <w:ind w:left="2880" w:hanging="360"/>
       </w:pPr>
       <w:rPr>
-        <w:rFonts w:ascii="Noto Sans Symbols" w:hAnsi="Noto Sans Symbols" w:eastAsia="Noto Sans Symbols" w:cs="Noto Sans Symbols"/>
+        <w:rFonts w:ascii="Noto Sans Symbols" w:eastAsia="Noto Sans Symbols" w:hAnsi="Noto Sans Symbols" w:cs="Noto Sans Symbols"/>
         <w:sz w:val="20"/>
         <w:szCs w:val="20"/>
       </w:rPr>
@@ -1460,7 +1571,7 @@
         <w:ind w:left="3600" w:hanging="360"/>
       </w:pPr>
       <w:rPr>
-        <w:rFonts w:ascii="Noto Sans Symbols" w:hAnsi="Noto Sans Symbols" w:eastAsia="Noto Sans Symbols" w:cs="Noto Sans Symbols"/>
+        <w:rFonts w:ascii="Noto Sans Symbols" w:eastAsia="Noto Sans Symbols" w:hAnsi="Noto Sans Symbols" w:cs="Noto Sans Symbols"/>
         <w:sz w:val="20"/>
         <w:szCs w:val="20"/>
       </w:rPr>
@@ -1474,7 +1585,7 @@
         <w:ind w:left="4320" w:hanging="360"/>
       </w:pPr>
       <w:rPr>
-        <w:rFonts w:ascii="Noto Sans Symbols" w:hAnsi="Noto Sans Symbols" w:eastAsia="Noto Sans Symbols" w:cs="Noto Sans Symbols"/>
+        <w:rFonts w:ascii="Noto Sans Symbols" w:eastAsia="Noto Sans Symbols" w:hAnsi="Noto Sans Symbols" w:cs="Noto Sans Symbols"/>
         <w:sz w:val="20"/>
         <w:szCs w:val="20"/>
       </w:rPr>
@@ -1488,7 +1599,7 @@
         <w:ind w:left="5040" w:hanging="360"/>
       </w:pPr>
       <w:rPr>
-        <w:rFonts w:ascii="Noto Sans Symbols" w:hAnsi="Noto Sans Symbols" w:eastAsia="Noto Sans Symbols" w:cs="Noto Sans Symbols"/>
+        <w:rFonts w:ascii="Noto Sans Symbols" w:eastAsia="Noto Sans Symbols" w:hAnsi="Noto Sans Symbols" w:cs="Noto Sans Symbols"/>
         <w:sz w:val="20"/>
         <w:szCs w:val="20"/>
       </w:rPr>
@@ -1502,7 +1613,7 @@
         <w:ind w:left="5760" w:hanging="360"/>
       </w:pPr>
       <w:rPr>
-        <w:rFonts w:ascii="Noto Sans Symbols" w:hAnsi="Noto Sans Symbols" w:eastAsia="Noto Sans Symbols" w:cs="Noto Sans Symbols"/>
+        <w:rFonts w:ascii="Noto Sans Symbols" w:eastAsia="Noto Sans Symbols" w:hAnsi="Noto Sans Symbols" w:cs="Noto Sans Symbols"/>
         <w:sz w:val="20"/>
         <w:szCs w:val="20"/>
       </w:rPr>
@@ -1516,7 +1627,7 @@
         <w:ind w:left="6480" w:hanging="360"/>
       </w:pPr>
       <w:rPr>
-        <w:rFonts w:ascii="Noto Sans Symbols" w:hAnsi="Noto Sans Symbols" w:eastAsia="Noto Sans Symbols" w:cs="Noto Sans Symbols"/>
+        <w:rFonts w:ascii="Noto Sans Symbols" w:eastAsia="Noto Sans Symbols" w:hAnsi="Noto Sans Symbols" w:cs="Noto Sans Symbols"/>
         <w:sz w:val="20"/>
         <w:szCs w:val="20"/>
       </w:rPr>
@@ -1535,11 +1646,11 @@
 </file>
 
 <file path=word/styles.xml><?xml version="1.0" encoding="utf-8"?>
-<w:styles xmlns:wp14="http://schemas.microsoft.com/office/word/2010/wordprocessingDrawing" xmlns:mc="http://schemas.openxmlformats.org/markup-compatibility/2006" xmlns:r="http://schemas.openxmlformats.org/officeDocument/2006/relationships" xmlns:w="http://schemas.openxmlformats.org/wordprocessingml/2006/main" xmlns:w14="http://schemas.microsoft.com/office/word/2010/wordml" xmlns:w15="http://schemas.microsoft.com/office/word/2012/wordml" xmlns:w16cex="http://schemas.microsoft.com/office/word/2018/wordml/cex" xmlns:w16cid="http://schemas.microsoft.com/office/word/2016/wordml/cid" xmlns:w16="http://schemas.microsoft.com/office/word/2018/wordml" xmlns:w16du="http://schemas.microsoft.com/office/word/2023/wordml/word16du" xmlns:w16sdtdh="http://schemas.microsoft.com/office/word/2020/wordml/sdtdatahash" xmlns:w16sdtfl="http://schemas.microsoft.com/office/word/2024/wordml/sdtformatlock" xmlns:w16se="http://schemas.microsoft.com/office/word/2015/wordml/symex" mc:Ignorable="w14 w15 w16se w16cid w16 w16cex w16sdtdh w16sdtfl w16du wp14">
+<w:styles xmlns:mc="http://schemas.openxmlformats.org/markup-compatibility/2006" xmlns:r="http://schemas.openxmlformats.org/officeDocument/2006/relationships" xmlns:w="http://schemas.openxmlformats.org/wordprocessingml/2006/main" xmlns:w14="http://schemas.microsoft.com/office/word/2010/wordml" xmlns:w15="http://schemas.microsoft.com/office/word/2012/wordml" xmlns:w16cex="http://schemas.microsoft.com/office/word/2018/wordml/cex" xmlns:w16cid="http://schemas.microsoft.com/office/word/2016/wordml/cid" xmlns:w16="http://schemas.microsoft.com/office/word/2018/wordml" xmlns:w16du="http://schemas.microsoft.com/office/word/2023/wordml/word16du" xmlns:w16sdtdh="http://schemas.microsoft.com/office/word/2020/wordml/sdtdatahash" xmlns:w16sdtfl="http://schemas.microsoft.com/office/word/2024/wordml/sdtformatlock" xmlns:w16se="http://schemas.microsoft.com/office/word/2015/wordml/symex" mc:Ignorable="w14 w15 w16se w16cid w16 w16cex w16sdtdh w16sdtfl w16du">
   <w:docDefaults>
     <w:rPrDefault>
       <w:rPr>
-        <w:rFonts w:ascii="Arial" w:hAnsi="Arial" w:eastAsia="Arial" w:cs="Arial"/>
+        <w:rFonts w:ascii="Arial" w:eastAsia="Arial" w:hAnsi="Arial" w:cs="Arial"/>
         <w:sz w:val="22"/>
         <w:szCs w:val="22"/>
         <w:lang w:val="de-DE" w:eastAsia="de-DE" w:bidi="ar-SA"/>
@@ -1554,14 +1665,14 @@
   <w:latentStyles w:defLockedState="0" w:defUIPriority="99" w:defSemiHidden="0" w:defUnhideWhenUsed="0" w:defQFormat="0" w:count="376">
     <w:lsdException w:name="Normal" w:uiPriority="0" w:qFormat="1"/>
     <w:lsdException w:name="heading 1" w:uiPriority="9" w:qFormat="1"/>
-    <w:lsdException w:name="heading 2" w:uiPriority="9" w:semiHidden="1" w:unhideWhenUsed="1" w:qFormat="1"/>
-    <w:lsdException w:name="heading 3" w:uiPriority="9" w:semiHidden="1" w:unhideWhenUsed="1" w:qFormat="1"/>
-    <w:lsdException w:name="heading 4" w:uiPriority="9" w:semiHidden="1" w:unhideWhenUsed="1" w:qFormat="1"/>
-    <w:lsdException w:name="heading 5" w:uiPriority="9" w:semiHidden="1" w:unhideWhenUsed="1" w:qFormat="1"/>
-    <w:lsdException w:name="heading 6" w:uiPriority="9" w:semiHidden="1" w:unhideWhenUsed="1" w:qFormat="1"/>
-    <w:lsdException w:name="heading 7" w:uiPriority="9" w:semiHidden="1" w:unhideWhenUsed="1" w:qFormat="1"/>
-    <w:lsdException w:name="heading 8" w:uiPriority="9" w:semiHidden="1" w:unhideWhenUsed="1" w:qFormat="1"/>
-    <w:lsdException w:name="heading 9" w:uiPriority="9" w:semiHidden="1" w:unhideWhenUsed="1" w:qFormat="1"/>
+    <w:lsdException w:name="heading 2" w:semiHidden="1" w:uiPriority="9" w:unhideWhenUsed="1" w:qFormat="1"/>
+    <w:lsdException w:name="heading 3" w:semiHidden="1" w:uiPriority="9" w:unhideWhenUsed="1" w:qFormat="1"/>
+    <w:lsdException w:name="heading 4" w:semiHidden="1" w:uiPriority="9" w:unhideWhenUsed="1" w:qFormat="1"/>
+    <w:lsdException w:name="heading 5" w:semiHidden="1" w:uiPriority="9" w:unhideWhenUsed="1" w:qFormat="1"/>
+    <w:lsdException w:name="heading 6" w:semiHidden="1" w:uiPriority="9" w:unhideWhenUsed="1" w:qFormat="1"/>
+    <w:lsdException w:name="heading 7" w:semiHidden="1" w:uiPriority="9" w:unhideWhenUsed="1" w:qFormat="1"/>
+    <w:lsdException w:name="heading 8" w:semiHidden="1" w:uiPriority="9" w:unhideWhenUsed="1" w:qFormat="1"/>
+    <w:lsdException w:name="heading 9" w:semiHidden="1" w:uiPriority="9" w:unhideWhenUsed="1" w:qFormat="1"/>
     <w:lsdException w:name="index 1" w:semiHidden="1" w:unhideWhenUsed="1"/>
     <w:lsdException w:name="index 2" w:semiHidden="1" w:unhideWhenUsed="1"/>
     <w:lsdException w:name="index 3" w:semiHidden="1" w:unhideWhenUsed="1"/>
@@ -1571,22 +1682,22 @@
     <w:lsdException w:name="index 7" w:semiHidden="1" w:unhideWhenUsed="1"/>
     <w:lsdException w:name="index 8" w:semiHidden="1" w:unhideWhenUsed="1"/>
     <w:lsdException w:name="index 9" w:semiHidden="1" w:unhideWhenUsed="1"/>
-    <w:lsdException w:name="toc 1" w:uiPriority="39" w:semiHidden="1" w:unhideWhenUsed="1"/>
-    <w:lsdException w:name="toc 2" w:uiPriority="39" w:semiHidden="1" w:unhideWhenUsed="1"/>
-    <w:lsdException w:name="toc 3" w:uiPriority="39" w:semiHidden="1" w:unhideWhenUsed="1"/>
-    <w:lsdException w:name="toc 4" w:uiPriority="39" w:semiHidden="1" w:unhideWhenUsed="1"/>
-    <w:lsdException w:name="toc 5" w:uiPriority="39" w:semiHidden="1" w:unhideWhenUsed="1"/>
-    <w:lsdException w:name="toc 6" w:uiPriority="39" w:semiHidden="1" w:unhideWhenUsed="1"/>
-    <w:lsdException w:name="toc 7" w:uiPriority="39" w:semiHidden="1" w:unhideWhenUsed="1"/>
-    <w:lsdException w:name="toc 8" w:uiPriority="39" w:semiHidden="1" w:unhideWhenUsed="1"/>
-    <w:lsdException w:name="toc 9" w:uiPriority="39" w:semiHidden="1" w:unhideWhenUsed="1"/>
+    <w:lsdException w:name="toc 1" w:semiHidden="1" w:uiPriority="39" w:unhideWhenUsed="1"/>
+    <w:lsdException w:name="toc 2" w:semiHidden="1" w:uiPriority="39" w:unhideWhenUsed="1"/>
+    <w:lsdException w:name="toc 3" w:semiHidden="1" w:uiPriority="39" w:unhideWhenUsed="1"/>
+    <w:lsdException w:name="toc 4" w:semiHidden="1" w:uiPriority="39" w:unhideWhenUsed="1"/>
+    <w:lsdException w:name="toc 5" w:semiHidden="1" w:uiPriority="39" w:unhideWhenUsed="1"/>
+    <w:lsdException w:name="toc 6" w:semiHidden="1" w:uiPriority="39" w:unhideWhenUsed="1"/>
+    <w:lsdException w:name="toc 7" w:semiHidden="1" w:uiPriority="39" w:unhideWhenUsed="1"/>
+    <w:lsdException w:name="toc 8" w:semiHidden="1" w:uiPriority="39" w:unhideWhenUsed="1"/>
+    <w:lsdException w:name="toc 9" w:semiHidden="1" w:uiPriority="39" w:unhideWhenUsed="1"/>
     <w:lsdException w:name="Normal Indent" w:semiHidden="1" w:unhideWhenUsed="1"/>
     <w:lsdException w:name="footnote text" w:semiHidden="1" w:unhideWhenUsed="1"/>
     <w:lsdException w:name="annotation text" w:semiHidden="1" w:unhideWhenUsed="1"/>
     <w:lsdException w:name="header" w:semiHidden="1" w:unhideWhenUsed="1"/>
     <w:lsdException w:name="footer" w:semiHidden="1" w:unhideWhenUsed="1"/>
     <w:lsdException w:name="index heading" w:semiHidden="1" w:unhideWhenUsed="1"/>
-    <w:lsdException w:name="caption" w:uiPriority="35" w:semiHidden="1" w:unhideWhenUsed="1" w:qFormat="1"/>
+    <w:lsdException w:name="caption" w:semiHidden="1" w:uiPriority="35" w:unhideWhenUsed="1" w:qFormat="1"/>
     <w:lsdException w:name="table of figures" w:semiHidden="1" w:unhideWhenUsed="1"/>
     <w:lsdException w:name="envelope address" w:semiHidden="1" w:unhideWhenUsed="1"/>
     <w:lsdException w:name="envelope return" w:semiHidden="1" w:unhideWhenUsed="1"/>
@@ -1617,7 +1728,7 @@
     <w:lsdException w:name="Title" w:uiPriority="10" w:qFormat="1"/>
     <w:lsdException w:name="Closing" w:semiHidden="1" w:unhideWhenUsed="1"/>
     <w:lsdException w:name="Signature" w:semiHidden="1" w:unhideWhenUsed="1"/>
-    <w:lsdException w:name="Default Paragraph Font" w:uiPriority="1" w:semiHidden="1" w:unhideWhenUsed="1"/>
+    <w:lsdException w:name="Default Paragraph Font" w:semiHidden="1" w:uiPriority="1" w:unhideWhenUsed="1"/>
     <w:lsdException w:name="Body Text" w:semiHidden="1" w:unhideWhenUsed="1"/>
     <w:lsdException w:name="Body Text Indent" w:semiHidden="1" w:unhideWhenUsed="1"/>
     <w:lsdException w:name="List Continue" w:semiHidden="1" w:unhideWhenUsed="1"/>
@@ -1817,8 +1928,8 @@
     <w:lsdException w:name="Subtle Reference" w:uiPriority="31" w:qFormat="1"/>
     <w:lsdException w:name="Intense Reference" w:uiPriority="32" w:qFormat="1"/>
     <w:lsdException w:name="Book Title" w:uiPriority="33" w:qFormat="1"/>
-    <w:lsdException w:name="Bibliography" w:uiPriority="37" w:semiHidden="1" w:unhideWhenUsed="1"/>
-    <w:lsdException w:name="TOC Heading" w:uiPriority="39" w:semiHidden="1" w:unhideWhenUsed="1" w:qFormat="1"/>
+    <w:lsdException w:name="Bibliography" w:semiHidden="1" w:uiPriority="37" w:unhideWhenUsed="1"/>
+    <w:lsdException w:name="TOC Heading" w:semiHidden="1" w:uiPriority="39" w:unhideWhenUsed="1" w:qFormat="1"/>
     <w:lsdException w:name="Plain Table 1" w:uiPriority="41"/>
     <w:lsdException w:name="Plain Table 2" w:uiPriority="42"/>
     <w:lsdException w:name="Plain Table 3" w:uiPriority="43"/>
@@ -1929,7 +2040,7 @@
     <w:lsdException w:name="Unresolved Mention" w:semiHidden="1" w:unhideWhenUsed="1"/>
     <w:lsdException w:name="Smart Link" w:semiHidden="1" w:unhideWhenUsed="1"/>
   </w:latentStyles>
-  <w:style w:type="paragraph" w:styleId="Normal" w:default="1">
+  <w:style w:type="paragraph" w:default="1" w:styleId="Normal">
     <w:name w:val="Normal"/>
     <w:qFormat/>
     <w:rsid w:val="00EA3FD1"/>
@@ -2050,13 +2161,13 @@
       <w:szCs w:val="20"/>
     </w:rPr>
   </w:style>
-  <w:style w:type="character" w:styleId="DefaultParagraphFont" w:default="1">
+  <w:style w:type="character" w:default="1" w:styleId="DefaultParagraphFont">
     <w:name w:val="Default Paragraph Font"/>
     <w:uiPriority w:val="1"/>
     <w:semiHidden/>
     <w:unhideWhenUsed/>
   </w:style>
-  <w:style w:type="table" w:styleId="TableNormal" w:default="1">
+  <w:style w:type="table" w:default="1" w:styleId="TableNormal">
     <w:name w:val="Normal Table"/>
     <w:uiPriority w:val="99"/>
     <w:semiHidden/>
@@ -2071,13 +2182,13 @@
       </w:tblCellMar>
     </w:tblPr>
   </w:style>
-  <w:style w:type="numbering" w:styleId="NoList" w:default="1">
+  <w:style w:type="numbering" w:default="1" w:styleId="NoList">
     <w:name w:val="No List"/>
     <w:uiPriority w:val="99"/>
     <w:semiHidden/>
     <w:unhideWhenUsed/>
   </w:style>
-  <w:style w:type="table" w:styleId="TableNormal1" w:customStyle="1">
+  <w:style w:type="table" w:customStyle="1" w:styleId="TableNormal1">
     <w:name w:val="Table Normal1"/>
     <w:tblPr>
       <w:tblCellMar>
@@ -2119,7 +2230,7 @@
       </w:tabs>
     </w:pPr>
   </w:style>
-  <w:style w:type="character" w:styleId="HeaderChar" w:customStyle="1">
+  <w:style w:type="character" w:customStyle="1" w:styleId="HeaderChar">
     <w:name w:val="Header Char"/>
     <w:basedOn w:val="DefaultParagraphFont"/>
     <w:link w:val="Header"/>
@@ -2140,14 +2251,14 @@
       </w:tabs>
     </w:pPr>
   </w:style>
-  <w:style w:type="character" w:styleId="FooterChar" w:customStyle="1">
+  <w:style w:type="character" w:customStyle="1" w:styleId="FooterChar">
     <w:name w:val="Footer Char"/>
     <w:basedOn w:val="DefaultParagraphFont"/>
     <w:link w:val="Footer"/>
     <w:uiPriority w:val="99"/>
     <w:rsid w:val="00270B1B"/>
   </w:style>
-  <w:style w:type="paragraph" w:styleId="201FO01Dokumentenhinweis" w:customStyle="1">
+  <w:style w:type="paragraph" w:customStyle="1" w:styleId="201FO01Dokumentenhinweis">
     <w:name w:val="201FO01 Dokumentenhinweis"/>
     <w:basedOn w:val="Normal"/>
     <w:rsid w:val="00AB3E78"/>
@@ -2181,7 +2292,7 @@
       <w:contextualSpacing/>
     </w:pPr>
   </w:style>
-  <w:style w:type="paragraph" w:styleId="contactitem" w:customStyle="1">
+  <w:style w:type="paragraph" w:customStyle="1" w:styleId="contactitem">
     <w:name w:val="contactitem"/>
     <w:basedOn w:val="Normal"/>
     <w:rsid w:val="00D25753"/>
@@ -2189,17 +2300,17 @@
       <w:spacing w:before="100" w:beforeAutospacing="1" w:after="100" w:afterAutospacing="1" w:line="240" w:lineRule="auto"/>
     </w:pPr>
     <w:rPr>
-      <w:rFonts w:ascii="Times New Roman" w:hAnsi="Times New Roman" w:eastAsia="Times New Roman" w:cs="Times New Roman"/>
+      <w:rFonts w:ascii="Times New Roman" w:eastAsia="Times New Roman" w:hAnsi="Times New Roman" w:cs="Times New Roman"/>
       <w:sz w:val="24"/>
       <w:szCs w:val="24"/>
     </w:rPr>
   </w:style>
-  <w:style w:type="character" w:styleId="key" w:customStyle="1">
+  <w:style w:type="character" w:customStyle="1" w:styleId="key">
     <w:name w:val="key"/>
     <w:basedOn w:val="DefaultParagraphFont"/>
     <w:rsid w:val="00D25753"/>
   </w:style>
-  <w:style w:type="character" w:styleId="value" w:customStyle="1">
+  <w:style w:type="character" w:customStyle="1" w:styleId="value">
     <w:name w:val="value"/>
     <w:basedOn w:val="DefaultParagraphFont"/>
     <w:rsid w:val="00D25753"/>
@@ -2225,7 +2336,7 @@
       <w:spacing w:before="360" w:after="80"/>
     </w:pPr>
     <w:rPr>
-      <w:rFonts w:ascii="Georgia" w:hAnsi="Georgia" w:eastAsia="Georgia" w:cs="Georgia"/>
+      <w:rFonts w:ascii="Georgia" w:eastAsia="Georgia" w:hAnsi="Georgia" w:cs="Georgia"/>
       <w:i/>
       <w:color w:val="666666"/>
       <w:sz w:val="48"/>
@@ -2236,7 +2347,7 @@
 </file>
 
 <file path=word/theme/theme1.xml><?xml version="1.0" encoding="utf-8"?>
-<a:theme xmlns:a="http://schemas.openxmlformats.org/drawingml/2006/main" xmlns:thm15="http://schemas.microsoft.com/office/thememl/2012/main" name="Office">
+<a:theme xmlns:a="http://schemas.openxmlformats.org/drawingml/2006/main" name="Office">
   <a:themeElements>
     <a:clrScheme name="Office">
       <a:dk1>

</xml_diff>

<commit_message>
feat(ModelPage): fix logo ratio and update the model doc.
</commit_message>
<xml_diff>
--- a/templates/model_1.docx
+++ b/templates/model_1.docx
@@ -582,14 +582,10 @@
       </w:pPr>
     </w:p>
     <w:sectPr>
-      <w:headerReference w:type="even" r:id="rId9"/>
-      <w:headerReference w:type="default" r:id="rId10"/>
-      <w:footerReference w:type="even" r:id="rId11"/>
-      <w:footerReference w:type="default" r:id="rId12"/>
-      <w:headerReference w:type="first" r:id="rId13"/>
-      <w:footerReference w:type="first" r:id="rId14"/>
+      <w:headerReference w:type="default" r:id="rId9"/>
+      <w:footerReference w:type="default" r:id="rId10"/>
       <w:pgSz w:w="11906" w:h="16838"/>
-      <w:pgMar w:top="1701" w:right="1418" w:bottom="1701" w:left="1418" w:header="709" w:footer="709" w:gutter="0"/>
+      <w:pgMar w:top="1701" w:right="1418" w:bottom="1701" w:left="1418" w:header="100" w:footer="709" w:gutter="0"/>
       <w:pgNumType w:start="1"/>
       <w:cols w:space="720"/>
     </w:sectPr>
@@ -627,22 +623,12 @@
   <w:p>
     <w:pPr>
       <w:pStyle w:val="Footer"/>
-    </w:pPr>
-  </w:p>
-</w:ftr>
-</file>
-
-<file path=word/footer2.xml><?xml version="1.0" encoding="utf-8"?>
-<w:ftr xmlns:wpc="http://schemas.microsoft.com/office/word/2010/wordprocessingCanvas" xmlns:cx="http://schemas.microsoft.com/office/drawing/2014/chartex" xmlns:cx1="http://schemas.microsoft.com/office/drawing/2015/9/8/chartex" xmlns:cx2="http://schemas.microsoft.com/office/drawing/2015/10/21/chartex" xmlns:cx3="http://schemas.microsoft.com/office/drawing/2016/5/9/chartex" xmlns:cx4="http://schemas.microsoft.com/office/drawing/2016/5/10/chartex" xmlns:cx5="http://schemas.microsoft.com/office/drawing/2016/5/11/chartex" xmlns:cx6="http://schemas.microsoft.com/office/drawing/2016/5/12/chartex" xmlns:cx7="http://schemas.microsoft.com/office/drawing/2016/5/13/chartex" xmlns:cx8="http://schemas.microsoft.com/office/drawing/2016/5/14/chartex" xmlns:mc="http://schemas.openxmlformats.org/markup-compatibility/2006" xmlns:aink="http://schemas.microsoft.com/office/drawing/2016/ink" xmlns:am3d="http://schemas.microsoft.com/office/drawing/2017/model3d" xmlns:o="urn:schemas-microsoft-com:office:office" xmlns:oel="http://schemas.microsoft.com/office/2019/extlst" xmlns:r="http://schemas.openxmlformats.org/officeDocument/2006/relationships" xmlns:m="http://schemas.openxmlformats.org/officeDocument/2006/math" xmlns:v="urn:schemas-microsoft-com:vml" xmlns:wp14="http://schemas.microsoft.com/office/word/2010/wordprocessingDrawing" xmlns:wp="http://schemas.openxmlformats.org/drawingml/2006/wordprocessingDrawing" xmlns:w10="urn:schemas-microsoft-com:office:word" xmlns:w="http://schemas.openxmlformats.org/wordprocessingml/2006/main" xmlns:w14="http://schemas.microsoft.com/office/word/2010/wordml" xmlns:w15="http://schemas.microsoft.com/office/word/2012/wordml" xmlns:w16cex="http://schemas.microsoft.com/office/word/2018/wordml/cex" xmlns:w16cid="http://schemas.microsoft.com/office/word/2016/wordml/cid" xmlns:w16="http://schemas.microsoft.com/office/word/2018/wordml" xmlns:w16du="http://schemas.microsoft.com/office/word/2023/wordml/word16du" xmlns:w16sdtdh="http://schemas.microsoft.com/office/word/2020/wordml/sdtdatahash" xmlns:w16sdtfl="http://schemas.microsoft.com/office/word/2024/wordml/sdtformatlock" xmlns:w16se="http://schemas.microsoft.com/office/word/2015/wordml/symex" xmlns:wpg="http://schemas.microsoft.com/office/word/2010/wordprocessingGroup" xmlns:wpi="http://schemas.microsoft.com/office/word/2010/wordprocessingInk" xmlns:wne="http://schemas.microsoft.com/office/word/2006/wordml" xmlns:wps="http://schemas.microsoft.com/office/word/2010/wordprocessingShape" mc:Ignorable="w14 w15 w16se w16cid w16 w16cex w16sdtdh w16sdtfl w16du wp14">
-  <w:bookmarkStart w:id="0" w:name="_Hlk167319170"/>
-  <w:bookmarkStart w:id="1" w:name="_Hlk167319171"/>
-  <w:p>
-    <w:pPr>
-      <w:pStyle w:val="Footer"/>
       <w:pBdr>
         <w:top w:val="single" w:sz="4" w:space="1" w:color="D9D9D9" w:themeColor="background1" w:themeShade="D9"/>
       </w:pBdr>
     </w:pPr>
+    <w:bookmarkStart w:id="0" w:name="_Hlk167319170"/>
+    <w:bookmarkStart w:id="1" w:name="_Hlk167319171"/>
     <w:r>
       <w:rPr>
         <w:noProof/>
@@ -877,146 +863,237 @@
       </mc:AlternateContent>
     </w:r>
   </w:p>
-  <w:bookmarkEnd w:id="0"/>
-  <w:bookmarkEnd w:id="1"/>
+  <w:tbl>
+    <w:tblPr>
+      <w:tblStyle w:val="TableGrid"/>
+      <w:tblW w:w="9634" w:type="dxa"/>
+      <w:tblBorders>
+        <w:top w:val="none" w:sz="0" w:space="0" w:color="auto"/>
+        <w:left w:val="none" w:sz="0" w:space="0" w:color="auto"/>
+        <w:bottom w:val="none" w:sz="0" w:space="0" w:color="auto"/>
+        <w:right w:val="none" w:sz="0" w:space="0" w:color="auto"/>
+        <w:insideH w:val="none" w:sz="0" w:space="0" w:color="auto"/>
+        <w:insideV w:val="none" w:sz="0" w:space="0" w:color="auto"/>
+      </w:tblBorders>
+      <w:tblLook w:val="04A0" w:firstRow="1" w:lastRow="0" w:firstColumn="1" w:lastColumn="0" w:noHBand="0" w:noVBand="1"/>
+    </w:tblPr>
+    <w:tblGrid>
+      <w:gridCol w:w="6663"/>
+      <w:gridCol w:w="2971"/>
+    </w:tblGrid>
+    <w:tr>
+      <w:tc>
+        <w:tcPr>
+          <w:tcW w:w="6663" w:type="dxa"/>
+        </w:tcPr>
+        <w:p>
+          <w:pPr>
+            <w:rPr>
+              <w:rFonts w:cstheme="minorBidi"/>
+            </w:rPr>
+          </w:pPr>
+          <w:r>
+            <w:rPr>
+              <w:rFonts w:cstheme="minorBidi"/>
+            </w:rPr>
+            <w:t>Version: 1</w:t>
+          </w:r>
+        </w:p>
+      </w:tc>
+      <w:tc>
+        <w:tcPr>
+          <w:tcW w:w="2971" w:type="dxa"/>
+        </w:tcPr>
+        <w:p>
+          <w:pPr>
+            <w:rPr>
+              <w:rFonts w:cstheme="minorBidi"/>
+            </w:rPr>
+          </w:pPr>
+        </w:p>
+      </w:tc>
+    </w:tr>
+    <w:bookmarkEnd w:id="0"/>
+    <w:bookmarkEnd w:id="1"/>
+    <w:tr>
+      <w:tc>
+        <w:tcPr>
+          <w:tcW w:w="6663" w:type="dxa"/>
+        </w:tcPr>
+        <w:p>
+          <w:pPr>
+            <w:rPr>
+              <w:rFonts w:cstheme="minorBidi"/>
+            </w:rPr>
+          </w:pPr>
+          <w:r>
+            <w:rPr>
+              <w:rFonts w:cstheme="minorBidi"/>
+            </w:rPr>
+            <w:t>Erstellt: {</w:t>
+          </w:r>
+          <w:proofErr w:type="spellStart"/>
+          <w:r>
+            <w:rPr>
+              <w:rFonts w:cstheme="minorBidi"/>
+            </w:rPr>
+            <w:t>ceo_name</w:t>
+          </w:r>
+          <w:proofErr w:type="spellEnd"/>
+          <w:r>
+            <w:rPr>
+              <w:rFonts w:cstheme="minorBidi"/>
+            </w:rPr>
+            <w:t>}</w:t>
+          </w:r>
+        </w:p>
+      </w:tc>
+      <w:tc>
+        <w:tcPr>
+          <w:tcW w:w="2971" w:type="dxa"/>
+        </w:tcPr>
+        <w:p>
+          <w:pPr>
+            <w:rPr>
+              <w:rFonts w:cstheme="minorBidi"/>
+            </w:rPr>
+          </w:pPr>
+        </w:p>
+      </w:tc>
+    </w:tr>
+    <w:tr>
+      <w:tc>
+        <w:tcPr>
+          <w:tcW w:w="6663" w:type="dxa"/>
+        </w:tcPr>
+        <w:p>
+          <w:pPr>
+            <w:pStyle w:val="Footer"/>
+            <w:jc w:val="center"/>
+            <w:rPr>
+              <w:noProof/>
+            </w:rPr>
+          </w:pPr>
+          <w:r>
+            <w:rPr>
+              <w:rFonts w:cstheme="minorBidi"/>
+            </w:rPr>
+            <w:t>Freigegeben</w:t>
+          </w:r>
+          <w:r>
+            <w:rPr>
+              <w:rFonts w:cstheme="minorBidi"/>
+              <w:b/>
+              <w:bCs/>
+            </w:rPr>
+            <w:t>: {</w:t>
+          </w:r>
+          <w:proofErr w:type="spellStart"/>
+          <w:r>
+            <w:rPr>
+              <w:rFonts w:cstheme="minorBidi"/>
+              <w:b/>
+              <w:bCs/>
+            </w:rPr>
+            <w:t>releasedBy</w:t>
+          </w:r>
+          <w:proofErr w:type="spellEnd"/>
+          <w:r>
+            <w:rPr>
+              <w:rFonts w:cstheme="minorBidi"/>
+              <w:b/>
+              <w:bCs/>
+            </w:rPr>
+            <w:t>}</w:t>
+          </w:r>
+          <w:r>
+            <w:tab/>
+          </w:r>
+          <w:r>
+            <w:tab/>
+          </w:r>
+        </w:p>
+      </w:tc>
+      <w:tc>
+        <w:tcPr>
+          <w:tcW w:w="2971" w:type="dxa"/>
+        </w:tcPr>
+        <w:p>
+          <w:pPr>
+            <w:pStyle w:val="Footer"/>
+            <w:jc w:val="center"/>
+            <w:rPr>
+              <w:rFonts w:cstheme="minorBidi"/>
+            </w:rPr>
+          </w:pPr>
+          <w:fldSimple w:instr=" FILENAME \* MERGEFORMAT ">
+            <w:r>
+              <w:rPr>
+                <w:noProof/>
+              </w:rPr>
+              <w:t>Kap. 5, D0 – Qualitätspolitik</w:t>
+            </w:r>
+          </w:fldSimple>
+        </w:p>
+      </w:tc>
+    </w:tr>
+    <w:tr>
+      <w:tc>
+        <w:tcPr>
+          <w:tcW w:w="6663" w:type="dxa"/>
+        </w:tcPr>
+        <w:p>
+          <w:pPr>
+            <w:rPr>
+              <w:rFonts w:cstheme="minorBidi"/>
+              <w:b/>
+              <w:bCs/>
+            </w:rPr>
+          </w:pPr>
+          <w:r>
+            <w:rPr>
+              <w:rFonts w:cstheme="minorBidi"/>
+            </w:rPr>
+            <w:t>Datum: {</w:t>
+          </w:r>
+          <w:proofErr w:type="spellStart"/>
+          <w:r>
+            <w:rPr>
+              <w:rFonts w:cstheme="minorBidi"/>
+            </w:rPr>
+            <w:t>doc_date</w:t>
+          </w:r>
+          <w:proofErr w:type="spellEnd"/>
+          <w:r>
+            <w:rPr>
+              <w:rFonts w:cstheme="minorBidi"/>
+            </w:rPr>
+            <w:t>}</w:t>
+          </w:r>
+        </w:p>
+      </w:tc>
+      <w:tc>
+        <w:tcPr>
+          <w:tcW w:w="2971" w:type="dxa"/>
+        </w:tcPr>
+        <w:p>
+          <w:pPr>
+            <w:rPr>
+              <w:rFonts w:cstheme="minorBidi"/>
+            </w:rPr>
+          </w:pPr>
+        </w:p>
+      </w:tc>
+    </w:tr>
+  </w:tbl>
   <w:p>
     <w:pPr>
       <w:spacing w:after="0"/>
       <w:rPr>
         <w:rFonts w:cstheme="minorBidi"/>
-      </w:rPr>
-    </w:pPr>
-    <w:r>
-      <w:rPr>
-        <w:rFonts w:cstheme="minorBidi"/>
-      </w:rPr>
-      <w:t>Version: 1</w:t>
-    </w:r>
-    <w:r>
-      <w:br/>
-    </w:r>
-    <w:proofErr w:type="gramStart"/>
-    <w:r>
-      <w:rPr>
-        <w:rFonts w:cstheme="minorBidi"/>
-      </w:rPr>
-      <w:t>Erstellt</w:t>
-    </w:r>
-    <w:proofErr w:type="gramEnd"/>
-    <w:r>
-      <w:rPr>
-        <w:rFonts w:cstheme="minorBidi"/>
-      </w:rPr>
-      <w:t>: {</w:t>
-    </w:r>
-    <w:proofErr w:type="spellStart"/>
-    <w:r>
-      <w:rPr>
-        <w:rFonts w:cstheme="minorBidi"/>
-      </w:rPr>
-      <w:t>ceo_name</w:t>
-    </w:r>
-    <w:proofErr w:type="spellEnd"/>
-    <w:r>
-      <w:rPr>
-        <w:rFonts w:cstheme="minorBidi"/>
-      </w:rPr>
-      <w:t>}</w:t>
-    </w:r>
-  </w:p>
-  <w:p>
-    <w:pPr>
-      <w:pStyle w:val="Footer"/>
-      <w:jc w:val="center"/>
-      <w:rPr>
-        <w:noProof/>
-      </w:rPr>
-    </w:pPr>
-    <w:r>
-      <w:rPr>
-        <w:rFonts w:cstheme="minorBidi"/>
-      </w:rPr>
-      <w:t>Freigegeben</w:t>
-    </w:r>
-    <w:r>
-      <w:rPr>
-        <w:rFonts w:cstheme="minorBidi"/>
         <w:b/>
         <w:bCs/>
       </w:rPr>
-      <w:t>: {</w:t>
-    </w:r>
-    <w:proofErr w:type="spellStart"/>
-    <w:r>
-      <w:rPr>
-        <w:rFonts w:cstheme="minorBidi"/>
-        <w:b/>
-        <w:bCs/>
-      </w:rPr>
-      <w:t>releasedBy</w:t>
-    </w:r>
-    <w:proofErr w:type="spellEnd"/>
-    <w:r>
-      <w:rPr>
-        <w:rFonts w:cstheme="minorBidi"/>
-        <w:b/>
-        <w:bCs/>
-      </w:rPr>
-      <w:t>}</w:t>
-    </w:r>
-    <w:r>
-      <w:tab/>
-    </w:r>
-    <w:r>
-      <w:tab/>
-    </w:r>
-    <w:fldSimple w:instr=" FILENAME \* MERGEFORMAT ">
-      <w:r>
-        <w:rPr>
-          <w:noProof/>
-        </w:rPr>
-        <w:t>Kap. 5, D0 – Qualitätspolitik</w:t>
-      </w:r>
-    </w:fldSimple>
-  </w:p>
-  <w:p>
-    <w:pPr>
-      <w:spacing w:after="0"/>
-      <w:rPr>
-        <w:rFonts w:cstheme="minorBidi"/>
-        <w:b/>
-        <w:bCs/>
-      </w:rPr>
-    </w:pPr>
-    <w:r>
-      <w:rPr>
-        <w:rFonts w:cstheme="minorBidi"/>
-      </w:rPr>
-      <w:t>Datum: {</w:t>
-    </w:r>
-    <w:proofErr w:type="spellStart"/>
-    <w:r>
-      <w:rPr>
-        <w:rFonts w:cstheme="minorBidi"/>
-      </w:rPr>
-      <w:t>doc_date</w:t>
-    </w:r>
-    <w:proofErr w:type="spellEnd"/>
-    <w:r>
-      <w:rPr>
-        <w:rFonts w:cstheme="minorBidi"/>
-      </w:rPr>
-      <w:t>}</w:t>
-    </w:r>
-  </w:p>
-</w:ftr>
-</file>
-
-<file path=word/footer3.xml><?xml version="1.0" encoding="utf-8"?>
-<w:ftr xmlns:wpc="http://schemas.microsoft.com/office/word/2010/wordprocessingCanvas" xmlns:cx="http://schemas.microsoft.com/office/drawing/2014/chartex" xmlns:cx1="http://schemas.microsoft.com/office/drawing/2015/9/8/chartex" xmlns:cx2="http://schemas.microsoft.com/office/drawing/2015/10/21/chartex" xmlns:cx3="http://schemas.microsoft.com/office/drawing/2016/5/9/chartex" xmlns:cx4="http://schemas.microsoft.com/office/drawing/2016/5/10/chartex" xmlns:cx5="http://schemas.microsoft.com/office/drawing/2016/5/11/chartex" xmlns:cx6="http://schemas.microsoft.com/office/drawing/2016/5/12/chartex" xmlns:cx7="http://schemas.microsoft.com/office/drawing/2016/5/13/chartex" xmlns:cx8="http://schemas.microsoft.com/office/drawing/2016/5/14/chartex" xmlns:mc="http://schemas.openxmlformats.org/markup-compatibility/2006" xmlns:aink="http://schemas.microsoft.com/office/drawing/2016/ink" xmlns:am3d="http://schemas.microsoft.com/office/drawing/2017/model3d" xmlns:o="urn:schemas-microsoft-com:office:office" xmlns:oel="http://schemas.microsoft.com/office/2019/extlst" xmlns:r="http://schemas.openxmlformats.org/officeDocument/2006/relationships" xmlns:m="http://schemas.openxmlformats.org/officeDocument/2006/math" xmlns:v="urn:schemas-microsoft-com:vml" xmlns:wp14="http://schemas.microsoft.com/office/word/2010/wordprocessingDrawing" xmlns:wp="http://schemas.openxmlformats.org/drawingml/2006/wordprocessingDrawing" xmlns:w10="urn:schemas-microsoft-com:office:word" xmlns:w="http://schemas.openxmlformats.org/wordprocessingml/2006/main" xmlns:w14="http://schemas.microsoft.com/office/word/2010/wordml" xmlns:w15="http://schemas.microsoft.com/office/word/2012/wordml" xmlns:w16cex="http://schemas.microsoft.com/office/word/2018/wordml/cex" xmlns:w16cid="http://schemas.microsoft.com/office/word/2016/wordml/cid" xmlns:w16="http://schemas.microsoft.com/office/word/2018/wordml" xmlns:w16du="http://schemas.microsoft.com/office/word/2023/wordml/word16du" xmlns:w16sdtdh="http://schemas.microsoft.com/office/word/2020/wordml/sdtdatahash" xmlns:w16sdtfl="http://schemas.microsoft.com/office/word/2024/wordml/sdtformatlock" xmlns:w16se="http://schemas.microsoft.com/office/word/2015/wordml/symex" xmlns:wpg="http://schemas.microsoft.com/office/word/2010/wordprocessingGroup" xmlns:wpi="http://schemas.microsoft.com/office/word/2010/wordprocessingInk" xmlns:wne="http://schemas.microsoft.com/office/word/2006/wordml" xmlns:wps="http://schemas.microsoft.com/office/word/2010/wordprocessingShape" mc:Ignorable="w14 w15 w16se w16cid w16 w16cex w16sdtdh w16sdtfl w16du wp14">
-  <w:p>
-    <w:pPr>
-      <w:pStyle w:val="Footer"/>
     </w:pPr>
   </w:p>
 </w:ftr>
@@ -1048,16 +1125,6 @@
 </file>
 
 <file path=word/header1.xml><?xml version="1.0" encoding="utf-8"?>
-<w:hdr xmlns:wpc="http://schemas.microsoft.com/office/word/2010/wordprocessingCanvas" xmlns:cx="http://schemas.microsoft.com/office/drawing/2014/chartex" xmlns:cx1="http://schemas.microsoft.com/office/drawing/2015/9/8/chartex" xmlns:cx2="http://schemas.microsoft.com/office/drawing/2015/10/21/chartex" xmlns:cx3="http://schemas.microsoft.com/office/drawing/2016/5/9/chartex" xmlns:cx4="http://schemas.microsoft.com/office/drawing/2016/5/10/chartex" xmlns:cx5="http://schemas.microsoft.com/office/drawing/2016/5/11/chartex" xmlns:cx6="http://schemas.microsoft.com/office/drawing/2016/5/12/chartex" xmlns:cx7="http://schemas.microsoft.com/office/drawing/2016/5/13/chartex" xmlns:cx8="http://schemas.microsoft.com/office/drawing/2016/5/14/chartex" xmlns:mc="http://schemas.openxmlformats.org/markup-compatibility/2006" xmlns:aink="http://schemas.microsoft.com/office/drawing/2016/ink" xmlns:am3d="http://schemas.microsoft.com/office/drawing/2017/model3d" xmlns:o="urn:schemas-microsoft-com:office:office" xmlns:oel="http://schemas.microsoft.com/office/2019/extlst" xmlns:r="http://schemas.openxmlformats.org/officeDocument/2006/relationships" xmlns:m="http://schemas.openxmlformats.org/officeDocument/2006/math" xmlns:v="urn:schemas-microsoft-com:vml" xmlns:wp14="http://schemas.microsoft.com/office/word/2010/wordprocessingDrawing" xmlns:wp="http://schemas.openxmlformats.org/drawingml/2006/wordprocessingDrawing" xmlns:w10="urn:schemas-microsoft-com:office:word" xmlns:w="http://schemas.openxmlformats.org/wordprocessingml/2006/main" xmlns:w14="http://schemas.microsoft.com/office/word/2010/wordml" xmlns:w15="http://schemas.microsoft.com/office/word/2012/wordml" xmlns:w16cex="http://schemas.microsoft.com/office/word/2018/wordml/cex" xmlns:w16cid="http://schemas.microsoft.com/office/word/2016/wordml/cid" xmlns:w16="http://schemas.microsoft.com/office/word/2018/wordml" xmlns:w16du="http://schemas.microsoft.com/office/word/2023/wordml/word16du" xmlns:w16sdtdh="http://schemas.microsoft.com/office/word/2020/wordml/sdtdatahash" xmlns:w16sdtfl="http://schemas.microsoft.com/office/word/2024/wordml/sdtformatlock" xmlns:w16se="http://schemas.microsoft.com/office/word/2015/wordml/symex" xmlns:wpg="http://schemas.microsoft.com/office/word/2010/wordprocessingGroup" xmlns:wpi="http://schemas.microsoft.com/office/word/2010/wordprocessingInk" xmlns:wne="http://schemas.microsoft.com/office/word/2006/wordml" xmlns:wps="http://schemas.microsoft.com/office/word/2010/wordprocessingShape" mc:Ignorable="w14 w15 w16se w16cid w16 w16cex w16sdtdh w16sdtfl w16du wp14">
-  <w:p>
-    <w:pPr>
-      <w:pStyle w:val="Header"/>
-    </w:pPr>
-  </w:p>
-</w:hdr>
-</file>
-
-<file path=word/header2.xml><?xml version="1.0" encoding="utf-8"?>
 <w:hdr xmlns:wpc="http://schemas.microsoft.com/office/word/2010/wordprocessingCanvas" xmlns:cx="http://schemas.microsoft.com/office/drawing/2014/chartex" xmlns:cx1="http://schemas.microsoft.com/office/drawing/2015/9/8/chartex" xmlns:cx2="http://schemas.microsoft.com/office/drawing/2015/10/21/chartex" xmlns:cx3="http://schemas.microsoft.com/office/drawing/2016/5/9/chartex" xmlns:cx4="http://schemas.microsoft.com/office/drawing/2016/5/10/chartex" xmlns:cx5="http://schemas.microsoft.com/office/drawing/2016/5/11/chartex" xmlns:cx6="http://schemas.microsoft.com/office/drawing/2016/5/12/chartex" xmlns:cx7="http://schemas.microsoft.com/office/drawing/2016/5/13/chartex" xmlns:cx8="http://schemas.microsoft.com/office/drawing/2016/5/14/chartex" xmlns:mc="http://schemas.openxmlformats.org/markup-compatibility/2006" xmlns:aink="http://schemas.microsoft.com/office/drawing/2016/ink" xmlns:am3d="http://schemas.microsoft.com/office/drawing/2017/model3d" xmlns:o="urn:schemas-microsoft-com:office:office" xmlns:oel="http://schemas.microsoft.com/office/2019/extlst" xmlns:r="http://schemas.openxmlformats.org/officeDocument/2006/relationships" xmlns:m="http://schemas.openxmlformats.org/officeDocument/2006/math" xmlns:v="urn:schemas-microsoft-com:vml" xmlns:wp14="http://schemas.microsoft.com/office/word/2010/wordprocessingDrawing" xmlns:wp="http://schemas.openxmlformats.org/drawingml/2006/wordprocessingDrawing" xmlns:w10="urn:schemas-microsoft-com:office:word" xmlns:w="http://schemas.openxmlformats.org/wordprocessingml/2006/main" xmlns:w14="http://schemas.microsoft.com/office/word/2010/wordml" xmlns:w15="http://schemas.microsoft.com/office/word/2012/wordml" xmlns:w16cex="http://schemas.microsoft.com/office/word/2018/wordml/cex" xmlns:w16cid="http://schemas.microsoft.com/office/word/2016/wordml/cid" xmlns:w16="http://schemas.microsoft.com/office/word/2018/wordml" xmlns:w16du="http://schemas.microsoft.com/office/word/2023/wordml/word16du" xmlns:w16sdtdh="http://schemas.microsoft.com/office/word/2020/wordml/sdtdatahash" xmlns:w16sdtfl="http://schemas.microsoft.com/office/word/2024/wordml/sdtformatlock" xmlns:w16se="http://schemas.microsoft.com/office/word/2015/wordml/symex" xmlns:wpg="http://schemas.microsoft.com/office/word/2010/wordprocessingGroup" xmlns:wpi="http://schemas.microsoft.com/office/word/2010/wordprocessingInk" xmlns:wne="http://schemas.microsoft.com/office/word/2006/wordml" xmlns:wps="http://schemas.microsoft.com/office/word/2010/wordprocessingShape" mc:Ignorable="w14 w15 w16se w16cid w16 w16cex w16sdtdh w16sdtfl w16du wp14">
   <w:p>
     <w:pPr>
@@ -1069,109 +1136,6 @@
       <w:spacing w:before="240" w:after="0"/>
       <w:outlineLvl w:val="0"/>
       <w:rPr>
-        <w:noProof/>
-      </w:rPr>
-    </w:pPr>
-    <w:r>
-      <w:rPr>
-        <w:noProof/>
-      </w:rPr>
-      <w:drawing>
-        <wp:anchor distT="0" distB="0" distL="114300" distR="114300" simplePos="0" relativeHeight="251681792" behindDoc="1" locked="0" layoutInCell="1" allowOverlap="1" wp14:anchorId="55DD7743" wp14:editId="5362EB82">
-          <wp:simplePos x="0" y="0"/>
-          <wp:positionH relativeFrom="column">
-            <wp:posOffset>3493770</wp:posOffset>
-          </wp:positionH>
-          <wp:positionV relativeFrom="paragraph">
-            <wp:posOffset>70485</wp:posOffset>
-          </wp:positionV>
-          <wp:extent cx="2679700" cy="981710"/>
-          <wp:effectExtent l="0" t="0" r="0" b="0"/>
-          <wp:wrapThrough wrapText="bothSides">
-            <wp:wrapPolygon edited="0">
-              <wp:start x="0" y="0"/>
-              <wp:lineTo x="0" y="21237"/>
-              <wp:lineTo x="21498" y="21237"/>
-              <wp:lineTo x="21498" y="0"/>
-              <wp:lineTo x="0" y="0"/>
-            </wp:wrapPolygon>
-          </wp:wrapThrough>
-          <wp:docPr id="582597697" name="Picture 2" descr="{logo}"/>
-          <wp:cNvGraphicFramePr>
-            <a:graphicFrameLocks xmlns:a="http://schemas.openxmlformats.org/drawingml/2006/main" noChangeAspect="1"/>
-          </wp:cNvGraphicFramePr>
-          <a:graphic xmlns:a="http://schemas.openxmlformats.org/drawingml/2006/main">
-            <a:graphicData uri="http://schemas.openxmlformats.org/drawingml/2006/picture">
-              <pic:pic xmlns:pic="http://schemas.openxmlformats.org/drawingml/2006/picture">
-                <pic:nvPicPr>
-                  <pic:cNvPr id="582597697" name="Picture 2" descr="{logo}"/>
-                  <pic:cNvPicPr/>
-                </pic:nvPicPr>
-                <pic:blipFill>
-                  <a:blip r:embed="rId1">
-                    <a:extLst>
-                      <a:ext uri="{28A0092B-C50C-407E-A947-70E740481C1C}">
-                        <a14:useLocalDpi xmlns:a14="http://schemas.microsoft.com/office/drawing/2010/main" val="0"/>
-                      </a:ext>
-                    </a:extLst>
-                  </a:blip>
-                  <a:stretch>
-                    <a:fillRect/>
-                  </a:stretch>
-                </pic:blipFill>
-                <pic:spPr>
-                  <a:xfrm>
-                    <a:off x="0" y="0"/>
-                    <a:ext cx="2679700" cy="981710"/>
-                  </a:xfrm>
-                  <a:prstGeom prst="rect">
-                    <a:avLst/>
-                  </a:prstGeom>
-                </pic:spPr>
-              </pic:pic>
-            </a:graphicData>
-          </a:graphic>
-          <wp14:sizeRelH relativeFrom="page">
-            <wp14:pctWidth>0</wp14:pctWidth>
-          </wp14:sizeRelH>
-          <wp14:sizeRelV relativeFrom="page">
-            <wp14:pctHeight>0</wp14:pctHeight>
-          </wp14:sizeRelV>
-        </wp:anchor>
-      </w:drawing>
-    </w:r>
-    <w:r>
-      <w:rPr>
-        <w:rFonts w:asciiTheme="majorHAnsi" w:eastAsiaTheme="majorEastAsia" w:hAnsiTheme="majorHAnsi" w:cstheme="majorBidi"/>
-        <w:b/>
-        <w:bCs/>
-        <w:sz w:val="32"/>
-        <w:szCs w:val="32"/>
-      </w:rPr>
-      <w:fldChar w:fldCharType="begin"/>
-    </w:r>
-    <w:r>
-      <w:rPr>
-        <w:rFonts w:asciiTheme="majorHAnsi" w:eastAsiaTheme="majorEastAsia" w:hAnsiTheme="majorHAnsi" w:cstheme="majorBidi"/>
-        <w:b/>
-        <w:bCs/>
-        <w:sz w:val="32"/>
-        <w:szCs w:val="32"/>
-      </w:rPr>
-      <w:instrText xml:space="preserve"> FILENAME \* MERGEFORMAT </w:instrText>
-    </w:r>
-    <w:r>
-      <w:rPr>
-        <w:rFonts w:asciiTheme="majorHAnsi" w:eastAsiaTheme="majorEastAsia" w:hAnsiTheme="majorHAnsi" w:cstheme="majorBidi"/>
-        <w:b/>
-        <w:bCs/>
-        <w:sz w:val="32"/>
-        <w:szCs w:val="32"/>
-      </w:rPr>
-      <w:fldChar w:fldCharType="separate"/>
-    </w:r>
-    <w:r>
-      <w:rPr>
         <w:rFonts w:asciiTheme="majorHAnsi" w:eastAsiaTheme="majorEastAsia" w:hAnsiTheme="majorHAnsi" w:cstheme="majorBidi"/>
         <w:b/>
         <w:bCs/>
@@ -1179,8 +1143,7 @@
         <w:sz w:val="32"/>
         <w:szCs w:val="32"/>
       </w:rPr>
-      <w:t>Kap. 5^J D0 – Qualitätspolitik</w:t>
-    </w:r>
+    </w:pPr>
     <w:r>
       <w:rPr>
         <w:rFonts w:asciiTheme="majorHAnsi" w:eastAsiaTheme="majorEastAsia" w:hAnsiTheme="majorHAnsi" w:cstheme="majorBidi"/>
@@ -1189,50 +1152,156 @@
         <w:sz w:val="32"/>
         <w:szCs w:val="32"/>
       </w:rPr>
+      <w:fldChar w:fldCharType="begin"/>
+    </w:r>
+    <w:r>
+      <w:rPr>
+        <w:rFonts w:asciiTheme="majorHAnsi" w:eastAsiaTheme="majorEastAsia" w:hAnsiTheme="majorHAnsi" w:cstheme="majorBidi"/>
+        <w:b/>
+        <w:bCs/>
+        <w:sz w:val="32"/>
+        <w:szCs w:val="32"/>
+      </w:rPr>
+      <w:instrText xml:space="preserve"> FILENAME \* MERGEFORMAT </w:instrText>
+    </w:r>
+    <w:r>
+      <w:rPr>
+        <w:rFonts w:asciiTheme="majorHAnsi" w:eastAsiaTheme="majorEastAsia" w:hAnsiTheme="majorHAnsi" w:cstheme="majorBidi"/>
+        <w:b/>
+        <w:bCs/>
+        <w:sz w:val="32"/>
+        <w:szCs w:val="32"/>
+      </w:rPr>
+      <w:fldChar w:fldCharType="separate"/>
+    </w:r>
+  </w:p>
+  <w:tbl>
+    <w:tblPr>
+      <w:tblStyle w:val="TableGrid"/>
+      <w:tblW w:w="9776" w:type="dxa"/>
+      <w:tblBorders>
+        <w:top w:val="none" w:sz="0" w:space="0" w:color="auto"/>
+        <w:left w:val="none" w:sz="0" w:space="0" w:color="auto"/>
+        <w:bottom w:val="none" w:sz="0" w:space="0" w:color="auto"/>
+        <w:right w:val="none" w:sz="0" w:space="0" w:color="auto"/>
+        <w:insideH w:val="none" w:sz="0" w:space="0" w:color="auto"/>
+        <w:insideV w:val="none" w:sz="0" w:space="0" w:color="auto"/>
+      </w:tblBorders>
+      <w:tblLook w:val="04A0" w:firstRow="1" w:lastRow="0" w:firstColumn="1" w:lastColumn="0" w:noHBand="0" w:noVBand="1"/>
+    </w:tblPr>
+    <w:tblGrid>
+      <w:gridCol w:w="6374"/>
+      <w:gridCol w:w="3402"/>
+    </w:tblGrid>
+    <w:tr>
+      <w:trPr>
+        <w:trHeight w:val="1565"/>
+      </w:trPr>
+      <w:tc>
+        <w:tcPr>
+          <w:tcW w:w="6374" w:type="dxa"/>
+          <w:vAlign w:val="center"/>
+        </w:tcPr>
+        <w:p>
+          <w:pPr>
+            <w:rPr>
+              <w:noProof/>
+              <w:sz w:val="28"/>
+              <w:szCs w:val="28"/>
+            </w:rPr>
+          </w:pPr>
+          <w:r>
+            <w:rPr>
+              <w:noProof/>
+              <w:sz w:val="28"/>
+              <w:szCs w:val="28"/>
+            </w:rPr>
+            <w:t>Kap. 5^ J D0 – Qualitätspolitik</w:t>
+          </w:r>
+        </w:p>
+      </w:tc>
+      <w:tc>
+        <w:tcPr>
+          <w:tcW w:w="3402" w:type="dxa"/>
+        </w:tcPr>
+        <w:p>
+          <w:pPr>
+            <w:keepNext/>
+            <w:keepLines/>
+            <w:tabs>
+              <w:tab w:val="left" w:pos="8244"/>
+            </w:tabs>
+            <w:spacing w:before="240"/>
+            <w:jc w:val="right"/>
+            <w:outlineLvl w:val="0"/>
+            <w:rPr>
+              <w:rFonts w:asciiTheme="majorHAnsi" w:eastAsiaTheme="majorEastAsia" w:hAnsiTheme="majorHAnsi" w:cstheme="majorBidi"/>
+              <w:b/>
+              <w:bCs/>
+              <w:noProof/>
+              <w:sz w:val="32"/>
+              <w:szCs w:val="32"/>
+            </w:rPr>
+          </w:pPr>
+          <w:r>
+            <w:rPr>
+              <w:rFonts w:asciiTheme="majorHAnsi" w:eastAsiaTheme="majorEastAsia" w:hAnsiTheme="majorHAnsi" w:cstheme="majorBidi"/>
+              <w:b/>
+              <w:bCs/>
+              <w:noProof/>
+              <w:sz w:val="32"/>
+              <w:szCs w:val="32"/>
+            </w:rPr>
+            <w:t>{logo}</w:t>
+          </w:r>
+        </w:p>
+        <w:p>
+          <w:pPr>
+            <w:keepNext/>
+            <w:keepLines/>
+            <w:tabs>
+              <w:tab w:val="left" w:pos="8244"/>
+            </w:tabs>
+            <w:spacing w:before="240"/>
+            <w:jc w:val="both"/>
+            <w:outlineLvl w:val="0"/>
+            <w:rPr>
+              <w:rFonts w:asciiTheme="majorHAnsi" w:eastAsiaTheme="majorEastAsia" w:hAnsiTheme="majorHAnsi" w:cstheme="majorBidi"/>
+              <w:b/>
+              <w:bCs/>
+              <w:noProof/>
+              <w:sz w:val="32"/>
+              <w:szCs w:val="32"/>
+            </w:rPr>
+          </w:pPr>
+        </w:p>
+      </w:tc>
+    </w:tr>
+  </w:tbl>
+  <w:p>
+    <w:pPr>
+      <w:keepNext/>
+      <w:keepLines/>
+      <w:tabs>
+        <w:tab w:val="left" w:pos="708"/>
+        <w:tab w:val="left" w:pos="8244"/>
+      </w:tabs>
+      <w:spacing w:before="240" w:after="0"/>
+      <w:outlineLvl w:val="0"/>
+      <w:rPr>
+        <w:noProof/>
+      </w:rPr>
+    </w:pPr>
+    <w:r>
+      <w:rPr>
+        <w:rFonts w:asciiTheme="majorHAnsi" w:eastAsiaTheme="majorEastAsia" w:hAnsiTheme="majorHAnsi" w:cstheme="majorBidi"/>
+        <w:b/>
+        <w:bCs/>
+        <w:sz w:val="32"/>
+        <w:szCs w:val="32"/>
+      </w:rPr>
       <w:fldChar w:fldCharType="end"/>
     </w:r>
-    <w:r>
-      <w:rPr>
-        <w:noProof/>
-      </w:rPr>
-      <w:t xml:space="preserve"> </w:t>
-    </w:r>
-    <w:r>
-      <w:rPr>
-        <w:noProof/>
-      </w:rPr>
-      <w:tab/>
-    </w:r>
-  </w:p>
-  <w:p>
-    <w:pPr>
-      <w:pBdr>
-        <w:top w:val="nil"/>
-        <w:left w:val="nil"/>
-        <w:bottom w:val="nil"/>
-        <w:right w:val="nil"/>
-        <w:between w:val="nil"/>
-      </w:pBdr>
-      <w:tabs>
-        <w:tab w:val="center" w:pos="4536"/>
-        <w:tab w:val="right" w:pos="9072"/>
-        <w:tab w:val="left" w:pos="708"/>
-      </w:tabs>
-      <w:ind w:right="3402"/>
-      <w:rPr>
-        <w:color w:val="000000"/>
-      </w:rPr>
-    </w:pPr>
-  </w:p>
-</w:hdr>
-</file>
-
-<file path=word/header3.xml><?xml version="1.0" encoding="utf-8"?>
-<w:hdr xmlns:wpc="http://schemas.microsoft.com/office/word/2010/wordprocessingCanvas" xmlns:cx="http://schemas.microsoft.com/office/drawing/2014/chartex" xmlns:cx1="http://schemas.microsoft.com/office/drawing/2015/9/8/chartex" xmlns:cx2="http://schemas.microsoft.com/office/drawing/2015/10/21/chartex" xmlns:cx3="http://schemas.microsoft.com/office/drawing/2016/5/9/chartex" xmlns:cx4="http://schemas.microsoft.com/office/drawing/2016/5/10/chartex" xmlns:cx5="http://schemas.microsoft.com/office/drawing/2016/5/11/chartex" xmlns:cx6="http://schemas.microsoft.com/office/drawing/2016/5/12/chartex" xmlns:cx7="http://schemas.microsoft.com/office/drawing/2016/5/13/chartex" xmlns:cx8="http://schemas.microsoft.com/office/drawing/2016/5/14/chartex" xmlns:mc="http://schemas.openxmlformats.org/markup-compatibility/2006" xmlns:aink="http://schemas.microsoft.com/office/drawing/2016/ink" xmlns:am3d="http://schemas.microsoft.com/office/drawing/2017/model3d" xmlns:o="urn:schemas-microsoft-com:office:office" xmlns:oel="http://schemas.microsoft.com/office/2019/extlst" xmlns:r="http://schemas.openxmlformats.org/officeDocument/2006/relationships" xmlns:m="http://schemas.openxmlformats.org/officeDocument/2006/math" xmlns:v="urn:schemas-microsoft-com:vml" xmlns:wp14="http://schemas.microsoft.com/office/word/2010/wordprocessingDrawing" xmlns:wp="http://schemas.openxmlformats.org/drawingml/2006/wordprocessingDrawing" xmlns:w10="urn:schemas-microsoft-com:office:word" xmlns:w="http://schemas.openxmlformats.org/wordprocessingml/2006/main" xmlns:w14="http://schemas.microsoft.com/office/word/2010/wordml" xmlns:w15="http://schemas.microsoft.com/office/word/2012/wordml" xmlns:w16cex="http://schemas.microsoft.com/office/word/2018/wordml/cex" xmlns:w16cid="http://schemas.microsoft.com/office/word/2016/wordml/cid" xmlns:w16="http://schemas.microsoft.com/office/word/2018/wordml" xmlns:w16du="http://schemas.microsoft.com/office/word/2023/wordml/word16du" xmlns:w16sdtdh="http://schemas.microsoft.com/office/word/2020/wordml/sdtdatahash" xmlns:w16sdtfl="http://schemas.microsoft.com/office/word/2024/wordml/sdtformatlock" xmlns:w16se="http://schemas.microsoft.com/office/word/2015/wordml/symex" xmlns:wpg="http://schemas.microsoft.com/office/word/2010/wordprocessingGroup" xmlns:wpi="http://schemas.microsoft.com/office/word/2010/wordprocessingInk" xmlns:wne="http://schemas.microsoft.com/office/word/2006/wordml" xmlns:wps="http://schemas.microsoft.com/office/word/2010/wordprocessingShape" mc:Ignorable="w14 w15 w16se w16cid w16 w16cex w16sdtdh w16sdtfl w16du wp14">
-  <w:p>
-    <w:pPr>
-      <w:pStyle w:val="Header"/>
-    </w:pPr>
   </w:p>
 </w:hdr>
 </file>
@@ -2343,6 +2412,25 @@
       <w:szCs w:val="48"/>
     </w:rPr>
   </w:style>
+  <w:style w:type="table" w:styleId="TableGrid">
+    <w:name w:val="Table Grid"/>
+    <w:basedOn w:val="TableNormal"/>
+    <w:uiPriority w:val="39"/>
+    <w:rsid w:val="003D5303"/>
+    <w:pPr>
+      <w:spacing w:after="0" w:line="240" w:lineRule="auto"/>
+    </w:pPr>
+    <w:tblPr>
+      <w:tblBorders>
+        <w:top w:val="single" w:sz="4" w:space="0" w:color="auto"/>
+        <w:left w:val="single" w:sz="4" w:space="0" w:color="auto"/>
+        <w:bottom w:val="single" w:sz="4" w:space="0" w:color="auto"/>
+        <w:right w:val="single" w:sz="4" w:space="0" w:color="auto"/>
+        <w:insideH w:val="single" w:sz="4" w:space="0" w:color="auto"/>
+        <w:insideV w:val="single" w:sz="4" w:space="0" w:color="auto"/>
+      </w:tblBorders>
+    </w:tblPr>
+  </w:style>
 </w:styles>
 </file>
 
@@ -2642,28 +2730,28 @@
 </file>
 
 <file path=customXml/item1.xml><?xml version="1.0" encoding="utf-8"?>
-<b:Sources xmlns:b="http://schemas.openxmlformats.org/officeDocument/2006/bibliography" xmlns="http://schemas.openxmlformats.org/officeDocument/2006/bibliography" SelectedStyle="/APASixthEditionOfficeOnline.xsl" StyleName="APA" Version="6"/>
-</file>
-
-<file path=customXml/item2.xml><?xml version="1.0" encoding="utf-8"?>
 <go:gDocsCustomXmlDataStorage xmlns:go="http://customooxmlschemas.google.com/" xmlns:r="http://schemas.openxmlformats.org/officeDocument/2006/relationships" uri="GoogleDocsCustomDataVersion2">
   <go:docsCustomData xmlns:go="http://customooxmlschemas.google.com/" roundtripDataSignature="AMtx7mhi4Bn08gMj7UTVuurlkYtxvzH3eQ==">CgMxLjAyCGguZ2pkZ3hzOAByITFsYUhQa3MtRmhkZWxaVURNMkpPNy1DZnFZaUpfcmd3LQ==</go:docsCustomData>
 </go:gDocsCustomXmlDataStorage>
 </file>
 
-<file path=customXml/itemProps1.xml><?xml version="1.0" encoding="utf-8"?>
-<ds:datastoreItem xmlns:ds="http://schemas.openxmlformats.org/officeDocument/2006/customXml" ds:itemID="{AA93A8CC-5222-7B42-9534-5CDE13F81E93}">
-  <ds:schemaRefs>
-    <ds:schemaRef ds:uri="http://schemas.openxmlformats.org/officeDocument/2006/bibliography"/>
-  </ds:schemaRefs>
-</ds:datastoreItem>
+<file path=customXml/item2.xml><?xml version="1.0" encoding="utf-8"?>
+<b:Sources xmlns:b="http://schemas.openxmlformats.org/officeDocument/2006/bibliography" xmlns="http://schemas.openxmlformats.org/officeDocument/2006/bibliography" SelectedStyle="/APASixthEditionOfficeOnline.xsl" StyleName="APA" Version="6"/>
 </file>
 
-<file path=customXml/itemProps2.xml><?xml version="1.0" encoding="utf-8"?>
+<file path=customXml/itemProps1.xml><?xml version="1.0" encoding="utf-8"?>
 <ds:datastoreItem xmlns:ds="http://schemas.openxmlformats.org/officeDocument/2006/customXml" ds:itemID="{11111111-1234-1234-1234-123412341234}">
   <ds:schemaRefs>
     <ds:schemaRef ds:uri="http://customooxmlschemas.google.com/"/>
     <ds:schemaRef ds:uri="http://schemas.openxmlformats.org/officeDocument/2006/relationships"/>
   </ds:schemaRefs>
 </ds:datastoreItem>
+</file>
+
+<file path=customXml/itemProps2.xml><?xml version="1.0" encoding="utf-8"?>
+<ds:datastoreItem xmlns:ds="http://schemas.openxmlformats.org/officeDocument/2006/customXml" ds:itemID="{AA93A8CC-5222-7B42-9534-5CDE13F81E93}">
+  <ds:schemaRefs>
+    <ds:schemaRef ds:uri="http://schemas.openxmlformats.org/officeDocument/2006/bibliography"/>
+  </ds:schemaRefs>
+</ds:datastoreItem>
 </file>
</xml_diff>